<commit_message>
Investigacion de las variables
</commit_message>
<xml_diff>
--- a/El lenguaje de php y su historia.docx
+++ b/El lenguaje de php y su historia.docx
@@ -937,6 +937,1205 @@
           <w:szCs w:val="32"/>
         </w:rPr>
       </w:pPr>
+    </w:p>
+    <w:p>
+      <w:pPr>
+        <w:jc w:val="center"/>
+        <w:rPr>
+          <w:rFonts w:ascii="Arial" w:hAnsi="Arial" w:cs="Arial"/>
+          <w:b/>
+          <w:bCs/>
+          <w:sz w:val="32"/>
+          <w:szCs w:val="32"/>
+        </w:rPr>
+      </w:pPr>
+    </w:p>
+    <w:p>
+      <w:pPr>
+        <w:rPr>
+          <w:rFonts w:ascii="Arial" w:hAnsi="Arial" w:cs="Arial"/>
+          <w:b/>
+          <w:bCs/>
+          <w:sz w:val="32"/>
+          <w:szCs w:val="32"/>
+        </w:rPr>
+      </w:pPr>
+      <w:r>
+        <w:rPr>
+          <w:rFonts w:ascii="Arial" w:hAnsi="Arial" w:cs="Arial"/>
+          <w:b/>
+          <w:bCs/>
+          <w:sz w:val="32"/>
+          <w:szCs w:val="32"/>
+        </w:rPr>
+        <w:br w:type="page"/>
+      </w:r>
+    </w:p>
+    <w:p>
+      <w:pPr>
+        <w:rPr>
+          <w:b/>
+          <w:bCs/>
+        </w:rPr>
+      </w:pPr>
+      <w:r>
+        <w:rPr>
+          <w:b/>
+          <w:bCs/>
+        </w:rPr>
+        <w:lastRenderedPageBreak/>
+        <w:t>Las variables en PHP</w:t>
+      </w:r>
+    </w:p>
+    <w:p>
+      <w:pPr>
+        <w:rPr>
+          <w:u w:val="single"/>
+        </w:rPr>
+      </w:pPr>
+      <w:r>
+        <w:t xml:space="preserve">En PHP, una variable es un identificador que permite almacenar un valor en memoria durante la ejecución de un programa. Todas las variables comienzan con el símbolo </w:t>
+      </w:r>
+      <w:r>
+        <w:rPr>
+          <w:b/>
+          <w:bCs/>
+        </w:rPr>
+        <w:t>$</w:t>
+      </w:r>
+      <w:r>
+        <w:t xml:space="preserve">, seguido de un nombre compuesto por letras, números o guiones bajos. Una característica fundamental de PHP es que se trata de un lenguaje de </w:t>
+      </w:r>
+      <w:r>
+        <w:rPr>
+          <w:b/>
+          <w:bCs/>
+        </w:rPr>
+        <w:t>tipado dinámico</w:t>
+      </w:r>
+      <w:r>
+        <w:t>, lo cual significa que no es necesario especificar el tipo de dato al declarar una variable, ya que el intérprete determina automáticamente el tipo según el valor asignado.</w:t>
+      </w:r>
+    </w:p>
+    <w:p>
+      <w:r>
+        <w:t xml:space="preserve">PHP permite cambiar el tipo de dato asociado a una variable durante la ejecución, generando lo que se conoce como </w:t>
+      </w:r>
+      <w:r>
+        <w:rPr>
+          <w:b/>
+          <w:bCs/>
+        </w:rPr>
+        <w:t>conversión implícita de tipos</w:t>
+      </w:r>
+      <w:r>
+        <w:t xml:space="preserve">. También admite conversiones explícitas cuando el programador requiere un tipo específico. Otra propiedad importante es que las variables que no han sido inicializadas inicialmente contienen el valor </w:t>
+      </w:r>
+      <w:r>
+        <w:rPr>
+          <w:b/>
+          <w:bCs/>
+        </w:rPr>
+        <w:t>NULL</w:t>
+      </w:r>
+      <w:r>
+        <w:t>.</w:t>
+      </w:r>
+    </w:p>
+    <w:p>
+      <w:pPr>
+        <w:rPr>
+          <w:b/>
+          <w:bCs/>
+        </w:rPr>
+      </w:pPr>
+      <w:r>
+        <w:rPr>
+          <w:b/>
+          <w:bCs/>
+        </w:rPr>
+        <w:t>Clases de variables en PHP (Tipología)</w:t>
+      </w:r>
+    </w:p>
+    <w:p>
+      <w:r>
+        <w:t xml:space="preserve">La clasificación principal se basa en el </w:t>
+      </w:r>
+      <w:r>
+        <w:rPr>
+          <w:b/>
+          <w:bCs/>
+        </w:rPr>
+        <w:t>tipo de dato</w:t>
+      </w:r>
+      <w:r>
+        <w:t xml:space="preserve"> contenido en la variable. PHP define varios tipos, agrupados de la siguiente manera:</w:t>
+      </w:r>
+    </w:p>
+    <w:p>
+      <w:pPr>
+        <w:rPr>
+          <w:b/>
+          <w:bCs/>
+        </w:rPr>
+      </w:pPr>
+      <w:r>
+        <w:rPr>
+          <w:b/>
+          <w:bCs/>
+        </w:rPr>
+        <w:t>A. Tipos escalares</w:t>
+      </w:r>
+    </w:p>
+    <w:p>
+      <w:r>
+        <w:t>Estos tipos representan valores simples e indivisibles:</w:t>
+      </w:r>
+    </w:p>
+    <w:p>
+      <w:pPr>
+        <w:numPr>
+          <w:ilvl w:val="0"/>
+          <w:numId w:val="2"/>
+        </w:numPr>
+      </w:pPr>
+      <w:r>
+        <w:rPr>
+          <w:b/>
+          <w:bCs/>
+        </w:rPr>
+        <w:t>Entero (</w:t>
+      </w:r>
+      <w:proofErr w:type="spellStart"/>
+      <w:r>
+        <w:rPr>
+          <w:b/>
+          <w:bCs/>
+        </w:rPr>
+        <w:t>int</w:t>
+      </w:r>
+      <w:proofErr w:type="spellEnd"/>
+      <w:r>
+        <w:rPr>
+          <w:b/>
+          <w:bCs/>
+        </w:rPr>
+        <w:t>):</w:t>
+      </w:r>
+      <w:r>
+        <w:t xml:space="preserve"> números sin decimales.</w:t>
+      </w:r>
+    </w:p>
+    <w:p>
+      <w:pPr>
+        <w:numPr>
+          <w:ilvl w:val="0"/>
+          <w:numId w:val="2"/>
+        </w:numPr>
+      </w:pPr>
+      <w:r>
+        <w:rPr>
+          <w:b/>
+          <w:bCs/>
+        </w:rPr>
+        <w:t>Flotante (</w:t>
+      </w:r>
+      <w:proofErr w:type="spellStart"/>
+      <w:r>
+        <w:rPr>
+          <w:b/>
+          <w:bCs/>
+        </w:rPr>
+        <w:t>float</w:t>
+      </w:r>
+      <w:proofErr w:type="spellEnd"/>
+      <w:r>
+        <w:rPr>
+          <w:b/>
+          <w:bCs/>
+        </w:rPr>
+        <w:t xml:space="preserve"> o </w:t>
+      </w:r>
+      <w:proofErr w:type="spellStart"/>
+      <w:r>
+        <w:rPr>
+          <w:b/>
+          <w:bCs/>
+        </w:rPr>
+        <w:t>double</w:t>
+      </w:r>
+      <w:proofErr w:type="spellEnd"/>
+      <w:r>
+        <w:rPr>
+          <w:b/>
+          <w:bCs/>
+        </w:rPr>
+        <w:t>):</w:t>
+      </w:r>
+      <w:r>
+        <w:t xml:space="preserve"> números con decimales o notación exponencial.</w:t>
+      </w:r>
+    </w:p>
+    <w:p>
+      <w:pPr>
+        <w:numPr>
+          <w:ilvl w:val="0"/>
+          <w:numId w:val="2"/>
+        </w:numPr>
+      </w:pPr>
+      <w:r>
+        <w:rPr>
+          <w:b/>
+          <w:bCs/>
+        </w:rPr>
+        <w:t>Cadena (</w:t>
+      </w:r>
+      <w:proofErr w:type="spellStart"/>
+      <w:r>
+        <w:rPr>
+          <w:b/>
+          <w:bCs/>
+        </w:rPr>
+        <w:t>string</w:t>
+      </w:r>
+      <w:proofErr w:type="spellEnd"/>
+      <w:r>
+        <w:rPr>
+          <w:b/>
+          <w:bCs/>
+        </w:rPr>
+        <w:t>):</w:t>
+      </w:r>
+      <w:r>
+        <w:t xml:space="preserve"> secuencias de caracteres.</w:t>
+      </w:r>
+    </w:p>
+    <w:p>
+      <w:pPr>
+        <w:numPr>
+          <w:ilvl w:val="0"/>
+          <w:numId w:val="2"/>
+        </w:numPr>
+      </w:pPr>
+      <w:r>
+        <w:rPr>
+          <w:b/>
+          <w:bCs/>
+        </w:rPr>
+        <w:t>Booleano (</w:t>
+      </w:r>
+      <w:proofErr w:type="spellStart"/>
+      <w:r>
+        <w:rPr>
+          <w:b/>
+          <w:bCs/>
+        </w:rPr>
+        <w:t>bool</w:t>
+      </w:r>
+      <w:proofErr w:type="spellEnd"/>
+      <w:r>
+        <w:rPr>
+          <w:b/>
+          <w:bCs/>
+        </w:rPr>
+        <w:t>):</w:t>
+      </w:r>
+      <w:r>
+        <w:t xml:space="preserve"> valores lógicos, verdadero o falso.</w:t>
+      </w:r>
+    </w:p>
+    <w:p>
+      <w:r>
+        <w:pict>
+          <v:rect id="_x0000_i1025" style="width:0;height:1.5pt" o:hralign="center" o:hrstd="t" o:hr="t" fillcolor="#a0a0a0" stroked="f"/>
+        </w:pict>
+      </w:r>
+    </w:p>
+    <w:p>
+      <w:pPr>
+        <w:rPr>
+          <w:b/>
+          <w:bCs/>
+        </w:rPr>
+      </w:pPr>
+      <w:r>
+        <w:rPr>
+          <w:b/>
+          <w:bCs/>
+        </w:rPr>
+        <w:t>B. Tipos compuestos</w:t>
+      </w:r>
+    </w:p>
+    <w:p>
+      <w:r>
+        <w:t>Son tipos que permiten almacenar múltiples valores o estructuras más complejas:</w:t>
+      </w:r>
+    </w:p>
+    <w:p>
+      <w:pPr>
+        <w:numPr>
+          <w:ilvl w:val="0"/>
+          <w:numId w:val="3"/>
+        </w:numPr>
+      </w:pPr>
+      <w:r>
+        <w:rPr>
+          <w:b/>
+          <w:bCs/>
+        </w:rPr>
+        <w:t>Arreglo (array):</w:t>
+      </w:r>
+      <w:r>
+        <w:t xml:space="preserve"> estructura ordenada que puede almacenar valores indexados o asociativos.</w:t>
+      </w:r>
+    </w:p>
+    <w:p>
+      <w:pPr>
+        <w:numPr>
+          <w:ilvl w:val="0"/>
+          <w:numId w:val="3"/>
+        </w:numPr>
+      </w:pPr>
+      <w:r>
+        <w:rPr>
+          <w:b/>
+          <w:bCs/>
+        </w:rPr>
+        <w:t>Objeto (</w:t>
+      </w:r>
+      <w:proofErr w:type="spellStart"/>
+      <w:r>
+        <w:rPr>
+          <w:b/>
+          <w:bCs/>
+        </w:rPr>
+        <w:t>object</w:t>
+      </w:r>
+      <w:proofErr w:type="spellEnd"/>
+      <w:r>
+        <w:rPr>
+          <w:b/>
+          <w:bCs/>
+        </w:rPr>
+        <w:t>):</w:t>
+      </w:r>
+      <w:r>
+        <w:t xml:space="preserve"> representación de entidades basadas en clases dentro del paradigma orientado a objetos.</w:t>
+      </w:r>
+    </w:p>
+    <w:p>
+      <w:pPr>
+        <w:numPr>
+          <w:ilvl w:val="0"/>
+          <w:numId w:val="3"/>
+        </w:numPr>
+      </w:pPr>
+      <w:proofErr w:type="spellStart"/>
+      <w:r>
+        <w:rPr>
+          <w:b/>
+          <w:bCs/>
+        </w:rPr>
+        <w:lastRenderedPageBreak/>
+        <w:t>Callable</w:t>
+      </w:r>
+      <w:proofErr w:type="spellEnd"/>
+      <w:r>
+        <w:rPr>
+          <w:b/>
+          <w:bCs/>
+        </w:rPr>
+        <w:t>:</w:t>
+      </w:r>
+      <w:r>
+        <w:t xml:space="preserve"> cualquier estructura invocable, como funciones, métodos o </w:t>
+      </w:r>
+      <w:proofErr w:type="spellStart"/>
+      <w:r>
+        <w:t>closures</w:t>
+      </w:r>
+      <w:proofErr w:type="spellEnd"/>
+      <w:r>
+        <w:t>.</w:t>
+      </w:r>
+    </w:p>
+    <w:p>
+      <w:pPr>
+        <w:numPr>
+          <w:ilvl w:val="0"/>
+          <w:numId w:val="3"/>
+        </w:numPr>
+      </w:pPr>
+      <w:r>
+        <w:rPr>
+          <w:b/>
+          <w:bCs/>
+        </w:rPr>
+        <w:t>Iterable:</w:t>
+      </w:r>
+      <w:r>
+        <w:t xml:space="preserve"> representa cualquier elemento que pueda ser recorrido en un ciclo, incluyendo </w:t>
+      </w:r>
+      <w:proofErr w:type="spellStart"/>
+      <w:r>
+        <w:t>arrays</w:t>
+      </w:r>
+      <w:proofErr w:type="spellEnd"/>
+      <w:r>
+        <w:t xml:space="preserve"> y objetos que implementen interfaces específicas.</w:t>
+      </w:r>
+    </w:p>
+    <w:p>
+      <w:r>
+        <w:pict>
+          <v:rect id="_x0000_i1026" style="width:0;height:1.5pt" o:hralign="center" o:hrstd="t" o:hr="t" fillcolor="#a0a0a0" stroked="f"/>
+        </w:pict>
+      </w:r>
+    </w:p>
+    <w:p>
+      <w:pPr>
+        <w:rPr>
+          <w:b/>
+          <w:bCs/>
+        </w:rPr>
+      </w:pPr>
+      <w:r>
+        <w:rPr>
+          <w:b/>
+          <w:bCs/>
+        </w:rPr>
+        <w:t>C. Tipos especiales</w:t>
+      </w:r>
+    </w:p>
+    <w:p>
+      <w:r>
+        <w:t>Son tipos relacionados con comportamientos particulares del lenguaje:</w:t>
+      </w:r>
+    </w:p>
+    <w:p>
+      <w:pPr>
+        <w:numPr>
+          <w:ilvl w:val="0"/>
+          <w:numId w:val="4"/>
+        </w:numPr>
+      </w:pPr>
+      <w:proofErr w:type="spellStart"/>
+      <w:r>
+        <w:rPr>
+          <w:b/>
+          <w:bCs/>
+        </w:rPr>
+        <w:t>Resource</w:t>
+      </w:r>
+      <w:proofErr w:type="spellEnd"/>
+      <w:r>
+        <w:rPr>
+          <w:b/>
+          <w:bCs/>
+        </w:rPr>
+        <w:t>:</w:t>
+      </w:r>
+      <w:r>
+        <w:t xml:space="preserve"> referencia a un recurso externo como archivos, conexiones a bases de datos o flujos de datos.</w:t>
+      </w:r>
+    </w:p>
+    <w:p>
+      <w:pPr>
+        <w:numPr>
+          <w:ilvl w:val="0"/>
+          <w:numId w:val="4"/>
+        </w:numPr>
+      </w:pPr>
+      <w:r>
+        <w:rPr>
+          <w:b/>
+          <w:bCs/>
+        </w:rPr>
+        <w:t>NULL:</w:t>
+      </w:r>
+      <w:r>
+        <w:t xml:space="preserve"> ausencia de valor, representa una variable sin contenido o no inicializada.</w:t>
+      </w:r>
+    </w:p>
+    <w:p>
+      <w:pPr>
+        <w:rPr>
+          <w:b/>
+          <w:bCs/>
+        </w:rPr>
+      </w:pPr>
+      <w:r>
+        <w:rPr>
+          <w:b/>
+          <w:bCs/>
+        </w:rPr>
+        <w:t>Uso de cada clase de variable</w:t>
+      </w:r>
+    </w:p>
+    <w:p>
+      <w:pPr>
+        <w:rPr>
+          <w:b/>
+          <w:bCs/>
+        </w:rPr>
+      </w:pPr>
+      <w:r>
+        <w:rPr>
+          <w:b/>
+          <w:bCs/>
+        </w:rPr>
+        <w:t>Tipos escalares</w:t>
+      </w:r>
+    </w:p>
+    <w:p>
+      <w:r>
+        <w:t>El uso de estos tipos se encuentra en cualquier operación básica del lenguaje. Los enteros y flotantes se emplean en cálculos matemáticos; las cadenas se utilizan para manejar texto, comunicación con usuarios, procesamiento de datos y generación de contenido. Los booleanos se emplean en decisiones lógicas, control de flujo y validación de condiciones.</w:t>
+      </w:r>
+    </w:p>
+    <w:p>
+      <w:r>
+        <w:pict>
+          <v:rect id="_x0000_i1027" style="width:0;height:1.5pt" o:hralign="center" o:hrstd="t" o:hr="t" fillcolor="#a0a0a0" stroked="f"/>
+        </w:pict>
+      </w:r>
+    </w:p>
+    <w:p>
+      <w:pPr>
+        <w:rPr>
+          <w:b/>
+          <w:bCs/>
+        </w:rPr>
+      </w:pPr>
+      <w:r>
+        <w:rPr>
+          <w:b/>
+          <w:bCs/>
+        </w:rPr>
+        <w:t>Tipos compuestos</w:t>
+      </w:r>
+    </w:p>
+    <w:p>
+      <w:pPr>
+        <w:numPr>
+          <w:ilvl w:val="0"/>
+          <w:numId w:val="5"/>
+        </w:numPr>
+      </w:pPr>
+      <w:proofErr w:type="spellStart"/>
+      <w:r>
+        <w:rPr>
+          <w:b/>
+          <w:bCs/>
+        </w:rPr>
+        <w:t>Arrays</w:t>
+      </w:r>
+      <w:proofErr w:type="spellEnd"/>
+      <w:r>
+        <w:rPr>
+          <w:b/>
+          <w:bCs/>
+        </w:rPr>
+        <w:t>:</w:t>
+      </w:r>
+      <w:r>
+        <w:t xml:space="preserve"> se utilizan para almacenar colecciones de datos, como listas, tablas, matrices o configuraciones. Resultan esenciales en estructuras de control y manipulación de grandes cantidades de información.</w:t>
+      </w:r>
+    </w:p>
+    <w:p>
+      <w:pPr>
+        <w:numPr>
+          <w:ilvl w:val="0"/>
+          <w:numId w:val="5"/>
+        </w:numPr>
+      </w:pPr>
+      <w:r>
+        <w:rPr>
+          <w:b/>
+          <w:bCs/>
+        </w:rPr>
+        <w:t>Objetos:</w:t>
+      </w:r>
+      <w:r>
+        <w:t xml:space="preserve"> permiten aplicar programación orientada a objetos, definiendo propiedades y métodos. Se emplean para modelar entidades del mundo real, crear sistemas modulares, reutilizables y escalables.</w:t>
+      </w:r>
+    </w:p>
+    <w:p>
+      <w:pPr>
+        <w:numPr>
+          <w:ilvl w:val="0"/>
+          <w:numId w:val="5"/>
+        </w:numPr>
+      </w:pPr>
+      <w:proofErr w:type="spellStart"/>
+      <w:r>
+        <w:rPr>
+          <w:b/>
+          <w:bCs/>
+        </w:rPr>
+        <w:t>Callables</w:t>
+      </w:r>
+      <w:proofErr w:type="spellEnd"/>
+      <w:r>
+        <w:rPr>
+          <w:b/>
+          <w:bCs/>
+        </w:rPr>
+        <w:t>:</w:t>
+      </w:r>
+      <w:r>
+        <w:t xml:space="preserve"> facilitan la programación funcional y modular al permitir pasar funciones como parámetros, utilizarlas como valores y abstraer comportamientos.</w:t>
+      </w:r>
+    </w:p>
+    <w:p>
+      <w:pPr>
+        <w:numPr>
+          <w:ilvl w:val="0"/>
+          <w:numId w:val="5"/>
+        </w:numPr>
+      </w:pPr>
+      <w:r>
+        <w:rPr>
+          <w:b/>
+          <w:bCs/>
+        </w:rPr>
+        <w:t>Iterable:</w:t>
+      </w:r>
+      <w:r>
+        <w:t xml:space="preserve"> es utilizada en estructuras que requieren recorrer datos de forma uniforme, sin importar si provienen de un array o de un objeto que implementa </w:t>
+      </w:r>
+      <w:r>
+        <w:lastRenderedPageBreak/>
+        <w:t>interfaces específicas. Resulta indispensable para algoritmos que procesan secuencias de valores.</w:t>
+      </w:r>
+    </w:p>
+    <w:p>
+      <w:pPr>
+        <w:rPr>
+          <w:b/>
+          <w:bCs/>
+        </w:rPr>
+      </w:pPr>
+      <w:r>
+        <w:rPr>
+          <w:b/>
+          <w:bCs/>
+        </w:rPr>
+        <w:t>Clasificación de las variables en PHP (Categorías conceptuales)</w:t>
+      </w:r>
+    </w:p>
+    <w:p>
+      <w:r>
+        <w:t>Además de la clasificación por tipo, las variables pueden organizarse de acuerdo con varios criterios importantes:</w:t>
+      </w:r>
+    </w:p>
+    <w:p>
+      <w:r>
+        <w:pict>
+          <v:rect id="_x0000_i1028" style="width:0;height:1.5pt" o:hralign="center" o:hrstd="t" o:hr="t" fillcolor="#a0a0a0" stroked="f"/>
+        </w:pict>
+      </w:r>
+      <w:r>
+        <w:rPr>
+          <w:b/>
+          <w:bCs/>
+        </w:rPr>
+        <w:t>Según su ámbito (</w:t>
+      </w:r>
+      <w:proofErr w:type="spellStart"/>
+      <w:r>
+        <w:rPr>
+          <w:b/>
+          <w:bCs/>
+        </w:rPr>
+        <w:t>scope</w:t>
+      </w:r>
+      <w:proofErr w:type="spellEnd"/>
+      <w:r>
+        <w:rPr>
+          <w:b/>
+          <w:bCs/>
+        </w:rPr>
+        <w:t>)</w:t>
+      </w:r>
+    </w:p>
+    <w:p>
+      <w:pPr>
+        <w:numPr>
+          <w:ilvl w:val="0"/>
+          <w:numId w:val="6"/>
+        </w:numPr>
+      </w:pPr>
+      <w:r>
+        <w:rPr>
+          <w:b/>
+          <w:bCs/>
+        </w:rPr>
+        <w:t>Variables locales:</w:t>
+      </w:r>
+      <w:r>
+        <w:t xml:space="preserve"> existen dentro de una función o estructura interna. Son destruidas al finalizar su ejecución.</w:t>
+      </w:r>
+    </w:p>
+    <w:p>
+      <w:pPr>
+        <w:numPr>
+          <w:ilvl w:val="0"/>
+          <w:numId w:val="6"/>
+        </w:numPr>
+      </w:pPr>
+      <w:r>
+        <w:rPr>
+          <w:b/>
+          <w:bCs/>
+        </w:rPr>
+        <w:t>Variables globales:</w:t>
+      </w:r>
+      <w:r>
+        <w:t xml:space="preserve"> creadas fuera de funciones; solo se pueden usar dentro de estas mediante mecanismos específicos como global o $GLOBALS.</w:t>
+      </w:r>
+    </w:p>
+    <w:p>
+      <w:pPr>
+        <w:numPr>
+          <w:ilvl w:val="0"/>
+          <w:numId w:val="6"/>
+        </w:numPr>
+      </w:pPr>
+      <w:r>
+        <w:rPr>
+          <w:b/>
+          <w:bCs/>
+        </w:rPr>
+        <w:t>Variables estáticas:</w:t>
+      </w:r>
+      <w:r>
+        <w:t xml:space="preserve"> conservan su valor entre múltiples ejecuciones de una función, lo que permite mantener estados internos sin recurrir a variables globales.</w:t>
+      </w:r>
+    </w:p>
+    <w:p>
+      <w:pPr>
+        <w:numPr>
+          <w:ilvl w:val="0"/>
+          <w:numId w:val="6"/>
+        </w:numPr>
+      </w:pPr>
+      <w:r>
+        <w:rPr>
+          <w:b/>
+          <w:bCs/>
+        </w:rPr>
+        <w:t>Parámetros de función:</w:t>
+      </w:r>
+      <w:r>
+        <w:t xml:space="preserve"> variables que actúan como entrada a funciones o métodos.</w:t>
+      </w:r>
+    </w:p>
+    <w:p>
+      <w:r>
+        <w:pict>
+          <v:rect id="_x0000_i1029" style="width:0;height:1.5pt" o:hralign="center" o:hrstd="t" o:hr="t" fillcolor="#a0a0a0" stroked="f"/>
+        </w:pict>
+      </w:r>
+      <w:r>
+        <w:rPr>
+          <w:b/>
+          <w:bCs/>
+        </w:rPr>
+        <w:t>Según su origen en el entorno de ejecución</w:t>
+      </w:r>
+    </w:p>
+    <w:p>
+      <w:r>
+        <w:t xml:space="preserve">PHP incluye un conjunto de </w:t>
+      </w:r>
+      <w:proofErr w:type="spellStart"/>
+      <w:r>
+        <w:rPr>
+          <w:b/>
+          <w:bCs/>
+        </w:rPr>
+        <w:t>superglobales</w:t>
+      </w:r>
+      <w:proofErr w:type="spellEnd"/>
+      <w:r>
+        <w:t>, disponibles en cualquier parte del código:</w:t>
+      </w:r>
+    </w:p>
+    <w:p>
+      <w:pPr>
+        <w:numPr>
+          <w:ilvl w:val="0"/>
+          <w:numId w:val="7"/>
+        </w:numPr>
+      </w:pPr>
+      <w:r>
+        <w:t>$_GET, $_POST, $_REQUEST: entrada del usuario.</w:t>
+      </w:r>
+    </w:p>
+    <w:p>
+      <w:pPr>
+        <w:numPr>
+          <w:ilvl w:val="0"/>
+          <w:numId w:val="7"/>
+        </w:numPr>
+      </w:pPr>
+      <w:r>
+        <w:t>$_SESSION, $_COOKIE: manejo de datos persistentes.</w:t>
+      </w:r>
+    </w:p>
+    <w:p>
+      <w:pPr>
+        <w:numPr>
+          <w:ilvl w:val="0"/>
+          <w:numId w:val="7"/>
+        </w:numPr>
+      </w:pPr>
+      <w:r>
+        <w:t>$_SERVER: información del servidor.</w:t>
+      </w:r>
+    </w:p>
+    <w:p>
+      <w:pPr>
+        <w:numPr>
+          <w:ilvl w:val="0"/>
+          <w:numId w:val="7"/>
+        </w:numPr>
+      </w:pPr>
+      <w:r>
+        <w:t>$_FILES: archivos cargados.</w:t>
+      </w:r>
+    </w:p>
+    <w:p>
+      <w:pPr>
+        <w:numPr>
+          <w:ilvl w:val="0"/>
+          <w:numId w:val="7"/>
+        </w:numPr>
+      </w:pPr>
+      <w:r>
+        <w:t>$_ENV: variables de entorno.</w:t>
+      </w:r>
+    </w:p>
+    <w:p>
+      <w:pPr>
+        <w:numPr>
+          <w:ilvl w:val="0"/>
+          <w:numId w:val="7"/>
+        </w:numPr>
+      </w:pPr>
+      <w:r>
+        <w:t>$GLOBALS: contiene todas las variables globales.</w:t>
+      </w:r>
+    </w:p>
+    <w:p>
+      <w:r>
+        <w:t xml:space="preserve">Estas variables son fundamentales para el desarrollo web, ya que permiten recibir información desde formularios, </w:t>
+      </w:r>
+      <w:proofErr w:type="spellStart"/>
+      <w:r>
+        <w:t>URLs</w:t>
+      </w:r>
+      <w:proofErr w:type="spellEnd"/>
+      <w:r>
+        <w:t>, sesiones y el entorno del servidor.</w:t>
+      </w:r>
+    </w:p>
+    <w:p>
+      <w:r>
+        <w:pict>
+          <v:rect id="_x0000_i1030" style="width:0;height:1.5pt" o:hralign="center" o:hrstd="t" o:hr="t" fillcolor="#a0a0a0" stroked="f"/>
+        </w:pict>
+      </w:r>
+    </w:p>
+    <w:p>
+      <w:r>
+        <w:rPr>
+          <w:b/>
+          <w:bCs/>
+        </w:rPr>
+        <w:lastRenderedPageBreak/>
+        <w:t>Según el sistema de tipos</w:t>
+      </w:r>
+    </w:p>
+    <w:p>
+      <w:r>
+        <w:t>PHP moderno permite:</w:t>
+      </w:r>
+    </w:p>
+    <w:p>
+      <w:pPr>
+        <w:numPr>
+          <w:ilvl w:val="0"/>
+          <w:numId w:val="8"/>
+        </w:numPr>
+      </w:pPr>
+      <w:r>
+        <w:rPr>
+          <w:b/>
+          <w:bCs/>
+        </w:rPr>
+        <w:t>Tipos estrictos</w:t>
+      </w:r>
+      <w:r>
+        <w:t>, activados con declare(</w:t>
+      </w:r>
+      <w:proofErr w:type="spellStart"/>
+      <w:r>
+        <w:t>strict_types</w:t>
+      </w:r>
+      <w:proofErr w:type="spellEnd"/>
+      <w:r>
+        <w:t>=1);</w:t>
+      </w:r>
+    </w:p>
+    <w:p>
+      <w:pPr>
+        <w:numPr>
+          <w:ilvl w:val="0"/>
+          <w:numId w:val="8"/>
+        </w:numPr>
+      </w:pPr>
+      <w:r>
+        <w:rPr>
+          <w:b/>
+          <w:bCs/>
+        </w:rPr>
+        <w:t xml:space="preserve">Tipos </w:t>
+      </w:r>
+      <w:proofErr w:type="spellStart"/>
+      <w:r>
+        <w:rPr>
+          <w:b/>
+          <w:bCs/>
+        </w:rPr>
+        <w:t>union</w:t>
+      </w:r>
+      <w:proofErr w:type="spellEnd"/>
+      <w:r>
+        <w:t>, que aceptan múltiples tipos posibles.</w:t>
+      </w:r>
+    </w:p>
+    <w:p>
+      <w:pPr>
+        <w:numPr>
+          <w:ilvl w:val="0"/>
+          <w:numId w:val="8"/>
+        </w:numPr>
+      </w:pPr>
+      <w:r>
+        <w:rPr>
+          <w:b/>
+          <w:bCs/>
+        </w:rPr>
+        <w:t xml:space="preserve">Tipos </w:t>
+      </w:r>
+      <w:proofErr w:type="spellStart"/>
+      <w:r>
+        <w:rPr>
+          <w:b/>
+          <w:bCs/>
+        </w:rPr>
+        <w:t>nullables</w:t>
+      </w:r>
+      <w:proofErr w:type="spellEnd"/>
+      <w:r>
+        <w:t>, que permiten declarar variables que aceptan NULL.</w:t>
+      </w:r>
+    </w:p>
+    <w:p>
+      <w:pPr>
+        <w:numPr>
+          <w:ilvl w:val="0"/>
+          <w:numId w:val="8"/>
+        </w:numPr>
+      </w:pPr>
+      <w:r>
+        <w:rPr>
+          <w:b/>
+          <w:bCs/>
+        </w:rPr>
+        <w:t xml:space="preserve">El tipo </w:t>
+      </w:r>
+      <w:proofErr w:type="spellStart"/>
+      <w:r>
+        <w:rPr>
+          <w:b/>
+          <w:bCs/>
+        </w:rPr>
+        <w:t>mixed</w:t>
+      </w:r>
+      <w:proofErr w:type="spellEnd"/>
+      <w:r>
+        <w:t>, que representa cualquier tipo de dato posible.</w:t>
+      </w:r>
+    </w:p>
+    <w:p>
+      <w:r>
+        <w:pict>
+          <v:rect id="_x0000_i1031" style="width:0;height:1.5pt" o:hralign="center" o:hrstd="t" o:hr="t" fillcolor="#a0a0a0" stroked="f"/>
+        </w:pict>
+      </w:r>
+      <w:r>
+        <w:rPr>
+          <w:b/>
+          <w:bCs/>
+        </w:rPr>
+        <w:t>Según su comportamiento en memoria</w:t>
+      </w:r>
+    </w:p>
+    <w:p>
+      <w:pPr>
+        <w:numPr>
+          <w:ilvl w:val="0"/>
+          <w:numId w:val="9"/>
+        </w:numPr>
+      </w:pPr>
+      <w:r>
+        <w:rPr>
+          <w:b/>
+          <w:bCs/>
+        </w:rPr>
+        <w:t>Por valor:</w:t>
+      </w:r>
+      <w:r>
+        <w:t xml:space="preserve"> la mayoría de los tipos escalares se copian al asignarlos a otra variable.</w:t>
+      </w:r>
+    </w:p>
+    <w:p>
+      <w:pPr>
+        <w:numPr>
+          <w:ilvl w:val="0"/>
+          <w:numId w:val="9"/>
+        </w:numPr>
+      </w:pPr>
+      <w:r>
+        <w:rPr>
+          <w:b/>
+          <w:bCs/>
+        </w:rPr>
+        <w:t>Por referencia:</w:t>
+      </w:r>
+      <w:r>
+        <w:t xml:space="preserve"> permite que varias variables apunten al mismo valor, facilitando optimización de memoria o sincronización de cambios.</w:t>
+      </w:r>
+    </w:p>
+    <w:p>
+      <w:r>
+        <w:pict>
+          <v:rect id="_x0000_i1032" style="width:0;height:1.5pt" o:hralign="center" o:hrstd="t" o:hr="t" fillcolor="#a0a0a0" stroked="f"/>
+        </w:pict>
+      </w:r>
+      <w:r>
+        <w:rPr>
+          <w:b/>
+          <w:bCs/>
+        </w:rPr>
+        <w:t>Según su estructura y propósito</w:t>
+      </w:r>
+    </w:p>
+    <w:p>
+      <w:pPr>
+        <w:numPr>
+          <w:ilvl w:val="0"/>
+          <w:numId w:val="10"/>
+        </w:numPr>
+      </w:pPr>
+      <w:r>
+        <w:rPr>
+          <w:b/>
+          <w:bCs/>
+        </w:rPr>
+        <w:t>Variables simples:</w:t>
+      </w:r>
+      <w:r>
+        <w:t xml:space="preserve"> escalares con propósito directo.</w:t>
+      </w:r>
+    </w:p>
+    <w:p>
+      <w:pPr>
+        <w:numPr>
+          <w:ilvl w:val="0"/>
+          <w:numId w:val="10"/>
+        </w:numPr>
+      </w:pPr>
+      <w:r>
+        <w:rPr>
+          <w:b/>
+          <w:bCs/>
+        </w:rPr>
+        <w:t>Variables estructuradas:</w:t>
+      </w:r>
+      <w:r>
+        <w:t xml:space="preserve"> </w:t>
+      </w:r>
+      <w:proofErr w:type="spellStart"/>
+      <w:r>
+        <w:t>arrays</w:t>
+      </w:r>
+      <w:proofErr w:type="spellEnd"/>
+      <w:r>
+        <w:t>, iterables y objetos que organizan grandes volúmenes de información.</w:t>
+      </w:r>
+    </w:p>
+    <w:p>
+      <w:pPr>
+        <w:numPr>
+          <w:ilvl w:val="0"/>
+          <w:numId w:val="10"/>
+        </w:numPr>
+      </w:pPr>
+      <w:r>
+        <w:rPr>
+          <w:b/>
+          <w:bCs/>
+        </w:rPr>
+        <w:t>Variables funcionales:</w:t>
+      </w:r>
+      <w:r>
+        <w:t xml:space="preserve"> </w:t>
+      </w:r>
+      <w:proofErr w:type="spellStart"/>
+      <w:r>
+        <w:t>callables</w:t>
+      </w:r>
+      <w:proofErr w:type="spellEnd"/>
+      <w:r>
+        <w:t xml:space="preserve">, funciones anónimas y </w:t>
+      </w:r>
+      <w:proofErr w:type="spellStart"/>
+      <w:r>
+        <w:t>closures</w:t>
+      </w:r>
+      <w:proofErr w:type="spellEnd"/>
+      <w:r>
+        <w:t>.</w:t>
+      </w:r>
+    </w:p>
+    <w:p>
+      <w:pPr>
+        <w:numPr>
+          <w:ilvl w:val="0"/>
+          <w:numId w:val="10"/>
+        </w:numPr>
+      </w:pPr>
+      <w:r>
+        <w:rPr>
+          <w:b/>
+          <w:bCs/>
+        </w:rPr>
+        <w:t>Variables especiales:</w:t>
+      </w:r>
+      <w:r>
+        <w:t xml:space="preserve"> recursos y </w:t>
+      </w:r>
+      <w:proofErr w:type="spellStart"/>
+      <w:r>
+        <w:t>null</w:t>
+      </w:r>
+      <w:proofErr w:type="spellEnd"/>
+      <w:r>
+        <w:t xml:space="preserve"> que cumplen funciones específicas relacionadas al estado del programa.</w:t>
+      </w:r>
     </w:p>
     <w:p>
       <w:pPr>
@@ -1014,6 +2213,977 @@
 <file path=word/numbering.xml><?xml version="1.0" encoding="utf-8"?>
 <w:numbering xmlns:wpc="http://schemas.microsoft.com/office/word/2010/wordprocessingCanvas" xmlns:cx="http://schemas.microsoft.com/office/drawing/2014/chartex" xmlns:cx1="http://schemas.microsoft.com/office/drawing/2015/9/8/chartex" xmlns:cx2="http://schemas.microsoft.com/office/drawing/2015/10/21/chartex" xmlns:cx3="http://schemas.microsoft.com/office/drawing/2016/5/9/chartex" xmlns:cx4="http://schemas.microsoft.com/office/drawing/2016/5/10/chartex" xmlns:cx5="http://schemas.microsoft.com/office/drawing/2016/5/11/chartex" xmlns:cx6="http://schemas.microsoft.com/office/drawing/2016/5/12/chartex" xmlns:cx7="http://schemas.microsoft.com/office/drawing/2016/5/13/chartex" xmlns:cx8="http://schemas.microsoft.com/office/drawing/2016/5/14/chartex" xmlns:mc="http://schemas.openxmlformats.org/markup-compatibility/2006" xmlns:aink="http://schemas.microsoft.com/office/drawing/2016/ink" xmlns:am3d="http://schemas.microsoft.com/office/drawing/2017/model3d" xmlns:o="urn:schemas-microsoft-com:office:office" xmlns:oel="http://schemas.microsoft.com/office/2019/extlst" xmlns:r="http://schemas.openxmlformats.org/officeDocument/2006/relationships" xmlns:m="http://schemas.openxmlformats.org/officeDocument/2006/math" xmlns:v="urn:schemas-microsoft-com:vml" xmlns:wp14="http://schemas.microsoft.com/office/word/2010/wordprocessingDrawing" xmlns:wp="http://schemas.openxmlformats.org/drawingml/2006/wordprocessingDrawing" xmlns:w10="urn:schemas-microsoft-com:office:word" xmlns:w="http://schemas.openxmlformats.org/wordprocessingml/2006/main" xmlns:w14="http://schemas.microsoft.com/office/word/2010/wordml" xmlns:w15="http://schemas.microsoft.com/office/word/2012/wordml" xmlns:w16cex="http://schemas.microsoft.com/office/word/2018/wordml/cex" xmlns:w16cid="http://schemas.microsoft.com/office/word/2016/wordml/cid" xmlns:w16="http://schemas.microsoft.com/office/word/2018/wordml" xmlns:w16du="http://schemas.microsoft.com/office/word/2023/wordml/word16du" xmlns:w16sdtdh="http://schemas.microsoft.com/office/word/2020/wordml/sdtdatahash" xmlns:w16se="http://schemas.microsoft.com/office/word/2015/wordml/symex" xmlns:wpg="http://schemas.microsoft.com/office/word/2010/wordprocessingGroup" xmlns:wpi="http://schemas.microsoft.com/office/word/2010/wordprocessingInk" xmlns:wne="http://schemas.microsoft.com/office/word/2006/wordml" xmlns:wps="http://schemas.microsoft.com/office/word/2010/wordprocessingShape" mc:Ignorable="w14 w15 w16se w16cid w16 w16cex w16sdtdh w16du wp14">
   <w:abstractNum w:abstractNumId="0" w15:restartNumberingAfterBreak="0">
+    <w:nsid w:val="052C097B"/>
+    <w:multiLevelType w:val="multilevel"/>
+    <w:tmpl w:val="AC18BD9C"/>
+    <w:lvl w:ilvl="0">
+      <w:start w:val="1"/>
+      <w:numFmt w:val="bullet"/>
+      <w:lvlText w:val=""/>
+      <w:lvlJc w:val="left"/>
+      <w:pPr>
+        <w:tabs>
+          <w:tab w:val="num" w:pos="720"/>
+        </w:tabs>
+        <w:ind w:left="720" w:hanging="360"/>
+      </w:pPr>
+      <w:rPr>
+        <w:rFonts w:ascii="Symbol" w:hAnsi="Symbol" w:hint="default"/>
+        <w:sz w:val="20"/>
+      </w:rPr>
+    </w:lvl>
+    <w:lvl w:ilvl="1" w:tentative="1">
+      <w:start w:val="1"/>
+      <w:numFmt w:val="bullet"/>
+      <w:lvlText w:val="o"/>
+      <w:lvlJc w:val="left"/>
+      <w:pPr>
+        <w:tabs>
+          <w:tab w:val="num" w:pos="1440"/>
+        </w:tabs>
+        <w:ind w:left="1440" w:hanging="360"/>
+      </w:pPr>
+      <w:rPr>
+        <w:rFonts w:ascii="Courier New" w:hAnsi="Courier New" w:hint="default"/>
+        <w:sz w:val="20"/>
+      </w:rPr>
+    </w:lvl>
+    <w:lvl w:ilvl="2" w:tentative="1">
+      <w:start w:val="1"/>
+      <w:numFmt w:val="bullet"/>
+      <w:lvlText w:val=""/>
+      <w:lvlJc w:val="left"/>
+      <w:pPr>
+        <w:tabs>
+          <w:tab w:val="num" w:pos="2160"/>
+        </w:tabs>
+        <w:ind w:left="2160" w:hanging="360"/>
+      </w:pPr>
+      <w:rPr>
+        <w:rFonts w:ascii="Wingdings" w:hAnsi="Wingdings" w:hint="default"/>
+        <w:sz w:val="20"/>
+      </w:rPr>
+    </w:lvl>
+    <w:lvl w:ilvl="3" w:tentative="1">
+      <w:start w:val="1"/>
+      <w:numFmt w:val="bullet"/>
+      <w:lvlText w:val=""/>
+      <w:lvlJc w:val="left"/>
+      <w:pPr>
+        <w:tabs>
+          <w:tab w:val="num" w:pos="2880"/>
+        </w:tabs>
+        <w:ind w:left="2880" w:hanging="360"/>
+      </w:pPr>
+      <w:rPr>
+        <w:rFonts w:ascii="Wingdings" w:hAnsi="Wingdings" w:hint="default"/>
+        <w:sz w:val="20"/>
+      </w:rPr>
+    </w:lvl>
+    <w:lvl w:ilvl="4" w:tentative="1">
+      <w:start w:val="1"/>
+      <w:numFmt w:val="bullet"/>
+      <w:lvlText w:val=""/>
+      <w:lvlJc w:val="left"/>
+      <w:pPr>
+        <w:tabs>
+          <w:tab w:val="num" w:pos="3600"/>
+        </w:tabs>
+        <w:ind w:left="3600" w:hanging="360"/>
+      </w:pPr>
+      <w:rPr>
+        <w:rFonts w:ascii="Wingdings" w:hAnsi="Wingdings" w:hint="default"/>
+        <w:sz w:val="20"/>
+      </w:rPr>
+    </w:lvl>
+    <w:lvl w:ilvl="5" w:tentative="1">
+      <w:start w:val="1"/>
+      <w:numFmt w:val="bullet"/>
+      <w:lvlText w:val=""/>
+      <w:lvlJc w:val="left"/>
+      <w:pPr>
+        <w:tabs>
+          <w:tab w:val="num" w:pos="4320"/>
+        </w:tabs>
+        <w:ind w:left="4320" w:hanging="360"/>
+      </w:pPr>
+      <w:rPr>
+        <w:rFonts w:ascii="Wingdings" w:hAnsi="Wingdings" w:hint="default"/>
+        <w:sz w:val="20"/>
+      </w:rPr>
+    </w:lvl>
+    <w:lvl w:ilvl="6" w:tentative="1">
+      <w:start w:val="1"/>
+      <w:numFmt w:val="bullet"/>
+      <w:lvlText w:val=""/>
+      <w:lvlJc w:val="left"/>
+      <w:pPr>
+        <w:tabs>
+          <w:tab w:val="num" w:pos="5040"/>
+        </w:tabs>
+        <w:ind w:left="5040" w:hanging="360"/>
+      </w:pPr>
+      <w:rPr>
+        <w:rFonts w:ascii="Wingdings" w:hAnsi="Wingdings" w:hint="default"/>
+        <w:sz w:val="20"/>
+      </w:rPr>
+    </w:lvl>
+    <w:lvl w:ilvl="7" w:tentative="1">
+      <w:start w:val="1"/>
+      <w:numFmt w:val="bullet"/>
+      <w:lvlText w:val=""/>
+      <w:lvlJc w:val="left"/>
+      <w:pPr>
+        <w:tabs>
+          <w:tab w:val="num" w:pos="5760"/>
+        </w:tabs>
+        <w:ind w:left="5760" w:hanging="360"/>
+      </w:pPr>
+      <w:rPr>
+        <w:rFonts w:ascii="Wingdings" w:hAnsi="Wingdings" w:hint="default"/>
+        <w:sz w:val="20"/>
+      </w:rPr>
+    </w:lvl>
+    <w:lvl w:ilvl="8" w:tentative="1">
+      <w:start w:val="1"/>
+      <w:numFmt w:val="bullet"/>
+      <w:lvlText w:val=""/>
+      <w:lvlJc w:val="left"/>
+      <w:pPr>
+        <w:tabs>
+          <w:tab w:val="num" w:pos="6480"/>
+        </w:tabs>
+        <w:ind w:left="6480" w:hanging="360"/>
+      </w:pPr>
+      <w:rPr>
+        <w:rFonts w:ascii="Wingdings" w:hAnsi="Wingdings" w:hint="default"/>
+        <w:sz w:val="20"/>
+      </w:rPr>
+    </w:lvl>
+  </w:abstractNum>
+  <w:abstractNum w:abstractNumId="1" w15:restartNumberingAfterBreak="0">
+    <w:nsid w:val="26E72F43"/>
+    <w:multiLevelType w:val="multilevel"/>
+    <w:tmpl w:val="D8D0605E"/>
+    <w:lvl w:ilvl="0">
+      <w:start w:val="1"/>
+      <w:numFmt w:val="decimal"/>
+      <w:lvlText w:val="%1."/>
+      <w:lvlJc w:val="left"/>
+      <w:pPr>
+        <w:tabs>
+          <w:tab w:val="num" w:pos="720"/>
+        </w:tabs>
+        <w:ind w:left="720" w:hanging="360"/>
+      </w:pPr>
+    </w:lvl>
+    <w:lvl w:ilvl="1" w:tentative="1">
+      <w:start w:val="1"/>
+      <w:numFmt w:val="decimal"/>
+      <w:lvlText w:val="%2."/>
+      <w:lvlJc w:val="left"/>
+      <w:pPr>
+        <w:tabs>
+          <w:tab w:val="num" w:pos="1440"/>
+        </w:tabs>
+        <w:ind w:left="1440" w:hanging="360"/>
+      </w:pPr>
+    </w:lvl>
+    <w:lvl w:ilvl="2" w:tentative="1">
+      <w:start w:val="1"/>
+      <w:numFmt w:val="decimal"/>
+      <w:lvlText w:val="%3."/>
+      <w:lvlJc w:val="left"/>
+      <w:pPr>
+        <w:tabs>
+          <w:tab w:val="num" w:pos="2160"/>
+        </w:tabs>
+        <w:ind w:left="2160" w:hanging="360"/>
+      </w:pPr>
+    </w:lvl>
+    <w:lvl w:ilvl="3" w:tentative="1">
+      <w:start w:val="1"/>
+      <w:numFmt w:val="decimal"/>
+      <w:lvlText w:val="%4."/>
+      <w:lvlJc w:val="left"/>
+      <w:pPr>
+        <w:tabs>
+          <w:tab w:val="num" w:pos="2880"/>
+        </w:tabs>
+        <w:ind w:left="2880" w:hanging="360"/>
+      </w:pPr>
+    </w:lvl>
+    <w:lvl w:ilvl="4" w:tentative="1">
+      <w:start w:val="1"/>
+      <w:numFmt w:val="decimal"/>
+      <w:lvlText w:val="%5."/>
+      <w:lvlJc w:val="left"/>
+      <w:pPr>
+        <w:tabs>
+          <w:tab w:val="num" w:pos="3600"/>
+        </w:tabs>
+        <w:ind w:left="3600" w:hanging="360"/>
+      </w:pPr>
+    </w:lvl>
+    <w:lvl w:ilvl="5" w:tentative="1">
+      <w:start w:val="1"/>
+      <w:numFmt w:val="decimal"/>
+      <w:lvlText w:val="%6."/>
+      <w:lvlJc w:val="left"/>
+      <w:pPr>
+        <w:tabs>
+          <w:tab w:val="num" w:pos="4320"/>
+        </w:tabs>
+        <w:ind w:left="4320" w:hanging="360"/>
+      </w:pPr>
+    </w:lvl>
+    <w:lvl w:ilvl="6" w:tentative="1">
+      <w:start w:val="1"/>
+      <w:numFmt w:val="decimal"/>
+      <w:lvlText w:val="%7."/>
+      <w:lvlJc w:val="left"/>
+      <w:pPr>
+        <w:tabs>
+          <w:tab w:val="num" w:pos="5040"/>
+        </w:tabs>
+        <w:ind w:left="5040" w:hanging="360"/>
+      </w:pPr>
+    </w:lvl>
+    <w:lvl w:ilvl="7" w:tentative="1">
+      <w:start w:val="1"/>
+      <w:numFmt w:val="decimal"/>
+      <w:lvlText w:val="%8."/>
+      <w:lvlJc w:val="left"/>
+      <w:pPr>
+        <w:tabs>
+          <w:tab w:val="num" w:pos="5760"/>
+        </w:tabs>
+        <w:ind w:left="5760" w:hanging="360"/>
+      </w:pPr>
+    </w:lvl>
+    <w:lvl w:ilvl="8" w:tentative="1">
+      <w:start w:val="1"/>
+      <w:numFmt w:val="decimal"/>
+      <w:lvlText w:val="%9."/>
+      <w:lvlJc w:val="left"/>
+      <w:pPr>
+        <w:tabs>
+          <w:tab w:val="num" w:pos="6480"/>
+        </w:tabs>
+        <w:ind w:left="6480" w:hanging="360"/>
+      </w:pPr>
+    </w:lvl>
+  </w:abstractNum>
+  <w:abstractNum w:abstractNumId="2" w15:restartNumberingAfterBreak="0">
+    <w:nsid w:val="27633876"/>
+    <w:multiLevelType w:val="multilevel"/>
+    <w:tmpl w:val="A7EA5E8E"/>
+    <w:lvl w:ilvl="0">
+      <w:start w:val="1"/>
+      <w:numFmt w:val="bullet"/>
+      <w:lvlText w:val=""/>
+      <w:lvlJc w:val="left"/>
+      <w:pPr>
+        <w:tabs>
+          <w:tab w:val="num" w:pos="720"/>
+        </w:tabs>
+        <w:ind w:left="720" w:hanging="360"/>
+      </w:pPr>
+      <w:rPr>
+        <w:rFonts w:ascii="Symbol" w:hAnsi="Symbol" w:hint="default"/>
+        <w:sz w:val="20"/>
+      </w:rPr>
+    </w:lvl>
+    <w:lvl w:ilvl="1" w:tentative="1">
+      <w:start w:val="1"/>
+      <w:numFmt w:val="bullet"/>
+      <w:lvlText w:val="o"/>
+      <w:lvlJc w:val="left"/>
+      <w:pPr>
+        <w:tabs>
+          <w:tab w:val="num" w:pos="1440"/>
+        </w:tabs>
+        <w:ind w:left="1440" w:hanging="360"/>
+      </w:pPr>
+      <w:rPr>
+        <w:rFonts w:ascii="Courier New" w:hAnsi="Courier New" w:hint="default"/>
+        <w:sz w:val="20"/>
+      </w:rPr>
+    </w:lvl>
+    <w:lvl w:ilvl="2" w:tentative="1">
+      <w:start w:val="1"/>
+      <w:numFmt w:val="bullet"/>
+      <w:lvlText w:val=""/>
+      <w:lvlJc w:val="left"/>
+      <w:pPr>
+        <w:tabs>
+          <w:tab w:val="num" w:pos="2160"/>
+        </w:tabs>
+        <w:ind w:left="2160" w:hanging="360"/>
+      </w:pPr>
+      <w:rPr>
+        <w:rFonts w:ascii="Wingdings" w:hAnsi="Wingdings" w:hint="default"/>
+        <w:sz w:val="20"/>
+      </w:rPr>
+    </w:lvl>
+    <w:lvl w:ilvl="3" w:tentative="1">
+      <w:start w:val="1"/>
+      <w:numFmt w:val="bullet"/>
+      <w:lvlText w:val=""/>
+      <w:lvlJc w:val="left"/>
+      <w:pPr>
+        <w:tabs>
+          <w:tab w:val="num" w:pos="2880"/>
+        </w:tabs>
+        <w:ind w:left="2880" w:hanging="360"/>
+      </w:pPr>
+      <w:rPr>
+        <w:rFonts w:ascii="Wingdings" w:hAnsi="Wingdings" w:hint="default"/>
+        <w:sz w:val="20"/>
+      </w:rPr>
+    </w:lvl>
+    <w:lvl w:ilvl="4" w:tentative="1">
+      <w:start w:val="1"/>
+      <w:numFmt w:val="bullet"/>
+      <w:lvlText w:val=""/>
+      <w:lvlJc w:val="left"/>
+      <w:pPr>
+        <w:tabs>
+          <w:tab w:val="num" w:pos="3600"/>
+        </w:tabs>
+        <w:ind w:left="3600" w:hanging="360"/>
+      </w:pPr>
+      <w:rPr>
+        <w:rFonts w:ascii="Wingdings" w:hAnsi="Wingdings" w:hint="default"/>
+        <w:sz w:val="20"/>
+      </w:rPr>
+    </w:lvl>
+    <w:lvl w:ilvl="5" w:tentative="1">
+      <w:start w:val="1"/>
+      <w:numFmt w:val="bullet"/>
+      <w:lvlText w:val=""/>
+      <w:lvlJc w:val="left"/>
+      <w:pPr>
+        <w:tabs>
+          <w:tab w:val="num" w:pos="4320"/>
+        </w:tabs>
+        <w:ind w:left="4320" w:hanging="360"/>
+      </w:pPr>
+      <w:rPr>
+        <w:rFonts w:ascii="Wingdings" w:hAnsi="Wingdings" w:hint="default"/>
+        <w:sz w:val="20"/>
+      </w:rPr>
+    </w:lvl>
+    <w:lvl w:ilvl="6" w:tentative="1">
+      <w:start w:val="1"/>
+      <w:numFmt w:val="bullet"/>
+      <w:lvlText w:val=""/>
+      <w:lvlJc w:val="left"/>
+      <w:pPr>
+        <w:tabs>
+          <w:tab w:val="num" w:pos="5040"/>
+        </w:tabs>
+        <w:ind w:left="5040" w:hanging="360"/>
+      </w:pPr>
+      <w:rPr>
+        <w:rFonts w:ascii="Wingdings" w:hAnsi="Wingdings" w:hint="default"/>
+        <w:sz w:val="20"/>
+      </w:rPr>
+    </w:lvl>
+    <w:lvl w:ilvl="7" w:tentative="1">
+      <w:start w:val="1"/>
+      <w:numFmt w:val="bullet"/>
+      <w:lvlText w:val=""/>
+      <w:lvlJc w:val="left"/>
+      <w:pPr>
+        <w:tabs>
+          <w:tab w:val="num" w:pos="5760"/>
+        </w:tabs>
+        <w:ind w:left="5760" w:hanging="360"/>
+      </w:pPr>
+      <w:rPr>
+        <w:rFonts w:ascii="Wingdings" w:hAnsi="Wingdings" w:hint="default"/>
+        <w:sz w:val="20"/>
+      </w:rPr>
+    </w:lvl>
+    <w:lvl w:ilvl="8" w:tentative="1">
+      <w:start w:val="1"/>
+      <w:numFmt w:val="bullet"/>
+      <w:lvlText w:val=""/>
+      <w:lvlJc w:val="left"/>
+      <w:pPr>
+        <w:tabs>
+          <w:tab w:val="num" w:pos="6480"/>
+        </w:tabs>
+        <w:ind w:left="6480" w:hanging="360"/>
+      </w:pPr>
+      <w:rPr>
+        <w:rFonts w:ascii="Wingdings" w:hAnsi="Wingdings" w:hint="default"/>
+        <w:sz w:val="20"/>
+      </w:rPr>
+    </w:lvl>
+  </w:abstractNum>
+  <w:abstractNum w:abstractNumId="3" w15:restartNumberingAfterBreak="0">
+    <w:nsid w:val="285748C2"/>
+    <w:multiLevelType w:val="multilevel"/>
+    <w:tmpl w:val="DEFCED12"/>
+    <w:lvl w:ilvl="0">
+      <w:start w:val="1"/>
+      <w:numFmt w:val="bullet"/>
+      <w:lvlText w:val=""/>
+      <w:lvlJc w:val="left"/>
+      <w:pPr>
+        <w:tabs>
+          <w:tab w:val="num" w:pos="720"/>
+        </w:tabs>
+        <w:ind w:left="720" w:hanging="360"/>
+      </w:pPr>
+      <w:rPr>
+        <w:rFonts w:ascii="Symbol" w:hAnsi="Symbol" w:hint="default"/>
+        <w:sz w:val="20"/>
+      </w:rPr>
+    </w:lvl>
+    <w:lvl w:ilvl="1" w:tentative="1">
+      <w:start w:val="1"/>
+      <w:numFmt w:val="bullet"/>
+      <w:lvlText w:val="o"/>
+      <w:lvlJc w:val="left"/>
+      <w:pPr>
+        <w:tabs>
+          <w:tab w:val="num" w:pos="1440"/>
+        </w:tabs>
+        <w:ind w:left="1440" w:hanging="360"/>
+      </w:pPr>
+      <w:rPr>
+        <w:rFonts w:ascii="Courier New" w:hAnsi="Courier New" w:hint="default"/>
+        <w:sz w:val="20"/>
+      </w:rPr>
+    </w:lvl>
+    <w:lvl w:ilvl="2" w:tentative="1">
+      <w:start w:val="1"/>
+      <w:numFmt w:val="bullet"/>
+      <w:lvlText w:val=""/>
+      <w:lvlJc w:val="left"/>
+      <w:pPr>
+        <w:tabs>
+          <w:tab w:val="num" w:pos="2160"/>
+        </w:tabs>
+        <w:ind w:left="2160" w:hanging="360"/>
+      </w:pPr>
+      <w:rPr>
+        <w:rFonts w:ascii="Wingdings" w:hAnsi="Wingdings" w:hint="default"/>
+        <w:sz w:val="20"/>
+      </w:rPr>
+    </w:lvl>
+    <w:lvl w:ilvl="3" w:tentative="1">
+      <w:start w:val="1"/>
+      <w:numFmt w:val="bullet"/>
+      <w:lvlText w:val=""/>
+      <w:lvlJc w:val="left"/>
+      <w:pPr>
+        <w:tabs>
+          <w:tab w:val="num" w:pos="2880"/>
+        </w:tabs>
+        <w:ind w:left="2880" w:hanging="360"/>
+      </w:pPr>
+      <w:rPr>
+        <w:rFonts w:ascii="Wingdings" w:hAnsi="Wingdings" w:hint="default"/>
+        <w:sz w:val="20"/>
+      </w:rPr>
+    </w:lvl>
+    <w:lvl w:ilvl="4" w:tentative="1">
+      <w:start w:val="1"/>
+      <w:numFmt w:val="bullet"/>
+      <w:lvlText w:val=""/>
+      <w:lvlJc w:val="left"/>
+      <w:pPr>
+        <w:tabs>
+          <w:tab w:val="num" w:pos="3600"/>
+        </w:tabs>
+        <w:ind w:left="3600" w:hanging="360"/>
+      </w:pPr>
+      <w:rPr>
+        <w:rFonts w:ascii="Wingdings" w:hAnsi="Wingdings" w:hint="default"/>
+        <w:sz w:val="20"/>
+      </w:rPr>
+    </w:lvl>
+    <w:lvl w:ilvl="5" w:tentative="1">
+      <w:start w:val="1"/>
+      <w:numFmt w:val="bullet"/>
+      <w:lvlText w:val=""/>
+      <w:lvlJc w:val="left"/>
+      <w:pPr>
+        <w:tabs>
+          <w:tab w:val="num" w:pos="4320"/>
+        </w:tabs>
+        <w:ind w:left="4320" w:hanging="360"/>
+      </w:pPr>
+      <w:rPr>
+        <w:rFonts w:ascii="Wingdings" w:hAnsi="Wingdings" w:hint="default"/>
+        <w:sz w:val="20"/>
+      </w:rPr>
+    </w:lvl>
+    <w:lvl w:ilvl="6" w:tentative="1">
+      <w:start w:val="1"/>
+      <w:numFmt w:val="bullet"/>
+      <w:lvlText w:val=""/>
+      <w:lvlJc w:val="left"/>
+      <w:pPr>
+        <w:tabs>
+          <w:tab w:val="num" w:pos="5040"/>
+        </w:tabs>
+        <w:ind w:left="5040" w:hanging="360"/>
+      </w:pPr>
+      <w:rPr>
+        <w:rFonts w:ascii="Wingdings" w:hAnsi="Wingdings" w:hint="default"/>
+        <w:sz w:val="20"/>
+      </w:rPr>
+    </w:lvl>
+    <w:lvl w:ilvl="7" w:tentative="1">
+      <w:start w:val="1"/>
+      <w:numFmt w:val="bullet"/>
+      <w:lvlText w:val=""/>
+      <w:lvlJc w:val="left"/>
+      <w:pPr>
+        <w:tabs>
+          <w:tab w:val="num" w:pos="5760"/>
+        </w:tabs>
+        <w:ind w:left="5760" w:hanging="360"/>
+      </w:pPr>
+      <w:rPr>
+        <w:rFonts w:ascii="Wingdings" w:hAnsi="Wingdings" w:hint="default"/>
+        <w:sz w:val="20"/>
+      </w:rPr>
+    </w:lvl>
+    <w:lvl w:ilvl="8" w:tentative="1">
+      <w:start w:val="1"/>
+      <w:numFmt w:val="bullet"/>
+      <w:lvlText w:val=""/>
+      <w:lvlJc w:val="left"/>
+      <w:pPr>
+        <w:tabs>
+          <w:tab w:val="num" w:pos="6480"/>
+        </w:tabs>
+        <w:ind w:left="6480" w:hanging="360"/>
+      </w:pPr>
+      <w:rPr>
+        <w:rFonts w:ascii="Wingdings" w:hAnsi="Wingdings" w:hint="default"/>
+        <w:sz w:val="20"/>
+      </w:rPr>
+    </w:lvl>
+  </w:abstractNum>
+  <w:abstractNum w:abstractNumId="4" w15:restartNumberingAfterBreak="0">
+    <w:nsid w:val="2BEB0FF1"/>
+    <w:multiLevelType w:val="multilevel"/>
+    <w:tmpl w:val="6838C488"/>
+    <w:lvl w:ilvl="0">
+      <w:start w:val="1"/>
+      <w:numFmt w:val="bullet"/>
+      <w:lvlText w:val=""/>
+      <w:lvlJc w:val="left"/>
+      <w:pPr>
+        <w:tabs>
+          <w:tab w:val="num" w:pos="720"/>
+        </w:tabs>
+        <w:ind w:left="720" w:hanging="360"/>
+      </w:pPr>
+      <w:rPr>
+        <w:rFonts w:ascii="Symbol" w:hAnsi="Symbol" w:hint="default"/>
+        <w:sz w:val="20"/>
+      </w:rPr>
+    </w:lvl>
+    <w:lvl w:ilvl="1" w:tentative="1">
+      <w:start w:val="1"/>
+      <w:numFmt w:val="bullet"/>
+      <w:lvlText w:val="o"/>
+      <w:lvlJc w:val="left"/>
+      <w:pPr>
+        <w:tabs>
+          <w:tab w:val="num" w:pos="1440"/>
+        </w:tabs>
+        <w:ind w:left="1440" w:hanging="360"/>
+      </w:pPr>
+      <w:rPr>
+        <w:rFonts w:ascii="Courier New" w:hAnsi="Courier New" w:hint="default"/>
+        <w:sz w:val="20"/>
+      </w:rPr>
+    </w:lvl>
+    <w:lvl w:ilvl="2" w:tentative="1">
+      <w:start w:val="1"/>
+      <w:numFmt w:val="bullet"/>
+      <w:lvlText w:val=""/>
+      <w:lvlJc w:val="left"/>
+      <w:pPr>
+        <w:tabs>
+          <w:tab w:val="num" w:pos="2160"/>
+        </w:tabs>
+        <w:ind w:left="2160" w:hanging="360"/>
+      </w:pPr>
+      <w:rPr>
+        <w:rFonts w:ascii="Wingdings" w:hAnsi="Wingdings" w:hint="default"/>
+        <w:sz w:val="20"/>
+      </w:rPr>
+    </w:lvl>
+    <w:lvl w:ilvl="3" w:tentative="1">
+      <w:start w:val="1"/>
+      <w:numFmt w:val="bullet"/>
+      <w:lvlText w:val=""/>
+      <w:lvlJc w:val="left"/>
+      <w:pPr>
+        <w:tabs>
+          <w:tab w:val="num" w:pos="2880"/>
+        </w:tabs>
+        <w:ind w:left="2880" w:hanging="360"/>
+      </w:pPr>
+      <w:rPr>
+        <w:rFonts w:ascii="Wingdings" w:hAnsi="Wingdings" w:hint="default"/>
+        <w:sz w:val="20"/>
+      </w:rPr>
+    </w:lvl>
+    <w:lvl w:ilvl="4" w:tentative="1">
+      <w:start w:val="1"/>
+      <w:numFmt w:val="bullet"/>
+      <w:lvlText w:val=""/>
+      <w:lvlJc w:val="left"/>
+      <w:pPr>
+        <w:tabs>
+          <w:tab w:val="num" w:pos="3600"/>
+        </w:tabs>
+        <w:ind w:left="3600" w:hanging="360"/>
+      </w:pPr>
+      <w:rPr>
+        <w:rFonts w:ascii="Wingdings" w:hAnsi="Wingdings" w:hint="default"/>
+        <w:sz w:val="20"/>
+      </w:rPr>
+    </w:lvl>
+    <w:lvl w:ilvl="5" w:tentative="1">
+      <w:start w:val="1"/>
+      <w:numFmt w:val="bullet"/>
+      <w:lvlText w:val=""/>
+      <w:lvlJc w:val="left"/>
+      <w:pPr>
+        <w:tabs>
+          <w:tab w:val="num" w:pos="4320"/>
+        </w:tabs>
+        <w:ind w:left="4320" w:hanging="360"/>
+      </w:pPr>
+      <w:rPr>
+        <w:rFonts w:ascii="Wingdings" w:hAnsi="Wingdings" w:hint="default"/>
+        <w:sz w:val="20"/>
+      </w:rPr>
+    </w:lvl>
+    <w:lvl w:ilvl="6" w:tentative="1">
+      <w:start w:val="1"/>
+      <w:numFmt w:val="bullet"/>
+      <w:lvlText w:val=""/>
+      <w:lvlJc w:val="left"/>
+      <w:pPr>
+        <w:tabs>
+          <w:tab w:val="num" w:pos="5040"/>
+        </w:tabs>
+        <w:ind w:left="5040" w:hanging="360"/>
+      </w:pPr>
+      <w:rPr>
+        <w:rFonts w:ascii="Wingdings" w:hAnsi="Wingdings" w:hint="default"/>
+        <w:sz w:val="20"/>
+      </w:rPr>
+    </w:lvl>
+    <w:lvl w:ilvl="7" w:tentative="1">
+      <w:start w:val="1"/>
+      <w:numFmt w:val="bullet"/>
+      <w:lvlText w:val=""/>
+      <w:lvlJc w:val="left"/>
+      <w:pPr>
+        <w:tabs>
+          <w:tab w:val="num" w:pos="5760"/>
+        </w:tabs>
+        <w:ind w:left="5760" w:hanging="360"/>
+      </w:pPr>
+      <w:rPr>
+        <w:rFonts w:ascii="Wingdings" w:hAnsi="Wingdings" w:hint="default"/>
+        <w:sz w:val="20"/>
+      </w:rPr>
+    </w:lvl>
+    <w:lvl w:ilvl="8" w:tentative="1">
+      <w:start w:val="1"/>
+      <w:numFmt w:val="bullet"/>
+      <w:lvlText w:val=""/>
+      <w:lvlJc w:val="left"/>
+      <w:pPr>
+        <w:tabs>
+          <w:tab w:val="num" w:pos="6480"/>
+        </w:tabs>
+        <w:ind w:left="6480" w:hanging="360"/>
+      </w:pPr>
+      <w:rPr>
+        <w:rFonts w:ascii="Wingdings" w:hAnsi="Wingdings" w:hint="default"/>
+        <w:sz w:val="20"/>
+      </w:rPr>
+    </w:lvl>
+  </w:abstractNum>
+  <w:abstractNum w:abstractNumId="5" w15:restartNumberingAfterBreak="0">
+    <w:nsid w:val="35623032"/>
+    <w:multiLevelType w:val="multilevel"/>
+    <w:tmpl w:val="4E92BF82"/>
+    <w:lvl w:ilvl="0">
+      <w:start w:val="1"/>
+      <w:numFmt w:val="bullet"/>
+      <w:lvlText w:val=""/>
+      <w:lvlJc w:val="left"/>
+      <w:pPr>
+        <w:tabs>
+          <w:tab w:val="num" w:pos="720"/>
+        </w:tabs>
+        <w:ind w:left="720" w:hanging="360"/>
+      </w:pPr>
+      <w:rPr>
+        <w:rFonts w:ascii="Symbol" w:hAnsi="Symbol" w:hint="default"/>
+        <w:sz w:val="20"/>
+      </w:rPr>
+    </w:lvl>
+    <w:lvl w:ilvl="1" w:tentative="1">
+      <w:start w:val="1"/>
+      <w:numFmt w:val="bullet"/>
+      <w:lvlText w:val="o"/>
+      <w:lvlJc w:val="left"/>
+      <w:pPr>
+        <w:tabs>
+          <w:tab w:val="num" w:pos="1440"/>
+        </w:tabs>
+        <w:ind w:left="1440" w:hanging="360"/>
+      </w:pPr>
+      <w:rPr>
+        <w:rFonts w:ascii="Courier New" w:hAnsi="Courier New" w:hint="default"/>
+        <w:sz w:val="20"/>
+      </w:rPr>
+    </w:lvl>
+    <w:lvl w:ilvl="2" w:tentative="1">
+      <w:start w:val="1"/>
+      <w:numFmt w:val="bullet"/>
+      <w:lvlText w:val=""/>
+      <w:lvlJc w:val="left"/>
+      <w:pPr>
+        <w:tabs>
+          <w:tab w:val="num" w:pos="2160"/>
+        </w:tabs>
+        <w:ind w:left="2160" w:hanging="360"/>
+      </w:pPr>
+      <w:rPr>
+        <w:rFonts w:ascii="Wingdings" w:hAnsi="Wingdings" w:hint="default"/>
+        <w:sz w:val="20"/>
+      </w:rPr>
+    </w:lvl>
+    <w:lvl w:ilvl="3" w:tentative="1">
+      <w:start w:val="1"/>
+      <w:numFmt w:val="bullet"/>
+      <w:lvlText w:val=""/>
+      <w:lvlJc w:val="left"/>
+      <w:pPr>
+        <w:tabs>
+          <w:tab w:val="num" w:pos="2880"/>
+        </w:tabs>
+        <w:ind w:left="2880" w:hanging="360"/>
+      </w:pPr>
+      <w:rPr>
+        <w:rFonts w:ascii="Wingdings" w:hAnsi="Wingdings" w:hint="default"/>
+        <w:sz w:val="20"/>
+      </w:rPr>
+    </w:lvl>
+    <w:lvl w:ilvl="4" w:tentative="1">
+      <w:start w:val="1"/>
+      <w:numFmt w:val="bullet"/>
+      <w:lvlText w:val=""/>
+      <w:lvlJc w:val="left"/>
+      <w:pPr>
+        <w:tabs>
+          <w:tab w:val="num" w:pos="3600"/>
+        </w:tabs>
+        <w:ind w:left="3600" w:hanging="360"/>
+      </w:pPr>
+      <w:rPr>
+        <w:rFonts w:ascii="Wingdings" w:hAnsi="Wingdings" w:hint="default"/>
+        <w:sz w:val="20"/>
+      </w:rPr>
+    </w:lvl>
+    <w:lvl w:ilvl="5" w:tentative="1">
+      <w:start w:val="1"/>
+      <w:numFmt w:val="bullet"/>
+      <w:lvlText w:val=""/>
+      <w:lvlJc w:val="left"/>
+      <w:pPr>
+        <w:tabs>
+          <w:tab w:val="num" w:pos="4320"/>
+        </w:tabs>
+        <w:ind w:left="4320" w:hanging="360"/>
+      </w:pPr>
+      <w:rPr>
+        <w:rFonts w:ascii="Wingdings" w:hAnsi="Wingdings" w:hint="default"/>
+        <w:sz w:val="20"/>
+      </w:rPr>
+    </w:lvl>
+    <w:lvl w:ilvl="6" w:tentative="1">
+      <w:start w:val="1"/>
+      <w:numFmt w:val="bullet"/>
+      <w:lvlText w:val=""/>
+      <w:lvlJc w:val="left"/>
+      <w:pPr>
+        <w:tabs>
+          <w:tab w:val="num" w:pos="5040"/>
+        </w:tabs>
+        <w:ind w:left="5040" w:hanging="360"/>
+      </w:pPr>
+      <w:rPr>
+        <w:rFonts w:ascii="Wingdings" w:hAnsi="Wingdings" w:hint="default"/>
+        <w:sz w:val="20"/>
+      </w:rPr>
+    </w:lvl>
+    <w:lvl w:ilvl="7" w:tentative="1">
+      <w:start w:val="1"/>
+      <w:numFmt w:val="bullet"/>
+      <w:lvlText w:val=""/>
+      <w:lvlJc w:val="left"/>
+      <w:pPr>
+        <w:tabs>
+          <w:tab w:val="num" w:pos="5760"/>
+        </w:tabs>
+        <w:ind w:left="5760" w:hanging="360"/>
+      </w:pPr>
+      <w:rPr>
+        <w:rFonts w:ascii="Wingdings" w:hAnsi="Wingdings" w:hint="default"/>
+        <w:sz w:val="20"/>
+      </w:rPr>
+    </w:lvl>
+    <w:lvl w:ilvl="8" w:tentative="1">
+      <w:start w:val="1"/>
+      <w:numFmt w:val="bullet"/>
+      <w:lvlText w:val=""/>
+      <w:lvlJc w:val="left"/>
+      <w:pPr>
+        <w:tabs>
+          <w:tab w:val="num" w:pos="6480"/>
+        </w:tabs>
+        <w:ind w:left="6480" w:hanging="360"/>
+      </w:pPr>
+      <w:rPr>
+        <w:rFonts w:ascii="Wingdings" w:hAnsi="Wingdings" w:hint="default"/>
+        <w:sz w:val="20"/>
+      </w:rPr>
+    </w:lvl>
+  </w:abstractNum>
+  <w:abstractNum w:abstractNumId="6" w15:restartNumberingAfterBreak="0">
+    <w:nsid w:val="5C562262"/>
+    <w:multiLevelType w:val="multilevel"/>
+    <w:tmpl w:val="8A7EA976"/>
+    <w:lvl w:ilvl="0">
+      <w:start w:val="1"/>
+      <w:numFmt w:val="decimal"/>
+      <w:lvlText w:val="%1."/>
+      <w:lvlJc w:val="left"/>
+      <w:pPr>
+        <w:tabs>
+          <w:tab w:val="num" w:pos="720"/>
+        </w:tabs>
+        <w:ind w:left="720" w:hanging="360"/>
+      </w:pPr>
+    </w:lvl>
+    <w:lvl w:ilvl="1" w:tentative="1">
+      <w:start w:val="1"/>
+      <w:numFmt w:val="decimal"/>
+      <w:lvlText w:val="%2."/>
+      <w:lvlJc w:val="left"/>
+      <w:pPr>
+        <w:tabs>
+          <w:tab w:val="num" w:pos="1440"/>
+        </w:tabs>
+        <w:ind w:left="1440" w:hanging="360"/>
+      </w:pPr>
+    </w:lvl>
+    <w:lvl w:ilvl="2" w:tentative="1">
+      <w:start w:val="1"/>
+      <w:numFmt w:val="decimal"/>
+      <w:lvlText w:val="%3."/>
+      <w:lvlJc w:val="left"/>
+      <w:pPr>
+        <w:tabs>
+          <w:tab w:val="num" w:pos="2160"/>
+        </w:tabs>
+        <w:ind w:left="2160" w:hanging="360"/>
+      </w:pPr>
+    </w:lvl>
+    <w:lvl w:ilvl="3" w:tentative="1">
+      <w:start w:val="1"/>
+      <w:numFmt w:val="decimal"/>
+      <w:lvlText w:val="%4."/>
+      <w:lvlJc w:val="left"/>
+      <w:pPr>
+        <w:tabs>
+          <w:tab w:val="num" w:pos="2880"/>
+        </w:tabs>
+        <w:ind w:left="2880" w:hanging="360"/>
+      </w:pPr>
+    </w:lvl>
+    <w:lvl w:ilvl="4" w:tentative="1">
+      <w:start w:val="1"/>
+      <w:numFmt w:val="decimal"/>
+      <w:lvlText w:val="%5."/>
+      <w:lvlJc w:val="left"/>
+      <w:pPr>
+        <w:tabs>
+          <w:tab w:val="num" w:pos="3600"/>
+        </w:tabs>
+        <w:ind w:left="3600" w:hanging="360"/>
+      </w:pPr>
+    </w:lvl>
+    <w:lvl w:ilvl="5" w:tentative="1">
+      <w:start w:val="1"/>
+      <w:numFmt w:val="decimal"/>
+      <w:lvlText w:val="%6."/>
+      <w:lvlJc w:val="left"/>
+      <w:pPr>
+        <w:tabs>
+          <w:tab w:val="num" w:pos="4320"/>
+        </w:tabs>
+        <w:ind w:left="4320" w:hanging="360"/>
+      </w:pPr>
+    </w:lvl>
+    <w:lvl w:ilvl="6" w:tentative="1">
+      <w:start w:val="1"/>
+      <w:numFmt w:val="decimal"/>
+      <w:lvlText w:val="%7."/>
+      <w:lvlJc w:val="left"/>
+      <w:pPr>
+        <w:tabs>
+          <w:tab w:val="num" w:pos="5040"/>
+        </w:tabs>
+        <w:ind w:left="5040" w:hanging="360"/>
+      </w:pPr>
+    </w:lvl>
+    <w:lvl w:ilvl="7" w:tentative="1">
+      <w:start w:val="1"/>
+      <w:numFmt w:val="decimal"/>
+      <w:lvlText w:val="%8."/>
+      <w:lvlJc w:val="left"/>
+      <w:pPr>
+        <w:tabs>
+          <w:tab w:val="num" w:pos="5760"/>
+        </w:tabs>
+        <w:ind w:left="5760" w:hanging="360"/>
+      </w:pPr>
+    </w:lvl>
+    <w:lvl w:ilvl="8" w:tentative="1">
+      <w:start w:val="1"/>
+      <w:numFmt w:val="decimal"/>
+      <w:lvlText w:val="%9."/>
+      <w:lvlJc w:val="left"/>
+      <w:pPr>
+        <w:tabs>
+          <w:tab w:val="num" w:pos="6480"/>
+        </w:tabs>
+        <w:ind w:left="6480" w:hanging="360"/>
+      </w:pPr>
+    </w:lvl>
+  </w:abstractNum>
+  <w:abstractNum w:abstractNumId="7" w15:restartNumberingAfterBreak="0">
     <w:nsid w:val="6E2E1BAD"/>
     <w:multiLevelType w:val="hybridMultilevel"/>
     <w:tmpl w:val="E09AFD46"/>
@@ -1126,8 +3296,261 @@
       </w:rPr>
     </w:lvl>
   </w:abstractNum>
+  <w:abstractNum w:abstractNumId="8" w15:restartNumberingAfterBreak="0">
+    <w:nsid w:val="792F5E9D"/>
+    <w:multiLevelType w:val="multilevel"/>
+    <w:tmpl w:val="E7F4376E"/>
+    <w:lvl w:ilvl="0">
+      <w:start w:val="1"/>
+      <w:numFmt w:val="decimal"/>
+      <w:lvlText w:val="%1."/>
+      <w:lvlJc w:val="left"/>
+      <w:pPr>
+        <w:tabs>
+          <w:tab w:val="num" w:pos="720"/>
+        </w:tabs>
+        <w:ind w:left="720" w:hanging="360"/>
+      </w:pPr>
+    </w:lvl>
+    <w:lvl w:ilvl="1" w:tentative="1">
+      <w:start w:val="1"/>
+      <w:numFmt w:val="decimal"/>
+      <w:lvlText w:val="%2."/>
+      <w:lvlJc w:val="left"/>
+      <w:pPr>
+        <w:tabs>
+          <w:tab w:val="num" w:pos="1440"/>
+        </w:tabs>
+        <w:ind w:left="1440" w:hanging="360"/>
+      </w:pPr>
+    </w:lvl>
+    <w:lvl w:ilvl="2" w:tentative="1">
+      <w:start w:val="1"/>
+      <w:numFmt w:val="decimal"/>
+      <w:lvlText w:val="%3."/>
+      <w:lvlJc w:val="left"/>
+      <w:pPr>
+        <w:tabs>
+          <w:tab w:val="num" w:pos="2160"/>
+        </w:tabs>
+        <w:ind w:left="2160" w:hanging="360"/>
+      </w:pPr>
+    </w:lvl>
+    <w:lvl w:ilvl="3" w:tentative="1">
+      <w:start w:val="1"/>
+      <w:numFmt w:val="decimal"/>
+      <w:lvlText w:val="%4."/>
+      <w:lvlJc w:val="left"/>
+      <w:pPr>
+        <w:tabs>
+          <w:tab w:val="num" w:pos="2880"/>
+        </w:tabs>
+        <w:ind w:left="2880" w:hanging="360"/>
+      </w:pPr>
+    </w:lvl>
+    <w:lvl w:ilvl="4" w:tentative="1">
+      <w:start w:val="1"/>
+      <w:numFmt w:val="decimal"/>
+      <w:lvlText w:val="%5."/>
+      <w:lvlJc w:val="left"/>
+      <w:pPr>
+        <w:tabs>
+          <w:tab w:val="num" w:pos="3600"/>
+        </w:tabs>
+        <w:ind w:left="3600" w:hanging="360"/>
+      </w:pPr>
+    </w:lvl>
+    <w:lvl w:ilvl="5" w:tentative="1">
+      <w:start w:val="1"/>
+      <w:numFmt w:val="decimal"/>
+      <w:lvlText w:val="%6."/>
+      <w:lvlJc w:val="left"/>
+      <w:pPr>
+        <w:tabs>
+          <w:tab w:val="num" w:pos="4320"/>
+        </w:tabs>
+        <w:ind w:left="4320" w:hanging="360"/>
+      </w:pPr>
+    </w:lvl>
+    <w:lvl w:ilvl="6" w:tentative="1">
+      <w:start w:val="1"/>
+      <w:numFmt w:val="decimal"/>
+      <w:lvlText w:val="%7."/>
+      <w:lvlJc w:val="left"/>
+      <w:pPr>
+        <w:tabs>
+          <w:tab w:val="num" w:pos="5040"/>
+        </w:tabs>
+        <w:ind w:left="5040" w:hanging="360"/>
+      </w:pPr>
+    </w:lvl>
+    <w:lvl w:ilvl="7" w:tentative="1">
+      <w:start w:val="1"/>
+      <w:numFmt w:val="decimal"/>
+      <w:lvlText w:val="%8."/>
+      <w:lvlJc w:val="left"/>
+      <w:pPr>
+        <w:tabs>
+          <w:tab w:val="num" w:pos="5760"/>
+        </w:tabs>
+        <w:ind w:left="5760" w:hanging="360"/>
+      </w:pPr>
+    </w:lvl>
+    <w:lvl w:ilvl="8" w:tentative="1">
+      <w:start w:val="1"/>
+      <w:numFmt w:val="decimal"/>
+      <w:lvlText w:val="%9."/>
+      <w:lvlJc w:val="left"/>
+      <w:pPr>
+        <w:tabs>
+          <w:tab w:val="num" w:pos="6480"/>
+        </w:tabs>
+        <w:ind w:left="6480" w:hanging="360"/>
+      </w:pPr>
+    </w:lvl>
+  </w:abstractNum>
+  <w:abstractNum w:abstractNumId="9" w15:restartNumberingAfterBreak="0">
+    <w:nsid w:val="7B4716A6"/>
+    <w:multiLevelType w:val="multilevel"/>
+    <w:tmpl w:val="278EEFD2"/>
+    <w:lvl w:ilvl="0">
+      <w:start w:val="1"/>
+      <w:numFmt w:val="decimal"/>
+      <w:lvlText w:val="%1."/>
+      <w:lvlJc w:val="left"/>
+      <w:pPr>
+        <w:tabs>
+          <w:tab w:val="num" w:pos="720"/>
+        </w:tabs>
+        <w:ind w:left="720" w:hanging="360"/>
+      </w:pPr>
+    </w:lvl>
+    <w:lvl w:ilvl="1" w:tentative="1">
+      <w:start w:val="1"/>
+      <w:numFmt w:val="decimal"/>
+      <w:lvlText w:val="%2."/>
+      <w:lvlJc w:val="left"/>
+      <w:pPr>
+        <w:tabs>
+          <w:tab w:val="num" w:pos="1440"/>
+        </w:tabs>
+        <w:ind w:left="1440" w:hanging="360"/>
+      </w:pPr>
+    </w:lvl>
+    <w:lvl w:ilvl="2" w:tentative="1">
+      <w:start w:val="1"/>
+      <w:numFmt w:val="decimal"/>
+      <w:lvlText w:val="%3."/>
+      <w:lvlJc w:val="left"/>
+      <w:pPr>
+        <w:tabs>
+          <w:tab w:val="num" w:pos="2160"/>
+        </w:tabs>
+        <w:ind w:left="2160" w:hanging="360"/>
+      </w:pPr>
+    </w:lvl>
+    <w:lvl w:ilvl="3" w:tentative="1">
+      <w:start w:val="1"/>
+      <w:numFmt w:val="decimal"/>
+      <w:lvlText w:val="%4."/>
+      <w:lvlJc w:val="left"/>
+      <w:pPr>
+        <w:tabs>
+          <w:tab w:val="num" w:pos="2880"/>
+        </w:tabs>
+        <w:ind w:left="2880" w:hanging="360"/>
+      </w:pPr>
+    </w:lvl>
+    <w:lvl w:ilvl="4" w:tentative="1">
+      <w:start w:val="1"/>
+      <w:numFmt w:val="decimal"/>
+      <w:lvlText w:val="%5."/>
+      <w:lvlJc w:val="left"/>
+      <w:pPr>
+        <w:tabs>
+          <w:tab w:val="num" w:pos="3600"/>
+        </w:tabs>
+        <w:ind w:left="3600" w:hanging="360"/>
+      </w:pPr>
+    </w:lvl>
+    <w:lvl w:ilvl="5" w:tentative="1">
+      <w:start w:val="1"/>
+      <w:numFmt w:val="decimal"/>
+      <w:lvlText w:val="%6."/>
+      <w:lvlJc w:val="left"/>
+      <w:pPr>
+        <w:tabs>
+          <w:tab w:val="num" w:pos="4320"/>
+        </w:tabs>
+        <w:ind w:left="4320" w:hanging="360"/>
+      </w:pPr>
+    </w:lvl>
+    <w:lvl w:ilvl="6" w:tentative="1">
+      <w:start w:val="1"/>
+      <w:numFmt w:val="decimal"/>
+      <w:lvlText w:val="%7."/>
+      <w:lvlJc w:val="left"/>
+      <w:pPr>
+        <w:tabs>
+          <w:tab w:val="num" w:pos="5040"/>
+        </w:tabs>
+        <w:ind w:left="5040" w:hanging="360"/>
+      </w:pPr>
+    </w:lvl>
+    <w:lvl w:ilvl="7" w:tentative="1">
+      <w:start w:val="1"/>
+      <w:numFmt w:val="decimal"/>
+      <w:lvlText w:val="%8."/>
+      <w:lvlJc w:val="left"/>
+      <w:pPr>
+        <w:tabs>
+          <w:tab w:val="num" w:pos="5760"/>
+        </w:tabs>
+        <w:ind w:left="5760" w:hanging="360"/>
+      </w:pPr>
+    </w:lvl>
+    <w:lvl w:ilvl="8" w:tentative="1">
+      <w:start w:val="1"/>
+      <w:numFmt w:val="decimal"/>
+      <w:lvlText w:val="%9."/>
+      <w:lvlJc w:val="left"/>
+      <w:pPr>
+        <w:tabs>
+          <w:tab w:val="num" w:pos="6480"/>
+        </w:tabs>
+        <w:ind w:left="6480" w:hanging="360"/>
+      </w:pPr>
+    </w:lvl>
+  </w:abstractNum>
   <w:num w:numId="1" w16cid:durableId="2024284251">
+    <w:abstractNumId w:val="7"/>
+  </w:num>
+  <w:num w:numId="2" w16cid:durableId="1812818526">
+    <w:abstractNumId w:val="9"/>
+  </w:num>
+  <w:num w:numId="3" w16cid:durableId="1658997453">
+    <w:abstractNumId w:val="8"/>
+  </w:num>
+  <w:num w:numId="4" w16cid:durableId="1519930189">
+    <w:abstractNumId w:val="6"/>
+  </w:num>
+  <w:num w:numId="5" w16cid:durableId="244076204">
+    <w:abstractNumId w:val="4"/>
+  </w:num>
+  <w:num w:numId="6" w16cid:durableId="679433078">
+    <w:abstractNumId w:val="1"/>
+  </w:num>
+  <w:num w:numId="7" w16cid:durableId="1095056924">
+    <w:abstractNumId w:val="3"/>
+  </w:num>
+  <w:num w:numId="8" w16cid:durableId="1077019595">
     <w:abstractNumId w:val="0"/>
+  </w:num>
+  <w:num w:numId="9" w16cid:durableId="925380167">
+    <w:abstractNumId w:val="5"/>
+  </w:num>
+  <w:num w:numId="10" w16cid:durableId="1725911660">
+    <w:abstractNumId w:val="2"/>
   </w:num>
 </w:numbering>
 </file>

</xml_diff>

<commit_message>
Agrego sobre un ejemplo practico de programacion en el lenguaje php
</commit_message>
<xml_diff>
--- a/El lenguaje de php y su historia.docx
+++ b/El lenguaje de php y su historia.docx
@@ -714,15 +714,7 @@
       </w:r>
       <w:proofErr w:type="spellEnd"/>
       <w:r>
-        <w:t xml:space="preserve"> comenzaron una reescritura del motor interno de PHP. Los objetivos eran mejorar el rendimiento de PHP en aplicaciones complejas y mejorar </w:t>
-      </w:r>
-      <w:proofErr w:type="gramStart"/>
-      <w:r>
-        <w:t>la modularidad</w:t>
-      </w:r>
-      <w:proofErr w:type="gramEnd"/>
-      <w:r>
-        <w:t xml:space="preserve"> del código. Estas aplicaciones eran posibles gracias a las nuevas funcionalidades de PHP 3.0 y el soporte de una gran cantidad de bases de datos y </w:t>
+        <w:t xml:space="preserve"> comenzaron una reescritura del motor interno de PHP. Los objetivos eran mejorar el rendimiento de PHP en aplicaciones complejas y mejorar la modularidad del código. Estas aplicaciones eran posibles gracias a las nuevas funcionalidades de PHP 3.0 y el soporte de una gran cantidad de bases de datos y </w:t>
       </w:r>
       <w:proofErr w:type="spellStart"/>
       <w:r>
@@ -899,7 +891,6 @@
         <w:t xml:space="preserve"> función </w:t>
       </w:r>
       <w:proofErr w:type="spellStart"/>
-      <w:proofErr w:type="gramStart"/>
       <w:r>
         <w:t>null</w:t>
       </w:r>
@@ -908,11 +899,7 @@
         <w:t xml:space="preserve"> </w:t>
       </w:r>
       <w:r>
-        <w:t>,</w:t>
-      </w:r>
-      <w:proofErr w:type="gramEnd"/>
-      <w:r>
-        <w:t xml:space="preserve"> las </w:t>
+        <w:t>, las </w:t>
       </w:r>
       <w:r>
         <w:t xml:space="preserve">clases </w:t>
@@ -2148,6 +2135,344 @@
           <w:szCs w:val="32"/>
         </w:rPr>
       </w:pPr>
+    </w:p>
+    <w:p/>
+    <w:p/>
+    <w:p/>
+    <w:p/>
+    <w:p/>
+    <w:p/>
+    <w:p/>
+    <w:p>
+      <w:pPr>
+        <w:jc w:val="center"/>
+        <w:rPr>
+          <w:rFonts w:ascii="Arial" w:hAnsi="Arial" w:cs="Arial"/>
+          <w:b/>
+          <w:bCs/>
+          <w:sz w:val="32"/>
+          <w:szCs w:val="32"/>
+        </w:rPr>
+      </w:pPr>
+      <w:r>
+        <w:rPr>
+          <w:rFonts w:ascii="Arial" w:hAnsi="Arial" w:cs="Arial"/>
+          <w:b/>
+          <w:bCs/>
+          <w:sz w:val="32"/>
+          <w:szCs w:val="32"/>
+        </w:rPr>
+        <w:lastRenderedPageBreak/>
+        <w:t>Ejemplo práctico en PHP</w:t>
+      </w:r>
+    </w:p>
+    <w:p>
+      <w:pPr>
+        <w:rPr>
+          <w:rFonts w:ascii="Arial" w:hAnsi="Arial" w:cs="Arial"/>
+          <w:b/>
+          <w:bCs/>
+        </w:rPr>
+      </w:pPr>
+      <w:r>
+        <w:rPr>
+          <w:rFonts w:ascii="Arial" w:hAnsi="Arial" w:cs="Arial"/>
+          <w:b/>
+          <w:bCs/>
+        </w:rPr>
+        <w:t>Formulario simple que recibe un nombre y lo muestra</w:t>
+      </w:r>
+    </w:p>
+    <w:p>
+      <w:pPr>
+        <w:rPr>
+          <w:rFonts w:ascii="Arial" w:hAnsi="Arial" w:cs="Arial"/>
+        </w:rPr>
+      </w:pPr>
+      <w:r>
+        <w:rPr>
+          <w:rFonts w:ascii="Arial" w:hAnsi="Arial" w:cs="Arial"/>
+        </w:rPr>
+        <w:t>Este ejemplo muestra cómo PHP:</w:t>
+      </w:r>
+    </w:p>
+    <w:p>
+      <w:pPr>
+        <w:numPr>
+          <w:ilvl w:val="0"/>
+          <w:numId w:val="11"/>
+        </w:numPr>
+        <w:rPr>
+          <w:rFonts w:ascii="Arial" w:hAnsi="Arial" w:cs="Arial"/>
+        </w:rPr>
+      </w:pPr>
+      <w:r>
+        <w:rPr>
+          <w:rFonts w:ascii="Arial" w:hAnsi="Arial" w:cs="Arial"/>
+        </w:rPr>
+        <w:t>Recibe datos de un formulario</w:t>
+      </w:r>
+    </w:p>
+    <w:p>
+      <w:pPr>
+        <w:numPr>
+          <w:ilvl w:val="0"/>
+          <w:numId w:val="11"/>
+        </w:numPr>
+        <w:rPr>
+          <w:rFonts w:ascii="Arial" w:hAnsi="Arial" w:cs="Arial"/>
+        </w:rPr>
+      </w:pPr>
+      <w:r>
+        <w:rPr>
+          <w:rFonts w:ascii="Arial" w:hAnsi="Arial" w:cs="Arial"/>
+        </w:rPr>
+        <w:t>Procesa la información</w:t>
+      </w:r>
+    </w:p>
+    <w:p>
+      <w:pPr>
+        <w:numPr>
+          <w:ilvl w:val="0"/>
+          <w:numId w:val="11"/>
+        </w:numPr>
+        <w:rPr>
+          <w:rFonts w:ascii="Arial" w:hAnsi="Arial" w:cs="Arial"/>
+        </w:rPr>
+      </w:pPr>
+      <w:r>
+        <w:rPr>
+          <w:rFonts w:ascii="Arial" w:hAnsi="Arial" w:cs="Arial"/>
+        </w:rPr>
+        <w:t>Muestra un resultado dinámico</w:t>
+      </w:r>
+    </w:p>
+    <w:p>
+      <w:pPr>
+        <w:rPr>
+          <w:rFonts w:ascii="Arial" w:hAnsi="Arial" w:cs="Arial"/>
+        </w:rPr>
+      </w:pPr>
+      <w:r>
+        <w:rPr>
+          <w:rFonts w:ascii="Arial" w:hAnsi="Arial" w:cs="Arial"/>
+        </w:rPr>
+        <w:pict>
+          <v:rect id="_x0000_i1039" style="width:0;height:1.5pt" o:hralign="center" o:hrstd="t" o:hr="t" fillcolor="#a0a0a0" stroked="f"/>
+        </w:pict>
+      </w:r>
+    </w:p>
+    <w:p>
+      <w:pPr>
+        <w:rPr>
+          <w:rFonts w:ascii="Arial" w:hAnsi="Arial" w:cs="Arial"/>
+          <w:b/>
+          <w:bCs/>
+        </w:rPr>
+      </w:pPr>
+      <w:r>
+        <w:rPr>
+          <w:rFonts w:ascii="Arial" w:hAnsi="Arial" w:cs="Arial"/>
+          <w:b/>
+          <w:bCs/>
+        </w:rPr>
+        <w:t>Código completo (</w:t>
+      </w:r>
+      <w:proofErr w:type="spellStart"/>
+      <w:r>
+        <w:rPr>
+          <w:rFonts w:ascii="Arial" w:hAnsi="Arial" w:cs="Arial"/>
+          <w:b/>
+          <w:bCs/>
+        </w:rPr>
+        <w:t>index.php</w:t>
+      </w:r>
+      <w:proofErr w:type="spellEnd"/>
+      <w:r>
+        <w:rPr>
+          <w:rFonts w:ascii="Arial" w:hAnsi="Arial" w:cs="Arial"/>
+          <w:b/>
+          <w:bCs/>
+        </w:rPr>
+        <w:t>)</w:t>
+      </w:r>
+    </w:p>
+    <w:p>
+      <w:r>
+        <w:drawing>
+          <wp:inline distT="0" distB="0" distL="0" distR="0" wp14:anchorId="2146C4C5" wp14:editId="5C83299C">
+            <wp:extent cx="4972744" cy="4972744"/>
+            <wp:effectExtent l="0" t="0" r="0" b="0"/>
+            <wp:docPr id="1481575053" name="Imagen 1" descr="Texto&#10;&#10;Descripción generada automáticamente"/>
+            <wp:cNvGraphicFramePr>
+              <a:graphicFrameLocks xmlns:a="http://schemas.openxmlformats.org/drawingml/2006/main" noChangeAspect="1"/>
+            </wp:cNvGraphicFramePr>
+            <a:graphic xmlns:a="http://schemas.openxmlformats.org/drawingml/2006/main">
+              <a:graphicData uri="http://schemas.openxmlformats.org/drawingml/2006/picture">
+                <pic:pic xmlns:pic="http://schemas.openxmlformats.org/drawingml/2006/picture">
+                  <pic:nvPicPr>
+                    <pic:cNvPr id="1481575053" name="Imagen 1" descr="Texto&#10;&#10;Descripción generada automáticamente"/>
+                    <pic:cNvPicPr/>
+                  </pic:nvPicPr>
+                  <pic:blipFill>
+                    <a:blip r:embed="rId14"/>
+                    <a:stretch>
+                      <a:fillRect/>
+                    </a:stretch>
+                  </pic:blipFill>
+                  <pic:spPr>
+                    <a:xfrm>
+                      <a:off x="0" y="0"/>
+                      <a:ext cx="4972744" cy="4972744"/>
+                    </a:xfrm>
+                    <a:prstGeom prst="rect">
+                      <a:avLst/>
+                    </a:prstGeom>
+                  </pic:spPr>
+                </pic:pic>
+              </a:graphicData>
+            </a:graphic>
+          </wp:inline>
+        </w:drawing>
+      </w:r>
+    </w:p>
+    <w:p/>
+    <w:p/>
+    <w:p>
+      <w:pPr>
+        <w:rPr>
+          <w:b/>
+          <w:bCs/>
+        </w:rPr>
+      </w:pPr>
+      <w:r>
+        <w:rPr>
+          <w:b/>
+          <w:bCs/>
+        </w:rPr>
+        <w:lastRenderedPageBreak/>
+        <w:t>¿Qué hace este ejemplo?</w:t>
+      </w:r>
+    </w:p>
+    <w:p>
+      <w:pPr>
+        <w:numPr>
+          <w:ilvl w:val="0"/>
+          <w:numId w:val="12"/>
+        </w:numPr>
+      </w:pPr>
+      <w:r>
+        <w:t>El usuario escribe su nombre.</w:t>
+      </w:r>
+    </w:p>
+    <w:p>
+      <w:pPr>
+        <w:numPr>
+          <w:ilvl w:val="0"/>
+          <w:numId w:val="12"/>
+        </w:numPr>
+      </w:pPr>
+      <w:r>
+        <w:t>PHP recibe el dato usando $_POST.</w:t>
+      </w:r>
+    </w:p>
+    <w:p>
+      <w:pPr>
+        <w:numPr>
+          <w:ilvl w:val="0"/>
+          <w:numId w:val="12"/>
+        </w:numPr>
+      </w:pPr>
+      <w:r>
+        <w:t>El servidor responde mostrando un saludo personalizado.</w:t>
+      </w:r>
+    </w:p>
+    <w:p>
+      <w:r>
+        <w:pict>
+          <v:rect id="_x0000_i1048" style="width:0;height:1.5pt" o:hralign="center" o:hrstd="t" o:hr="t" fillcolor="#a0a0a0" stroked="f"/>
+        </w:pict>
+      </w:r>
+    </w:p>
+    <w:p>
+      <w:pPr>
+        <w:rPr>
+          <w:b/>
+          <w:bCs/>
+        </w:rPr>
+      </w:pPr>
+      <w:r>
+        <w:rPr>
+          <w:b/>
+          <w:bCs/>
+        </w:rPr>
+        <w:t xml:space="preserve"> ¿Por qué es un buen ejemplo práctico?</w:t>
+      </w:r>
+    </w:p>
+    <w:p>
+      <w:pPr>
+        <w:numPr>
+          <w:ilvl w:val="0"/>
+          <w:numId w:val="13"/>
+        </w:numPr>
+      </w:pPr>
+      <w:r>
+        <w:t xml:space="preserve">Usa </w:t>
+      </w:r>
+      <w:r>
+        <w:rPr>
+          <w:b/>
+          <w:bCs/>
+        </w:rPr>
+        <w:t>HTML + PHP juntos</w:t>
+      </w:r>
+    </w:p>
+    <w:p>
+      <w:pPr>
+        <w:numPr>
+          <w:ilvl w:val="0"/>
+          <w:numId w:val="13"/>
+        </w:numPr>
+      </w:pPr>
+      <w:r>
+        <w:t xml:space="preserve">Introduce el concepto de </w:t>
+      </w:r>
+      <w:r>
+        <w:rPr>
+          <w:b/>
+          <w:bCs/>
+        </w:rPr>
+        <w:t>formularios</w:t>
+      </w:r>
+    </w:p>
+    <w:p>
+      <w:pPr>
+        <w:numPr>
+          <w:ilvl w:val="0"/>
+          <w:numId w:val="13"/>
+        </w:numPr>
+      </w:pPr>
+      <w:r>
+        <w:t xml:space="preserve">Muestra cómo PHP </w:t>
+      </w:r>
+      <w:r>
+        <w:rPr>
+          <w:b/>
+          <w:bCs/>
+        </w:rPr>
+        <w:t>procesa datos del usuario</w:t>
+      </w:r>
+    </w:p>
+    <w:p>
+      <w:pPr>
+        <w:numPr>
+          <w:ilvl w:val="0"/>
+          <w:numId w:val="13"/>
+        </w:numPr>
+      </w:pPr>
+      <w:r>
+        <w:t>Es corto, claro y funcional</w:t>
+      </w:r>
     </w:p>
     <w:p/>
     <w:sectPr>
@@ -2922,6 +3247,155 @@
     </w:lvl>
   </w:abstractNum>
   <w:abstractNum w:abstractNumId="5" w15:restartNumberingAfterBreak="0">
+    <w:nsid w:val="330F0045"/>
+    <w:multiLevelType w:val="multilevel"/>
+    <w:tmpl w:val="EC42374A"/>
+    <w:lvl w:ilvl="0">
+      <w:start w:val="1"/>
+      <w:numFmt w:val="bullet"/>
+      <w:lvlText w:val=""/>
+      <w:lvlJc w:val="left"/>
+      <w:pPr>
+        <w:tabs>
+          <w:tab w:val="num" w:pos="720"/>
+        </w:tabs>
+        <w:ind w:left="720" w:hanging="360"/>
+      </w:pPr>
+      <w:rPr>
+        <w:rFonts w:ascii="Symbol" w:hAnsi="Symbol" w:hint="default"/>
+        <w:sz w:val="20"/>
+      </w:rPr>
+    </w:lvl>
+    <w:lvl w:ilvl="1" w:tentative="1">
+      <w:start w:val="1"/>
+      <w:numFmt w:val="bullet"/>
+      <w:lvlText w:val="o"/>
+      <w:lvlJc w:val="left"/>
+      <w:pPr>
+        <w:tabs>
+          <w:tab w:val="num" w:pos="1440"/>
+        </w:tabs>
+        <w:ind w:left="1440" w:hanging="360"/>
+      </w:pPr>
+      <w:rPr>
+        <w:rFonts w:ascii="Courier New" w:hAnsi="Courier New" w:hint="default"/>
+        <w:sz w:val="20"/>
+      </w:rPr>
+    </w:lvl>
+    <w:lvl w:ilvl="2" w:tentative="1">
+      <w:start w:val="1"/>
+      <w:numFmt w:val="bullet"/>
+      <w:lvlText w:val=""/>
+      <w:lvlJc w:val="left"/>
+      <w:pPr>
+        <w:tabs>
+          <w:tab w:val="num" w:pos="2160"/>
+        </w:tabs>
+        <w:ind w:left="2160" w:hanging="360"/>
+      </w:pPr>
+      <w:rPr>
+        <w:rFonts w:ascii="Wingdings" w:hAnsi="Wingdings" w:hint="default"/>
+        <w:sz w:val="20"/>
+      </w:rPr>
+    </w:lvl>
+    <w:lvl w:ilvl="3" w:tentative="1">
+      <w:start w:val="1"/>
+      <w:numFmt w:val="bullet"/>
+      <w:lvlText w:val=""/>
+      <w:lvlJc w:val="left"/>
+      <w:pPr>
+        <w:tabs>
+          <w:tab w:val="num" w:pos="2880"/>
+        </w:tabs>
+        <w:ind w:left="2880" w:hanging="360"/>
+      </w:pPr>
+      <w:rPr>
+        <w:rFonts w:ascii="Wingdings" w:hAnsi="Wingdings" w:hint="default"/>
+        <w:sz w:val="20"/>
+      </w:rPr>
+    </w:lvl>
+    <w:lvl w:ilvl="4" w:tentative="1">
+      <w:start w:val="1"/>
+      <w:numFmt w:val="bullet"/>
+      <w:lvlText w:val=""/>
+      <w:lvlJc w:val="left"/>
+      <w:pPr>
+        <w:tabs>
+          <w:tab w:val="num" w:pos="3600"/>
+        </w:tabs>
+        <w:ind w:left="3600" w:hanging="360"/>
+      </w:pPr>
+      <w:rPr>
+        <w:rFonts w:ascii="Wingdings" w:hAnsi="Wingdings" w:hint="default"/>
+        <w:sz w:val="20"/>
+      </w:rPr>
+    </w:lvl>
+    <w:lvl w:ilvl="5" w:tentative="1">
+      <w:start w:val="1"/>
+      <w:numFmt w:val="bullet"/>
+      <w:lvlText w:val=""/>
+      <w:lvlJc w:val="left"/>
+      <w:pPr>
+        <w:tabs>
+          <w:tab w:val="num" w:pos="4320"/>
+        </w:tabs>
+        <w:ind w:left="4320" w:hanging="360"/>
+      </w:pPr>
+      <w:rPr>
+        <w:rFonts w:ascii="Wingdings" w:hAnsi="Wingdings" w:hint="default"/>
+        <w:sz w:val="20"/>
+      </w:rPr>
+    </w:lvl>
+    <w:lvl w:ilvl="6" w:tentative="1">
+      <w:start w:val="1"/>
+      <w:numFmt w:val="bullet"/>
+      <w:lvlText w:val=""/>
+      <w:lvlJc w:val="left"/>
+      <w:pPr>
+        <w:tabs>
+          <w:tab w:val="num" w:pos="5040"/>
+        </w:tabs>
+        <w:ind w:left="5040" w:hanging="360"/>
+      </w:pPr>
+      <w:rPr>
+        <w:rFonts w:ascii="Wingdings" w:hAnsi="Wingdings" w:hint="default"/>
+        <w:sz w:val="20"/>
+      </w:rPr>
+    </w:lvl>
+    <w:lvl w:ilvl="7" w:tentative="1">
+      <w:start w:val="1"/>
+      <w:numFmt w:val="bullet"/>
+      <w:lvlText w:val=""/>
+      <w:lvlJc w:val="left"/>
+      <w:pPr>
+        <w:tabs>
+          <w:tab w:val="num" w:pos="5760"/>
+        </w:tabs>
+        <w:ind w:left="5760" w:hanging="360"/>
+      </w:pPr>
+      <w:rPr>
+        <w:rFonts w:ascii="Wingdings" w:hAnsi="Wingdings" w:hint="default"/>
+        <w:sz w:val="20"/>
+      </w:rPr>
+    </w:lvl>
+    <w:lvl w:ilvl="8" w:tentative="1">
+      <w:start w:val="1"/>
+      <w:numFmt w:val="bullet"/>
+      <w:lvlText w:val=""/>
+      <w:lvlJc w:val="left"/>
+      <w:pPr>
+        <w:tabs>
+          <w:tab w:val="num" w:pos="6480"/>
+        </w:tabs>
+        <w:ind w:left="6480" w:hanging="360"/>
+      </w:pPr>
+      <w:rPr>
+        <w:rFonts w:ascii="Wingdings" w:hAnsi="Wingdings" w:hint="default"/>
+        <w:sz w:val="20"/>
+      </w:rPr>
+    </w:lvl>
+  </w:abstractNum>
+  <w:abstractNum w:abstractNumId="6" w15:restartNumberingAfterBreak="0">
     <w:nsid w:val="35623032"/>
     <w:multiLevelType w:val="multilevel"/>
     <w:tmpl w:val="4E92BF82"/>
@@ -3070,7 +3544,156 @@
       </w:rPr>
     </w:lvl>
   </w:abstractNum>
-  <w:abstractNum w:abstractNumId="6" w15:restartNumberingAfterBreak="0">
+  <w:abstractNum w:abstractNumId="7" w15:restartNumberingAfterBreak="0">
+    <w:nsid w:val="3A1A3E76"/>
+    <w:multiLevelType w:val="multilevel"/>
+    <w:tmpl w:val="CF8A9102"/>
+    <w:lvl w:ilvl="0">
+      <w:start w:val="1"/>
+      <w:numFmt w:val="bullet"/>
+      <w:lvlText w:val=""/>
+      <w:lvlJc w:val="left"/>
+      <w:pPr>
+        <w:tabs>
+          <w:tab w:val="num" w:pos="720"/>
+        </w:tabs>
+        <w:ind w:left="720" w:hanging="360"/>
+      </w:pPr>
+      <w:rPr>
+        <w:rFonts w:ascii="Symbol" w:hAnsi="Symbol" w:hint="default"/>
+        <w:sz w:val="20"/>
+      </w:rPr>
+    </w:lvl>
+    <w:lvl w:ilvl="1" w:tentative="1">
+      <w:start w:val="1"/>
+      <w:numFmt w:val="bullet"/>
+      <w:lvlText w:val="o"/>
+      <w:lvlJc w:val="left"/>
+      <w:pPr>
+        <w:tabs>
+          <w:tab w:val="num" w:pos="1440"/>
+        </w:tabs>
+        <w:ind w:left="1440" w:hanging="360"/>
+      </w:pPr>
+      <w:rPr>
+        <w:rFonts w:ascii="Courier New" w:hAnsi="Courier New" w:hint="default"/>
+        <w:sz w:val="20"/>
+      </w:rPr>
+    </w:lvl>
+    <w:lvl w:ilvl="2" w:tentative="1">
+      <w:start w:val="1"/>
+      <w:numFmt w:val="bullet"/>
+      <w:lvlText w:val=""/>
+      <w:lvlJc w:val="left"/>
+      <w:pPr>
+        <w:tabs>
+          <w:tab w:val="num" w:pos="2160"/>
+        </w:tabs>
+        <w:ind w:left="2160" w:hanging="360"/>
+      </w:pPr>
+      <w:rPr>
+        <w:rFonts w:ascii="Wingdings" w:hAnsi="Wingdings" w:hint="default"/>
+        <w:sz w:val="20"/>
+      </w:rPr>
+    </w:lvl>
+    <w:lvl w:ilvl="3" w:tentative="1">
+      <w:start w:val="1"/>
+      <w:numFmt w:val="bullet"/>
+      <w:lvlText w:val=""/>
+      <w:lvlJc w:val="left"/>
+      <w:pPr>
+        <w:tabs>
+          <w:tab w:val="num" w:pos="2880"/>
+        </w:tabs>
+        <w:ind w:left="2880" w:hanging="360"/>
+      </w:pPr>
+      <w:rPr>
+        <w:rFonts w:ascii="Wingdings" w:hAnsi="Wingdings" w:hint="default"/>
+        <w:sz w:val="20"/>
+      </w:rPr>
+    </w:lvl>
+    <w:lvl w:ilvl="4" w:tentative="1">
+      <w:start w:val="1"/>
+      <w:numFmt w:val="bullet"/>
+      <w:lvlText w:val=""/>
+      <w:lvlJc w:val="left"/>
+      <w:pPr>
+        <w:tabs>
+          <w:tab w:val="num" w:pos="3600"/>
+        </w:tabs>
+        <w:ind w:left="3600" w:hanging="360"/>
+      </w:pPr>
+      <w:rPr>
+        <w:rFonts w:ascii="Wingdings" w:hAnsi="Wingdings" w:hint="default"/>
+        <w:sz w:val="20"/>
+      </w:rPr>
+    </w:lvl>
+    <w:lvl w:ilvl="5" w:tentative="1">
+      <w:start w:val="1"/>
+      <w:numFmt w:val="bullet"/>
+      <w:lvlText w:val=""/>
+      <w:lvlJc w:val="left"/>
+      <w:pPr>
+        <w:tabs>
+          <w:tab w:val="num" w:pos="4320"/>
+        </w:tabs>
+        <w:ind w:left="4320" w:hanging="360"/>
+      </w:pPr>
+      <w:rPr>
+        <w:rFonts w:ascii="Wingdings" w:hAnsi="Wingdings" w:hint="default"/>
+        <w:sz w:val="20"/>
+      </w:rPr>
+    </w:lvl>
+    <w:lvl w:ilvl="6" w:tentative="1">
+      <w:start w:val="1"/>
+      <w:numFmt w:val="bullet"/>
+      <w:lvlText w:val=""/>
+      <w:lvlJc w:val="left"/>
+      <w:pPr>
+        <w:tabs>
+          <w:tab w:val="num" w:pos="5040"/>
+        </w:tabs>
+        <w:ind w:left="5040" w:hanging="360"/>
+      </w:pPr>
+      <w:rPr>
+        <w:rFonts w:ascii="Wingdings" w:hAnsi="Wingdings" w:hint="default"/>
+        <w:sz w:val="20"/>
+      </w:rPr>
+    </w:lvl>
+    <w:lvl w:ilvl="7" w:tentative="1">
+      <w:start w:val="1"/>
+      <w:numFmt w:val="bullet"/>
+      <w:lvlText w:val=""/>
+      <w:lvlJc w:val="left"/>
+      <w:pPr>
+        <w:tabs>
+          <w:tab w:val="num" w:pos="5760"/>
+        </w:tabs>
+        <w:ind w:left="5760" w:hanging="360"/>
+      </w:pPr>
+      <w:rPr>
+        <w:rFonts w:ascii="Wingdings" w:hAnsi="Wingdings" w:hint="default"/>
+        <w:sz w:val="20"/>
+      </w:rPr>
+    </w:lvl>
+    <w:lvl w:ilvl="8" w:tentative="1">
+      <w:start w:val="1"/>
+      <w:numFmt w:val="bullet"/>
+      <w:lvlText w:val=""/>
+      <w:lvlJc w:val="left"/>
+      <w:pPr>
+        <w:tabs>
+          <w:tab w:val="num" w:pos="6480"/>
+        </w:tabs>
+        <w:ind w:left="6480" w:hanging="360"/>
+      </w:pPr>
+      <w:rPr>
+        <w:rFonts w:ascii="Wingdings" w:hAnsi="Wingdings" w:hint="default"/>
+        <w:sz w:val="20"/>
+      </w:rPr>
+    </w:lvl>
+  </w:abstractNum>
+  <w:abstractNum w:abstractNumId="8" w15:restartNumberingAfterBreak="0">
     <w:nsid w:val="5C562262"/>
     <w:multiLevelType w:val="multilevel"/>
     <w:tmpl w:val="8A7EA976"/>
@@ -3183,7 +3806,156 @@
       </w:pPr>
     </w:lvl>
   </w:abstractNum>
-  <w:abstractNum w:abstractNumId="7" w15:restartNumberingAfterBreak="0">
+  <w:abstractNum w:abstractNumId="9" w15:restartNumberingAfterBreak="0">
+    <w:nsid w:val="642B0CA3"/>
+    <w:multiLevelType w:val="multilevel"/>
+    <w:tmpl w:val="D8DE392E"/>
+    <w:lvl w:ilvl="0">
+      <w:start w:val="1"/>
+      <w:numFmt w:val="bullet"/>
+      <w:lvlText w:val=""/>
+      <w:lvlJc w:val="left"/>
+      <w:pPr>
+        <w:tabs>
+          <w:tab w:val="num" w:pos="720"/>
+        </w:tabs>
+        <w:ind w:left="720" w:hanging="360"/>
+      </w:pPr>
+      <w:rPr>
+        <w:rFonts w:ascii="Symbol" w:hAnsi="Symbol" w:hint="default"/>
+        <w:sz w:val="20"/>
+      </w:rPr>
+    </w:lvl>
+    <w:lvl w:ilvl="1" w:tentative="1">
+      <w:start w:val="1"/>
+      <w:numFmt w:val="bullet"/>
+      <w:lvlText w:val="o"/>
+      <w:lvlJc w:val="left"/>
+      <w:pPr>
+        <w:tabs>
+          <w:tab w:val="num" w:pos="1440"/>
+        </w:tabs>
+        <w:ind w:left="1440" w:hanging="360"/>
+      </w:pPr>
+      <w:rPr>
+        <w:rFonts w:ascii="Courier New" w:hAnsi="Courier New" w:hint="default"/>
+        <w:sz w:val="20"/>
+      </w:rPr>
+    </w:lvl>
+    <w:lvl w:ilvl="2" w:tentative="1">
+      <w:start w:val="1"/>
+      <w:numFmt w:val="bullet"/>
+      <w:lvlText w:val=""/>
+      <w:lvlJc w:val="left"/>
+      <w:pPr>
+        <w:tabs>
+          <w:tab w:val="num" w:pos="2160"/>
+        </w:tabs>
+        <w:ind w:left="2160" w:hanging="360"/>
+      </w:pPr>
+      <w:rPr>
+        <w:rFonts w:ascii="Wingdings" w:hAnsi="Wingdings" w:hint="default"/>
+        <w:sz w:val="20"/>
+      </w:rPr>
+    </w:lvl>
+    <w:lvl w:ilvl="3" w:tentative="1">
+      <w:start w:val="1"/>
+      <w:numFmt w:val="bullet"/>
+      <w:lvlText w:val=""/>
+      <w:lvlJc w:val="left"/>
+      <w:pPr>
+        <w:tabs>
+          <w:tab w:val="num" w:pos="2880"/>
+        </w:tabs>
+        <w:ind w:left="2880" w:hanging="360"/>
+      </w:pPr>
+      <w:rPr>
+        <w:rFonts w:ascii="Wingdings" w:hAnsi="Wingdings" w:hint="default"/>
+        <w:sz w:val="20"/>
+      </w:rPr>
+    </w:lvl>
+    <w:lvl w:ilvl="4" w:tentative="1">
+      <w:start w:val="1"/>
+      <w:numFmt w:val="bullet"/>
+      <w:lvlText w:val=""/>
+      <w:lvlJc w:val="left"/>
+      <w:pPr>
+        <w:tabs>
+          <w:tab w:val="num" w:pos="3600"/>
+        </w:tabs>
+        <w:ind w:left="3600" w:hanging="360"/>
+      </w:pPr>
+      <w:rPr>
+        <w:rFonts w:ascii="Wingdings" w:hAnsi="Wingdings" w:hint="default"/>
+        <w:sz w:val="20"/>
+      </w:rPr>
+    </w:lvl>
+    <w:lvl w:ilvl="5" w:tentative="1">
+      <w:start w:val="1"/>
+      <w:numFmt w:val="bullet"/>
+      <w:lvlText w:val=""/>
+      <w:lvlJc w:val="left"/>
+      <w:pPr>
+        <w:tabs>
+          <w:tab w:val="num" w:pos="4320"/>
+        </w:tabs>
+        <w:ind w:left="4320" w:hanging="360"/>
+      </w:pPr>
+      <w:rPr>
+        <w:rFonts w:ascii="Wingdings" w:hAnsi="Wingdings" w:hint="default"/>
+        <w:sz w:val="20"/>
+      </w:rPr>
+    </w:lvl>
+    <w:lvl w:ilvl="6" w:tentative="1">
+      <w:start w:val="1"/>
+      <w:numFmt w:val="bullet"/>
+      <w:lvlText w:val=""/>
+      <w:lvlJc w:val="left"/>
+      <w:pPr>
+        <w:tabs>
+          <w:tab w:val="num" w:pos="5040"/>
+        </w:tabs>
+        <w:ind w:left="5040" w:hanging="360"/>
+      </w:pPr>
+      <w:rPr>
+        <w:rFonts w:ascii="Wingdings" w:hAnsi="Wingdings" w:hint="default"/>
+        <w:sz w:val="20"/>
+      </w:rPr>
+    </w:lvl>
+    <w:lvl w:ilvl="7" w:tentative="1">
+      <w:start w:val="1"/>
+      <w:numFmt w:val="bullet"/>
+      <w:lvlText w:val=""/>
+      <w:lvlJc w:val="left"/>
+      <w:pPr>
+        <w:tabs>
+          <w:tab w:val="num" w:pos="5760"/>
+        </w:tabs>
+        <w:ind w:left="5760" w:hanging="360"/>
+      </w:pPr>
+      <w:rPr>
+        <w:rFonts w:ascii="Wingdings" w:hAnsi="Wingdings" w:hint="default"/>
+        <w:sz w:val="20"/>
+      </w:rPr>
+    </w:lvl>
+    <w:lvl w:ilvl="8" w:tentative="1">
+      <w:start w:val="1"/>
+      <w:numFmt w:val="bullet"/>
+      <w:lvlText w:val=""/>
+      <w:lvlJc w:val="left"/>
+      <w:pPr>
+        <w:tabs>
+          <w:tab w:val="num" w:pos="6480"/>
+        </w:tabs>
+        <w:ind w:left="6480" w:hanging="360"/>
+      </w:pPr>
+      <w:rPr>
+        <w:rFonts w:ascii="Wingdings" w:hAnsi="Wingdings" w:hint="default"/>
+        <w:sz w:val="20"/>
+      </w:rPr>
+    </w:lvl>
+  </w:abstractNum>
+  <w:abstractNum w:abstractNumId="10" w15:restartNumberingAfterBreak="0">
     <w:nsid w:val="6E2E1BAD"/>
     <w:multiLevelType w:val="hybridMultilevel"/>
     <w:tmpl w:val="E09AFD46"/>
@@ -3296,7 +4068,7 @@
       </w:rPr>
     </w:lvl>
   </w:abstractNum>
-  <w:abstractNum w:abstractNumId="8" w15:restartNumberingAfterBreak="0">
+  <w:abstractNum w:abstractNumId="11" w15:restartNumberingAfterBreak="0">
     <w:nsid w:val="792F5E9D"/>
     <w:multiLevelType w:val="multilevel"/>
     <w:tmpl w:val="E7F4376E"/>
@@ -3409,7 +4181,7 @@
       </w:pPr>
     </w:lvl>
   </w:abstractNum>
-  <w:abstractNum w:abstractNumId="9" w15:restartNumberingAfterBreak="0">
+  <w:abstractNum w:abstractNumId="12" w15:restartNumberingAfterBreak="0">
     <w:nsid w:val="7B4716A6"/>
     <w:multiLevelType w:val="multilevel"/>
     <w:tmpl w:val="278EEFD2"/>
@@ -3523,16 +4295,16 @@
     </w:lvl>
   </w:abstractNum>
   <w:num w:numId="1" w16cid:durableId="2024284251">
-    <w:abstractNumId w:val="7"/>
+    <w:abstractNumId w:val="10"/>
   </w:num>
   <w:num w:numId="2" w16cid:durableId="1812818526">
-    <w:abstractNumId w:val="9"/>
+    <w:abstractNumId w:val="12"/>
   </w:num>
   <w:num w:numId="3" w16cid:durableId="1658997453">
-    <w:abstractNumId w:val="8"/>
+    <w:abstractNumId w:val="11"/>
   </w:num>
   <w:num w:numId="4" w16cid:durableId="1519930189">
-    <w:abstractNumId w:val="6"/>
+    <w:abstractNumId w:val="8"/>
   </w:num>
   <w:num w:numId="5" w16cid:durableId="244076204">
     <w:abstractNumId w:val="4"/>
@@ -3547,10 +4319,19 @@
     <w:abstractNumId w:val="0"/>
   </w:num>
   <w:num w:numId="9" w16cid:durableId="925380167">
-    <w:abstractNumId w:val="5"/>
+    <w:abstractNumId w:val="6"/>
   </w:num>
   <w:num w:numId="10" w16cid:durableId="1725911660">
     <w:abstractNumId w:val="2"/>
+  </w:num>
+  <w:num w:numId="11" w16cid:durableId="1966696107">
+    <w:abstractNumId w:val="9"/>
+  </w:num>
+  <w:num w:numId="12" w16cid:durableId="1217662000">
+    <w:abstractNumId w:val="5"/>
+  </w:num>
+  <w:num w:numId="13" w16cid:durableId="1170875554">
+    <w:abstractNumId w:val="7"/>
   </w:num>
 </w:numbering>
 </file>
@@ -4158,7 +4939,6 @@
   <w:style w:type="character" w:default="1" w:styleId="Fuentedeprrafopredeter">
     <w:name w:val="Default Paragraph Font"/>
     <w:uiPriority w:val="1"/>
-    <w:semiHidden/>
     <w:unhideWhenUsed/>
   </w:style>
   <w:style w:type="table" w:default="1" w:styleId="Tablanormal">

</xml_diff>

<commit_message>
final commit con paso a paso
</commit_message>
<xml_diff>
--- a/El lenguaje de php y su historia.docx
+++ b/El lenguaje de php y su historia.docx
@@ -2492,6 +2492,448 @@
     </w:p>
     <w:p/>
     <w:p/>
+    <w:p>
+      <w:r>
+        <w:br w:type="page"/>
+      </w:r>
+    </w:p>
+    <w:p>
+      <w:pPr>
+        <w:rPr>
+          <w:b/>
+          <w:bCs/>
+          <w:lang w:val="es-MX"/>
+        </w:rPr>
+      </w:pPr>
+      <w:r>
+        <w:rPr>
+          <w:b/>
+          <w:bCs/>
+          <w:lang w:val="es-MX"/>
+        </w:rPr>
+        <w:lastRenderedPageBreak/>
+        <w:t>Usos en la vida real</w:t>
+      </w:r>
+    </w:p>
+    <w:p>
+      <w:r>
+        <w:t xml:space="preserve">¿Qué podría suceder si se utiliza PHP en la vida cotidiana? Hay muchas situaciones que podrían ser tratadas en la vida real </w:t>
+      </w:r>
+      <w:proofErr w:type="gramStart"/>
+      <w:r>
+        <w:t>como</w:t>
+      </w:r>
+      <w:proofErr w:type="gramEnd"/>
+      <w:r>
+        <w:t xml:space="preserve"> por ejemplo:</w:t>
+      </w:r>
+    </w:p>
+    <w:p>
+      <w:r>
+        <w:br/>
+      </w:r>
+      <w:r>
+        <w:rPr>
+          <w:b/>
+          <w:bCs/>
+        </w:rPr>
+        <w:t>1. Tratamiento de datos del usuario</w:t>
+      </w:r>
+    </w:p>
+    <w:p>
+      <w:r>
+        <w:t>Recibe la información y los verifica.</w:t>
+      </w:r>
+      <w:r>
+        <w:br/>
+        <w:t>Determina qué hacer con ellos (almacenarlos, mostrar un error o redirigirlos). Qué podría suceder:</w:t>
+      </w:r>
+    </w:p>
+    <w:p>
+      <w:pPr>
+        <w:numPr>
+          <w:ilvl w:val="0"/>
+          <w:numId w:val="14"/>
+        </w:numPr>
+      </w:pPr>
+      <w:r>
+        <w:rPr>
+          <w:b/>
+          <w:bCs/>
+        </w:rPr>
+        <w:t>Datos correctos:</w:t>
+      </w:r>
+      <w:r>
+        <w:t xml:space="preserve"> Se almacenan en la base de datos. </w:t>
+      </w:r>
+    </w:p>
+    <w:p>
+      <w:pPr>
+        <w:numPr>
+          <w:ilvl w:val="0"/>
+          <w:numId w:val="14"/>
+        </w:numPr>
+      </w:pPr>
+      <w:r>
+        <w:rPr>
+          <w:b/>
+          <w:bCs/>
+        </w:rPr>
+        <w:t>Datos incompletos:</w:t>
+      </w:r>
+      <w:r>
+        <w:t xml:space="preserve"> PHP enseña un mensaje de error.</w:t>
+      </w:r>
+    </w:p>
+    <w:p>
+      <w:pPr>
+        <w:numPr>
+          <w:ilvl w:val="0"/>
+          <w:numId w:val="14"/>
+        </w:numPr>
+      </w:pPr>
+      <w:r>
+        <w:rPr>
+          <w:b/>
+          <w:bCs/>
+        </w:rPr>
+        <w:t>Datos maliciosos:</w:t>
+      </w:r>
+      <w:r>
+        <w:t xml:space="preserve"> si no se valida adecuadamente, pueden ocurrir ataques (como la inyección SQL).</w:t>
+      </w:r>
+    </w:p>
+    <w:p/>
+    <w:p>
+      <w:r>
+        <w:rPr>
+          <w:b/>
+          <w:bCs/>
+        </w:rPr>
+        <w:t>2. Fallas frecuentes en aplicaciones reales</w:t>
+      </w:r>
+    </w:p>
+    <w:p>
+      <w:r>
+        <w:t xml:space="preserve">En la labor con PHP pueden suceder: </w:t>
+      </w:r>
+    </w:p>
+    <w:p>
+      <w:pPr>
+        <w:numPr>
+          <w:ilvl w:val="0"/>
+          <w:numId w:val="15"/>
+        </w:numPr>
+      </w:pPr>
+      <w:r>
+        <w:t>Variables sin definir.</w:t>
+      </w:r>
+    </w:p>
+    <w:p>
+      <w:pPr>
+        <w:numPr>
+          <w:ilvl w:val="0"/>
+          <w:numId w:val="15"/>
+        </w:numPr>
+      </w:pPr>
+      <w:r>
+        <w:t>La conexión a la base de datos ha fallado.</w:t>
+      </w:r>
+    </w:p>
+    <w:p>
+      <w:pPr>
+        <w:numPr>
+          <w:ilvl w:val="0"/>
+          <w:numId w:val="15"/>
+        </w:numPr>
+      </w:pPr>
+      <w:r>
+        <w:t>Fallas lógicas (contraseña incorrecta, usuario equivocado).</w:t>
+      </w:r>
+    </w:p>
+    <w:p>
+      <w:pPr>
+        <w:numPr>
+          <w:ilvl w:val="0"/>
+          <w:numId w:val="15"/>
+        </w:numPr>
+      </w:pPr>
+      <w:r>
+        <w:t>Páginas vacías debido a fallas de sintaxis.</w:t>
+      </w:r>
+    </w:p>
+    <w:p>
+      <w:r>
+        <w:t>Por esta razón, en el entorno laboral es fundamental:</w:t>
+      </w:r>
+    </w:p>
+    <w:p>
+      <w:pPr>
+        <w:numPr>
+          <w:ilvl w:val="0"/>
+          <w:numId w:val="16"/>
+        </w:numPr>
+      </w:pPr>
+      <w:r>
+        <w:t>Verificar los datos.</w:t>
+      </w:r>
+    </w:p>
+    <w:p>
+      <w:pPr>
+        <w:numPr>
+          <w:ilvl w:val="0"/>
+          <w:numId w:val="16"/>
+        </w:numPr>
+      </w:pPr>
+      <w:r>
+        <w:t>Gestionar fallos.</w:t>
+      </w:r>
+    </w:p>
+    <w:p>
+      <w:pPr>
+        <w:numPr>
+          <w:ilvl w:val="0"/>
+          <w:numId w:val="16"/>
+        </w:numPr>
+      </w:pPr>
+      <w:r>
+        <w:t>Antes de divulgar el sistema, se debe probar.</w:t>
+      </w:r>
+    </w:p>
+    <w:p/>
+    <w:p>
+      <w:r>
+        <w:br w:type="page"/>
+      </w:r>
+    </w:p>
+    <w:p>
+      <w:pPr>
+        <w:rPr>
+          <w:b/>
+          <w:bCs/>
+        </w:rPr>
+      </w:pPr>
+      <w:r>
+        <w:rPr>
+          <w:b/>
+          <w:bCs/>
+        </w:rPr>
+        <w:lastRenderedPageBreak/>
+        <w:t>3. Automatización de procesos</w:t>
+      </w:r>
+    </w:p>
+    <w:p>
+      <w:r>
+        <w:t>En empresas, PHP puede:</w:t>
+      </w:r>
+    </w:p>
+    <w:p>
+      <w:pPr>
+        <w:numPr>
+          <w:ilvl w:val="0"/>
+          <w:numId w:val="17"/>
+        </w:numPr>
+      </w:pPr>
+      <w:r>
+        <w:t>Registrar ventas automáticamente.</w:t>
+      </w:r>
+    </w:p>
+    <w:p>
+      <w:pPr>
+        <w:numPr>
+          <w:ilvl w:val="0"/>
+          <w:numId w:val="17"/>
+        </w:numPr>
+      </w:pPr>
+      <w:r>
+        <w:t>Calcular totales.</w:t>
+      </w:r>
+    </w:p>
+    <w:p>
+      <w:pPr>
+        <w:numPr>
+          <w:ilvl w:val="0"/>
+          <w:numId w:val="17"/>
+        </w:numPr>
+      </w:pPr>
+      <w:r>
+        <w:t>Generar reportes.</w:t>
+      </w:r>
+    </w:p>
+    <w:p>
+      <w:pPr>
+        <w:numPr>
+          <w:ilvl w:val="0"/>
+          <w:numId w:val="17"/>
+        </w:numPr>
+      </w:pPr>
+      <w:r>
+        <w:t>Enviar correos automáticos.</w:t>
+      </w:r>
+    </w:p>
+    <w:p>
+      <w:r>
+        <w:t>Esto reduce errores humanos y ahorra tiempo.</w:t>
+      </w:r>
+    </w:p>
+    <w:p/>
+    <w:p>
+      <w:pPr>
+        <w:rPr>
+          <w:b/>
+          <w:bCs/>
+        </w:rPr>
+      </w:pPr>
+      <w:r>
+        <w:rPr>
+          <w:b/>
+          <w:bCs/>
+        </w:rPr>
+        <w:t>Ejemplo práctico en código PHP</w:t>
+      </w:r>
+    </w:p>
+    <w:p>
+      <w:r>
+        <w:t>Caso real: formulario de inicio de sesión sencillo.</w:t>
+      </w:r>
+    </w:p>
+    <w:p>
+      <w:r>
+        <w:drawing>
+          <wp:inline distT="0" distB="0" distL="0" distR="0">
+            <wp:extent cx="5610225" cy="3752850"/>
+            <wp:effectExtent l="0" t="0" r="9525" b="0"/>
+            <wp:docPr id="867806537" name="Imagen 2" descr="Texto&#10;&#10;Descripción generada automáticamente"/>
+            <wp:cNvGraphicFramePr>
+              <a:graphicFrameLocks xmlns:a="http://schemas.openxmlformats.org/drawingml/2006/main" noChangeAspect="1"/>
+            </wp:cNvGraphicFramePr>
+            <a:graphic xmlns:a="http://schemas.openxmlformats.org/drawingml/2006/main">
+              <a:graphicData uri="http://schemas.openxmlformats.org/drawingml/2006/picture">
+                <pic:pic xmlns:pic="http://schemas.openxmlformats.org/drawingml/2006/picture">
+                  <pic:nvPicPr>
+                    <pic:cNvPr id="0" name="Imagen 1" descr="Texto&#10;&#10;Descripción generada automáticamente"/>
+                    <pic:cNvPicPr>
+                      <a:picLocks noChangeAspect="1" noChangeArrowheads="1"/>
+                    </pic:cNvPicPr>
+                  </pic:nvPicPr>
+                  <pic:blipFill>
+                    <a:blip r:embed="rId15" cstate="print">
+                      <a:extLst>
+                        <a:ext uri="{28A0092B-C50C-407E-A947-70E740481C1C}">
+                          <a14:useLocalDpi xmlns:a14="http://schemas.microsoft.com/office/drawing/2010/main" val="0"/>
+                        </a:ext>
+                      </a:extLst>
+                    </a:blip>
+                    <a:srcRect/>
+                    <a:stretch>
+                      <a:fillRect/>
+                    </a:stretch>
+                  </pic:blipFill>
+                  <pic:spPr bwMode="auto">
+                    <a:xfrm>
+                      <a:off x="0" y="0"/>
+                      <a:ext cx="5610225" cy="3752850"/>
+                    </a:xfrm>
+                    <a:prstGeom prst="rect">
+                      <a:avLst/>
+                    </a:prstGeom>
+                    <a:noFill/>
+                    <a:ln>
+                      <a:noFill/>
+                    </a:ln>
+                  </pic:spPr>
+                </pic:pic>
+              </a:graphicData>
+            </a:graphic>
+          </wp:inline>
+        </w:drawing>
+      </w:r>
+    </w:p>
+    <w:p>
+      <w:pPr>
+        <w:rPr>
+          <w:b/>
+          <w:bCs/>
+        </w:rPr>
+      </w:pPr>
+      <w:r>
+        <w:rPr>
+          <w:b/>
+          <w:bCs/>
+        </w:rPr>
+        <w:t>¿Qué ocurre en este código?</w:t>
+      </w:r>
+    </w:p>
+    <w:p>
+      <w:pPr>
+        <w:numPr>
+          <w:ilvl w:val="0"/>
+          <w:numId w:val="18"/>
+        </w:numPr>
+      </w:pPr>
+      <w:r>
+        <w:t>PHP recibe los datos del formulario ($_POST).</w:t>
+      </w:r>
+    </w:p>
+    <w:p>
+      <w:pPr>
+        <w:numPr>
+          <w:ilvl w:val="0"/>
+          <w:numId w:val="18"/>
+        </w:numPr>
+      </w:pPr>
+      <w:r>
+        <w:t>Compara los valores ingresados.</w:t>
+      </w:r>
+    </w:p>
+    <w:p>
+      <w:pPr>
+        <w:numPr>
+          <w:ilvl w:val="0"/>
+          <w:numId w:val="18"/>
+        </w:numPr>
+      </w:pPr>
+      <w:r>
+        <w:t>Decide:</w:t>
+      </w:r>
+    </w:p>
+    <w:p>
+      <w:pPr>
+        <w:numPr>
+          <w:ilvl w:val="0"/>
+          <w:numId w:val="19"/>
+        </w:numPr>
+      </w:pPr>
+      <w:r>
+        <w:rPr>
+          <w:b/>
+          <w:bCs/>
+        </w:rPr>
+        <w:lastRenderedPageBreak/>
+        <w:t>Si son correctos:</w:t>
+      </w:r>
+      <w:r>
+        <w:t xml:space="preserve"> permite el acceso.</w:t>
+      </w:r>
+    </w:p>
+    <w:p>
+      <w:pPr>
+        <w:numPr>
+          <w:ilvl w:val="0"/>
+          <w:numId w:val="19"/>
+        </w:numPr>
+      </w:pPr>
+      <w:r>
+        <w:rPr>
+          <w:b/>
+          <w:bCs/>
+        </w:rPr>
+        <w:t>Si no:</w:t>
+      </w:r>
+      <w:r>
+        <w:t xml:space="preserve"> muestra un error.</w:t>
+      </w:r>
+    </w:p>
     <w:p/>
     <w:p/>
     <w:p/>
@@ -2499,422 +2941,436 @@
     <w:p/>
     <w:p/>
     <w:p/>
+    <w:p>
+      <w:pPr>
+        <w:rPr>
+          <w:rFonts w:ascii="Arial Black" w:hAnsi="Arial Black"/>
+          <w:b/>
+          <w:bCs/>
+          <w:sz w:val="28"/>
+          <w:szCs w:val="28"/>
+        </w:rPr>
+      </w:pPr>
+      <w:r>
+        <w:rPr>
+          <w:rFonts w:ascii="Arial Black" w:hAnsi="Arial Black"/>
+          <w:b/>
+          <w:bCs/>
+          <w:sz w:val="28"/>
+          <w:szCs w:val="28"/>
+        </w:rPr>
+        <w:br w:type="page"/>
+      </w:r>
+    </w:p>
+    <w:p>
+      <w:pPr>
+        <w:jc w:val="center"/>
+        <w:rPr>
+          <w:rFonts w:ascii="Arial Black" w:hAnsi="Arial Black"/>
+          <w:b/>
+          <w:bCs/>
+          <w:sz w:val="28"/>
+          <w:szCs w:val="28"/>
+        </w:rPr>
+      </w:pPr>
+      <w:r>
+        <w:rPr>
+          <w:rFonts w:ascii="Arial Black" w:hAnsi="Arial Black"/>
+          <w:b/>
+          <w:bCs/>
+          <w:sz w:val="28"/>
+          <w:szCs w:val="28"/>
+        </w:rPr>
+        <w:lastRenderedPageBreak/>
+        <w:t>Ejercicio Trello</w:t>
+      </w:r>
+    </w:p>
+    <w:p/>
+    <w:p>
+      <w:pPr>
+        <w:jc w:val="center"/>
+        <w:rPr>
+          <w:rFonts w:ascii="Arial" w:hAnsi="Arial" w:cs="Arial"/>
+          <w:b/>
+          <w:bCs/>
+        </w:rPr>
+      </w:pPr>
+      <w:r>
+        <w:rPr>
+          <w:rFonts w:ascii="Arial" w:hAnsi="Arial" w:cs="Arial"/>
+          <w:b/>
+          <w:bCs/>
+        </w:rPr>
+        <w:t>CENTRO EDUCATIVO TECNICO LABORAL KINAL</w:t>
+      </w:r>
+    </w:p>
+    <w:p>
+      <w:pPr>
+        <w:rPr>
+          <w:rFonts w:ascii="Arial" w:hAnsi="Arial" w:cs="Arial"/>
+          <w:b/>
+          <w:bCs/>
+          <w:sz w:val="32"/>
+          <w:szCs w:val="32"/>
+        </w:rPr>
+      </w:pPr>
+    </w:p>
+    <w:p>
+      <w:pPr>
+        <w:rPr>
+          <w:rFonts w:ascii="Arial" w:hAnsi="Arial" w:cs="Arial"/>
+          <w:b/>
+          <w:bCs/>
+          <w:sz w:val="32"/>
+          <w:szCs w:val="32"/>
+        </w:rPr>
+      </w:pPr>
+      <w:r>
+        <w:rPr>
+          <w:rFonts w:ascii="Arial" w:hAnsi="Arial" w:cs="Arial"/>
+          <w:b/>
+          <w:bCs/>
+          <w:sz w:val="32"/>
+          <w:szCs w:val="32"/>
+        </w:rPr>
+        <w:t>Prof. Alejandro Max</w:t>
+      </w:r>
+    </w:p>
+    <w:p>
+      <w:pPr>
+        <w:rPr>
+          <w:rFonts w:ascii="Arial" w:hAnsi="Arial" w:cs="Arial"/>
+          <w:b/>
+          <w:bCs/>
+          <w:sz w:val="32"/>
+          <w:szCs w:val="32"/>
+        </w:rPr>
+      </w:pPr>
+      <w:r>
+        <w:rPr>
+          <w:rFonts w:ascii="Arial" w:hAnsi="Arial" w:cs="Arial"/>
+          <w:b/>
+          <w:bCs/>
+          <w:sz w:val="32"/>
+          <w:szCs w:val="32"/>
+        </w:rPr>
+        <w:t>Tecnología II</w:t>
+      </w:r>
+    </w:p>
+    <w:p>
+      <w:pPr>
+        <w:jc w:val="center"/>
+        <w:rPr>
+          <w:rFonts w:ascii="Arial" w:hAnsi="Arial" w:cs="Arial"/>
+          <w:b/>
+          <w:bCs/>
+          <w:sz w:val="32"/>
+          <w:szCs w:val="32"/>
+        </w:rPr>
+      </w:pPr>
+    </w:p>
+    <w:p>
+      <w:pPr>
+        <w:jc w:val="center"/>
+        <w:rPr>
+          <w:rFonts w:ascii="Arial" w:hAnsi="Arial" w:cs="Arial"/>
+          <w:b/>
+          <w:bCs/>
+          <w:sz w:val="32"/>
+          <w:szCs w:val="32"/>
+        </w:rPr>
+      </w:pPr>
+    </w:p>
+    <w:p>
+      <w:pPr>
+        <w:jc w:val="center"/>
+        <w:rPr>
+          <w:rFonts w:ascii="Arial" w:hAnsi="Arial" w:cs="Arial"/>
+          <w:b/>
+          <w:bCs/>
+          <w:sz w:val="32"/>
+          <w:szCs w:val="32"/>
+        </w:rPr>
+      </w:pPr>
+    </w:p>
+    <w:p>
+      <w:pPr>
+        <w:jc w:val="center"/>
+        <w:rPr>
+          <w:rFonts w:ascii="Arial" w:hAnsi="Arial" w:cs="Arial"/>
+          <w:b/>
+          <w:bCs/>
+          <w:sz w:val="32"/>
+          <w:szCs w:val="32"/>
+        </w:rPr>
+      </w:pPr>
+    </w:p>
+    <w:p>
+      <w:pPr>
+        <w:jc w:val="center"/>
+        <w:rPr>
+          <w:rFonts w:ascii="Arial" w:hAnsi="Arial" w:cs="Arial"/>
+          <w:b/>
+          <w:bCs/>
+          <w:sz w:val="32"/>
+          <w:szCs w:val="32"/>
+        </w:rPr>
+      </w:pPr>
+    </w:p>
+    <w:p>
+      <w:pPr>
+        <w:jc w:val="center"/>
+        <w:rPr>
+          <w:rFonts w:ascii="Arial" w:hAnsi="Arial" w:cs="Arial"/>
+          <w:b/>
+          <w:bCs/>
+          <w:sz w:val="48"/>
+          <w:szCs w:val="48"/>
+        </w:rPr>
+      </w:pPr>
+      <w:r>
+        <w:rPr>
+          <w:rFonts w:ascii="Arial" w:hAnsi="Arial" w:cs="Arial"/>
+          <w:b/>
+          <w:bCs/>
+          <w:sz w:val="48"/>
+          <w:szCs w:val="48"/>
+        </w:rPr>
+        <w:t xml:space="preserve">El lenguaje de </w:t>
+      </w:r>
+      <w:proofErr w:type="spellStart"/>
+      <w:r>
+        <w:rPr>
+          <w:rFonts w:ascii="Arial" w:hAnsi="Arial" w:cs="Arial"/>
+          <w:b/>
+          <w:bCs/>
+          <w:sz w:val="48"/>
+          <w:szCs w:val="48"/>
+        </w:rPr>
+        <w:t>php</w:t>
+      </w:r>
+      <w:proofErr w:type="spellEnd"/>
+      <w:r>
+        <w:rPr>
+          <w:rFonts w:ascii="Arial" w:hAnsi="Arial" w:cs="Arial"/>
+          <w:b/>
+          <w:bCs/>
+          <w:sz w:val="48"/>
+          <w:szCs w:val="48"/>
+        </w:rPr>
+        <w:t xml:space="preserve"> y su historia</w:t>
+      </w:r>
+    </w:p>
+    <w:p>
+      <w:pPr>
+        <w:jc w:val="center"/>
+        <w:rPr>
+          <w:rFonts w:ascii="Arial" w:hAnsi="Arial" w:cs="Arial"/>
+          <w:b/>
+          <w:bCs/>
+          <w:sz w:val="32"/>
+          <w:szCs w:val="32"/>
+        </w:rPr>
+      </w:pPr>
+    </w:p>
+    <w:p>
+      <w:pPr>
+        <w:jc w:val="center"/>
+        <w:rPr>
+          <w:rFonts w:ascii="Arial" w:hAnsi="Arial" w:cs="Arial"/>
+          <w:b/>
+          <w:bCs/>
+          <w:sz w:val="32"/>
+          <w:szCs w:val="32"/>
+        </w:rPr>
+      </w:pPr>
+    </w:p>
+    <w:p>
+      <w:pPr>
+        <w:jc w:val="center"/>
+        <w:rPr>
+          <w:rFonts w:ascii="Arial" w:hAnsi="Arial" w:cs="Arial"/>
+          <w:b/>
+          <w:bCs/>
+          <w:sz w:val="32"/>
+          <w:szCs w:val="32"/>
+        </w:rPr>
+      </w:pPr>
+    </w:p>
+    <w:p>
+      <w:pPr>
+        <w:jc w:val="center"/>
+        <w:rPr>
+          <w:rFonts w:ascii="Arial" w:hAnsi="Arial" w:cs="Arial"/>
+          <w:b/>
+          <w:bCs/>
+          <w:sz w:val="32"/>
+          <w:szCs w:val="32"/>
+        </w:rPr>
+      </w:pPr>
+    </w:p>
+    <w:p>
+      <w:pPr>
+        <w:rPr>
+          <w:rFonts w:ascii="Arial" w:hAnsi="Arial" w:cs="Arial"/>
+          <w:b/>
+          <w:bCs/>
+          <w:sz w:val="32"/>
+          <w:szCs w:val="32"/>
+        </w:rPr>
+      </w:pPr>
+    </w:p>
+    <w:p>
+      <w:pPr>
+        <w:tabs>
+          <w:tab w:val="left" w:pos="7740"/>
+        </w:tabs>
+        <w:rPr>
+          <w:rFonts w:ascii="Arial" w:hAnsi="Arial" w:cs="Arial"/>
+          <w:sz w:val="28"/>
+          <w:szCs w:val="28"/>
+        </w:rPr>
+      </w:pPr>
+    </w:p>
+    <w:p>
+      <w:pPr>
+        <w:jc w:val="right"/>
+        <w:rPr>
+          <w:rFonts w:ascii="Arial" w:hAnsi="Arial" w:cs="Arial"/>
+          <w:sz w:val="28"/>
+          <w:szCs w:val="28"/>
+        </w:rPr>
+      </w:pPr>
+      <w:r>
+        <w:rPr>
+          <w:rFonts w:ascii="Arial" w:hAnsi="Arial" w:cs="Arial"/>
+          <w:sz w:val="28"/>
+          <w:szCs w:val="28"/>
+        </w:rPr>
+        <w:t>Participantes:</w:t>
+      </w:r>
+    </w:p>
+    <w:p>
+      <w:pPr>
+        <w:jc w:val="right"/>
+        <w:rPr>
+          <w:rFonts w:ascii="Arial" w:hAnsi="Arial" w:cs="Arial"/>
+          <w:sz w:val="28"/>
+          <w:szCs w:val="28"/>
+        </w:rPr>
+      </w:pPr>
+      <w:r>
+        <w:rPr>
+          <w:rFonts w:ascii="Arial" w:hAnsi="Arial" w:cs="Arial"/>
+          <w:sz w:val="28"/>
+          <w:szCs w:val="28"/>
+        </w:rPr>
+        <w:t xml:space="preserve">Michael </w:t>
+      </w:r>
+      <w:proofErr w:type="spellStart"/>
+      <w:r>
+        <w:rPr>
+          <w:rFonts w:ascii="Arial" w:hAnsi="Arial" w:cs="Arial"/>
+          <w:sz w:val="28"/>
+          <w:szCs w:val="28"/>
+        </w:rPr>
+        <w:t>Yohardi</w:t>
+      </w:r>
+      <w:proofErr w:type="spellEnd"/>
+      <w:r>
+        <w:rPr>
+          <w:rFonts w:ascii="Arial" w:hAnsi="Arial" w:cs="Arial"/>
+          <w:sz w:val="28"/>
+          <w:szCs w:val="28"/>
+        </w:rPr>
+        <w:t xml:space="preserve"> Aquino Argueta</w:t>
+      </w:r>
+    </w:p>
+    <w:p>
+      <w:pPr>
+        <w:jc w:val="right"/>
+        <w:rPr>
+          <w:rFonts w:ascii="Arial" w:hAnsi="Arial" w:cs="Arial"/>
+          <w:sz w:val="28"/>
+          <w:szCs w:val="28"/>
+        </w:rPr>
+      </w:pPr>
+      <w:r>
+        <w:rPr>
+          <w:rFonts w:ascii="Arial" w:hAnsi="Arial" w:cs="Arial"/>
+          <w:sz w:val="28"/>
+          <w:szCs w:val="28"/>
+        </w:rPr>
+        <w:t xml:space="preserve">Edgar David Osorio </w:t>
+      </w:r>
+      <w:proofErr w:type="spellStart"/>
+      <w:r>
+        <w:rPr>
+          <w:rFonts w:ascii="Arial" w:hAnsi="Arial" w:cs="Arial"/>
+          <w:sz w:val="28"/>
+          <w:szCs w:val="28"/>
+        </w:rPr>
+        <w:t>Sis</w:t>
+      </w:r>
+      <w:proofErr w:type="spellEnd"/>
+    </w:p>
+    <w:p>
+      <w:pPr>
+        <w:jc w:val="right"/>
+        <w:rPr>
+          <w:rFonts w:ascii="Arial" w:hAnsi="Arial" w:cs="Arial"/>
+          <w:sz w:val="28"/>
+          <w:szCs w:val="28"/>
+        </w:rPr>
+      </w:pPr>
+      <w:r>
+        <w:rPr>
+          <w:rFonts w:ascii="Arial" w:hAnsi="Arial" w:cs="Arial"/>
+          <w:sz w:val="28"/>
+          <w:szCs w:val="28"/>
+        </w:rPr>
+        <w:t>Anderson Ricardo Jafet Gómez García</w:t>
+      </w:r>
+    </w:p>
+    <w:p>
+      <w:pPr>
+        <w:jc w:val="right"/>
+        <w:rPr>
+          <w:rFonts w:ascii="Arial" w:hAnsi="Arial" w:cs="Arial"/>
+          <w:sz w:val="28"/>
+          <w:szCs w:val="28"/>
+        </w:rPr>
+      </w:pPr>
+      <w:r>
+        <w:rPr>
+          <w:rFonts w:ascii="Arial" w:hAnsi="Arial" w:cs="Arial"/>
+          <w:sz w:val="28"/>
+          <w:szCs w:val="28"/>
+        </w:rPr>
+        <w:t xml:space="preserve">David Alejandro </w:t>
+      </w:r>
+      <w:proofErr w:type="spellStart"/>
+      <w:r>
+        <w:rPr>
+          <w:rFonts w:ascii="Arial" w:hAnsi="Arial" w:cs="Arial"/>
+          <w:sz w:val="28"/>
+          <w:szCs w:val="28"/>
+        </w:rPr>
+        <w:t>Toc</w:t>
+      </w:r>
+      <w:proofErr w:type="spellEnd"/>
+      <w:r>
+        <w:rPr>
+          <w:rFonts w:ascii="Arial" w:hAnsi="Arial" w:cs="Arial"/>
+          <w:sz w:val="28"/>
+          <w:szCs w:val="28"/>
+        </w:rPr>
+        <w:t xml:space="preserve"> Orozco</w:t>
+      </w:r>
+    </w:p>
     <w:p/>
     <w:p/>
     <w:p/>
-    <w:p/>
-    <w:p/>
-    <w:p/>
-    <w:p/>
-    <w:p>
-      <w:pPr>
-        <w:jc w:val="center"/>
-        <w:rPr>
-          <w:rFonts w:ascii="Arial Black" w:hAnsi="Arial Black"/>
-          <w:b/>
-          <w:bCs/>
-          <w:sz w:val="28"/>
-          <w:szCs w:val="28"/>
-        </w:rPr>
-      </w:pPr>
-      <w:r>
-        <w:rPr>
-          <w:rFonts w:ascii="Arial Black" w:hAnsi="Arial Black"/>
-          <w:b/>
-          <w:bCs/>
-          <w:sz w:val="28"/>
-          <w:szCs w:val="28"/>
-        </w:rPr>
-        <w:lastRenderedPageBreak/>
-        <w:t>Ejercicio Trello</w:t>
-      </w:r>
-    </w:p>
-    <w:p/>
-    <w:p>
-      <w:pPr>
-        <w:jc w:val="center"/>
-        <w:rPr>
-          <w:rFonts w:ascii="Arial" w:hAnsi="Arial" w:cs="Arial"/>
-          <w:b/>
-          <w:bCs/>
-        </w:rPr>
-      </w:pPr>
-      <w:r>
-        <w:rPr>
-          <w:rFonts w:ascii="Arial" w:hAnsi="Arial" w:cs="Arial"/>
-          <w:b/>
-          <w:bCs/>
-        </w:rPr>
-        <w:t>CENTRO EDUCATIVO TECNICO LABORAL KINAL</w:t>
-      </w:r>
-    </w:p>
-    <w:p>
-      <w:pPr>
-        <w:rPr>
-          <w:rFonts w:ascii="Arial" w:hAnsi="Arial" w:cs="Arial"/>
-          <w:b/>
-          <w:bCs/>
-          <w:sz w:val="32"/>
-          <w:szCs w:val="32"/>
-        </w:rPr>
-      </w:pPr>
-    </w:p>
-    <w:p>
-      <w:pPr>
-        <w:rPr>
-          <w:rFonts w:ascii="Arial" w:hAnsi="Arial" w:cs="Arial"/>
-          <w:b/>
-          <w:bCs/>
-          <w:sz w:val="32"/>
-          <w:szCs w:val="32"/>
-        </w:rPr>
-      </w:pPr>
-      <w:r>
-        <w:rPr>
-          <w:rFonts w:ascii="Arial" w:hAnsi="Arial" w:cs="Arial"/>
-          <w:b/>
-          <w:bCs/>
-          <w:sz w:val="32"/>
-          <w:szCs w:val="32"/>
-        </w:rPr>
-        <w:t>Prof. Alejandro Max</w:t>
-      </w:r>
-    </w:p>
-    <w:p>
-      <w:pPr>
-        <w:rPr>
-          <w:rFonts w:ascii="Arial" w:hAnsi="Arial" w:cs="Arial"/>
-          <w:b/>
-          <w:bCs/>
-          <w:sz w:val="32"/>
-          <w:szCs w:val="32"/>
-        </w:rPr>
-      </w:pPr>
-      <w:r>
-        <w:rPr>
-          <w:rFonts w:ascii="Arial" w:hAnsi="Arial" w:cs="Arial"/>
-          <w:b/>
-          <w:bCs/>
-          <w:sz w:val="32"/>
-          <w:szCs w:val="32"/>
-        </w:rPr>
-        <w:t>Tecnología II</w:t>
-      </w:r>
-    </w:p>
-    <w:p>
-      <w:pPr>
-        <w:jc w:val="center"/>
-        <w:rPr>
-          <w:rFonts w:ascii="Arial" w:hAnsi="Arial" w:cs="Arial"/>
-          <w:b/>
-          <w:bCs/>
-          <w:sz w:val="32"/>
-          <w:szCs w:val="32"/>
-        </w:rPr>
-      </w:pPr>
-    </w:p>
-    <w:p>
-      <w:pPr>
-        <w:jc w:val="center"/>
-        <w:rPr>
-          <w:rFonts w:ascii="Arial" w:hAnsi="Arial" w:cs="Arial"/>
-          <w:b/>
-          <w:bCs/>
-          <w:sz w:val="32"/>
-          <w:szCs w:val="32"/>
-        </w:rPr>
-      </w:pPr>
-    </w:p>
-    <w:p>
-      <w:pPr>
-        <w:jc w:val="center"/>
-        <w:rPr>
-          <w:rFonts w:ascii="Arial" w:hAnsi="Arial" w:cs="Arial"/>
-          <w:b/>
-          <w:bCs/>
-          <w:sz w:val="32"/>
-          <w:szCs w:val="32"/>
-        </w:rPr>
-      </w:pPr>
-    </w:p>
-    <w:p>
-      <w:pPr>
-        <w:jc w:val="center"/>
-        <w:rPr>
-          <w:rFonts w:ascii="Arial" w:hAnsi="Arial" w:cs="Arial"/>
-          <w:b/>
-          <w:bCs/>
-          <w:sz w:val="32"/>
-          <w:szCs w:val="32"/>
-        </w:rPr>
-      </w:pPr>
-    </w:p>
-    <w:p>
-      <w:pPr>
-        <w:jc w:val="center"/>
-        <w:rPr>
-          <w:rFonts w:ascii="Arial" w:hAnsi="Arial" w:cs="Arial"/>
-          <w:b/>
-          <w:bCs/>
-          <w:sz w:val="32"/>
-          <w:szCs w:val="32"/>
-        </w:rPr>
-      </w:pPr>
-    </w:p>
-    <w:p>
-      <w:pPr>
-        <w:jc w:val="center"/>
-        <w:rPr>
-          <w:rFonts w:ascii="Arial" w:hAnsi="Arial" w:cs="Arial"/>
-          <w:b/>
-          <w:bCs/>
-          <w:sz w:val="48"/>
-          <w:szCs w:val="48"/>
-        </w:rPr>
-      </w:pPr>
-      <w:r>
-        <w:rPr>
-          <w:rFonts w:ascii="Arial" w:hAnsi="Arial" w:cs="Arial"/>
-          <w:b/>
-          <w:bCs/>
-          <w:sz w:val="48"/>
-          <w:szCs w:val="48"/>
-        </w:rPr>
-        <w:t xml:space="preserve">El lenguaje de </w:t>
-      </w:r>
-      <w:proofErr w:type="spellStart"/>
-      <w:r>
-        <w:rPr>
-          <w:rFonts w:ascii="Arial" w:hAnsi="Arial" w:cs="Arial"/>
-          <w:b/>
-          <w:bCs/>
-          <w:sz w:val="48"/>
-          <w:szCs w:val="48"/>
-        </w:rPr>
-        <w:t>php</w:t>
-      </w:r>
-      <w:proofErr w:type="spellEnd"/>
-      <w:r>
-        <w:rPr>
-          <w:rFonts w:ascii="Arial" w:hAnsi="Arial" w:cs="Arial"/>
-          <w:b/>
-          <w:bCs/>
-          <w:sz w:val="48"/>
-          <w:szCs w:val="48"/>
-        </w:rPr>
-        <w:t xml:space="preserve"> y su historia</w:t>
-      </w:r>
-    </w:p>
-    <w:p>
-      <w:pPr>
-        <w:jc w:val="center"/>
-        <w:rPr>
-          <w:rFonts w:ascii="Arial" w:hAnsi="Arial" w:cs="Arial"/>
-          <w:b/>
-          <w:bCs/>
-          <w:sz w:val="32"/>
-          <w:szCs w:val="32"/>
-        </w:rPr>
-      </w:pPr>
-    </w:p>
-    <w:p>
-      <w:pPr>
-        <w:jc w:val="center"/>
-        <w:rPr>
-          <w:rFonts w:ascii="Arial" w:hAnsi="Arial" w:cs="Arial"/>
-          <w:b/>
-          <w:bCs/>
-          <w:sz w:val="32"/>
-          <w:szCs w:val="32"/>
-        </w:rPr>
-      </w:pPr>
-    </w:p>
-    <w:p>
-      <w:pPr>
-        <w:jc w:val="center"/>
-        <w:rPr>
-          <w:rFonts w:ascii="Arial" w:hAnsi="Arial" w:cs="Arial"/>
-          <w:b/>
-          <w:bCs/>
-          <w:sz w:val="32"/>
-          <w:szCs w:val="32"/>
-        </w:rPr>
-      </w:pPr>
-    </w:p>
-    <w:p>
-      <w:pPr>
-        <w:jc w:val="center"/>
-        <w:rPr>
-          <w:rFonts w:ascii="Arial" w:hAnsi="Arial" w:cs="Arial"/>
-          <w:b/>
-          <w:bCs/>
-          <w:sz w:val="32"/>
-          <w:szCs w:val="32"/>
-        </w:rPr>
-      </w:pPr>
-    </w:p>
-    <w:p>
-      <w:pPr>
-        <w:rPr>
-          <w:rFonts w:ascii="Arial" w:hAnsi="Arial" w:cs="Arial"/>
-          <w:b/>
-          <w:bCs/>
-          <w:sz w:val="32"/>
-          <w:szCs w:val="32"/>
-        </w:rPr>
-      </w:pPr>
-    </w:p>
-    <w:p>
-      <w:pPr>
-        <w:tabs>
-          <w:tab w:val="left" w:pos="7740"/>
-        </w:tabs>
-        <w:rPr>
-          <w:rFonts w:ascii="Arial" w:hAnsi="Arial" w:cs="Arial"/>
-          <w:sz w:val="28"/>
-          <w:szCs w:val="28"/>
-        </w:rPr>
-      </w:pPr>
-    </w:p>
-    <w:p>
-      <w:pPr>
-        <w:jc w:val="right"/>
-        <w:rPr>
-          <w:rFonts w:ascii="Arial" w:hAnsi="Arial" w:cs="Arial"/>
-          <w:sz w:val="28"/>
-          <w:szCs w:val="28"/>
-        </w:rPr>
-      </w:pPr>
-      <w:r>
-        <w:rPr>
-          <w:rFonts w:ascii="Arial" w:hAnsi="Arial" w:cs="Arial"/>
-          <w:sz w:val="28"/>
-          <w:szCs w:val="28"/>
-        </w:rPr>
-        <w:t>Participantes:</w:t>
-      </w:r>
-    </w:p>
-    <w:p>
-      <w:pPr>
-        <w:jc w:val="right"/>
-        <w:rPr>
-          <w:rFonts w:ascii="Arial" w:hAnsi="Arial" w:cs="Arial"/>
-          <w:sz w:val="28"/>
-          <w:szCs w:val="28"/>
-        </w:rPr>
-      </w:pPr>
-      <w:r>
-        <w:rPr>
-          <w:rFonts w:ascii="Arial" w:hAnsi="Arial" w:cs="Arial"/>
-          <w:sz w:val="28"/>
-          <w:szCs w:val="28"/>
-        </w:rPr>
-        <w:t xml:space="preserve">Michael </w:t>
-      </w:r>
-      <w:proofErr w:type="spellStart"/>
-      <w:r>
-        <w:rPr>
-          <w:rFonts w:ascii="Arial" w:hAnsi="Arial" w:cs="Arial"/>
-          <w:sz w:val="28"/>
-          <w:szCs w:val="28"/>
-        </w:rPr>
-        <w:t>Yohardi</w:t>
-      </w:r>
-      <w:proofErr w:type="spellEnd"/>
-      <w:r>
-        <w:rPr>
-          <w:rFonts w:ascii="Arial" w:hAnsi="Arial" w:cs="Arial"/>
-          <w:sz w:val="28"/>
-          <w:szCs w:val="28"/>
-        </w:rPr>
-        <w:t xml:space="preserve"> Aquino Argueta</w:t>
-      </w:r>
-    </w:p>
-    <w:p>
-      <w:pPr>
-        <w:jc w:val="right"/>
-        <w:rPr>
-          <w:rFonts w:ascii="Arial" w:hAnsi="Arial" w:cs="Arial"/>
-          <w:sz w:val="28"/>
-          <w:szCs w:val="28"/>
-        </w:rPr>
-      </w:pPr>
-      <w:r>
-        <w:rPr>
-          <w:rFonts w:ascii="Arial" w:hAnsi="Arial" w:cs="Arial"/>
-          <w:sz w:val="28"/>
-          <w:szCs w:val="28"/>
-        </w:rPr>
-        <w:t xml:space="preserve">Edgar David Osorio </w:t>
-      </w:r>
-      <w:proofErr w:type="spellStart"/>
-      <w:r>
-        <w:rPr>
-          <w:rFonts w:ascii="Arial" w:hAnsi="Arial" w:cs="Arial"/>
-          <w:sz w:val="28"/>
-          <w:szCs w:val="28"/>
-        </w:rPr>
-        <w:t>Sis</w:t>
-      </w:r>
-      <w:proofErr w:type="spellEnd"/>
-    </w:p>
-    <w:p>
-      <w:pPr>
-        <w:jc w:val="right"/>
-        <w:rPr>
-          <w:rFonts w:ascii="Arial" w:hAnsi="Arial" w:cs="Arial"/>
-          <w:sz w:val="28"/>
-          <w:szCs w:val="28"/>
-        </w:rPr>
-      </w:pPr>
-      <w:r>
-        <w:rPr>
-          <w:rFonts w:ascii="Arial" w:hAnsi="Arial" w:cs="Arial"/>
-          <w:sz w:val="28"/>
-          <w:szCs w:val="28"/>
-        </w:rPr>
-        <w:t>Anderson Ricardo Jafet Gómez García</w:t>
-      </w:r>
-    </w:p>
-    <w:p>
-      <w:pPr>
-        <w:jc w:val="right"/>
-        <w:rPr>
-          <w:rFonts w:ascii="Arial" w:hAnsi="Arial" w:cs="Arial"/>
-          <w:sz w:val="28"/>
-          <w:szCs w:val="28"/>
-        </w:rPr>
-      </w:pPr>
-      <w:r>
-        <w:rPr>
-          <w:rFonts w:ascii="Arial" w:hAnsi="Arial" w:cs="Arial"/>
-          <w:sz w:val="28"/>
-          <w:szCs w:val="28"/>
-        </w:rPr>
-        <w:t xml:space="preserve">David Alejandro </w:t>
-      </w:r>
-      <w:proofErr w:type="spellStart"/>
-      <w:r>
-        <w:rPr>
-          <w:rFonts w:ascii="Arial" w:hAnsi="Arial" w:cs="Arial"/>
-          <w:sz w:val="28"/>
-          <w:szCs w:val="28"/>
-        </w:rPr>
-        <w:t>Toc</w:t>
-      </w:r>
-      <w:proofErr w:type="spellEnd"/>
-      <w:r>
-        <w:rPr>
-          <w:rFonts w:ascii="Arial" w:hAnsi="Arial" w:cs="Arial"/>
-          <w:sz w:val="28"/>
-          <w:szCs w:val="28"/>
-        </w:rPr>
-        <w:t xml:space="preserve"> Orozco</w:t>
-      </w:r>
-    </w:p>
-    <w:p/>
-    <w:p/>
-    <w:p/>
     <w:p>
       <w:pPr>
         <w:jc w:val="center"/>
@@ -2951,6 +3407,9 @@
     </w:p>
     <w:p>
       <w:r>
+        <w:rPr>
+          <w:noProof/>
+        </w:rPr>
         <w:drawing>
           <wp:inline distT="0" distB="0" distL="0" distR="0" wp14:anchorId="2A5E0480" wp14:editId="73DF7897">
             <wp:extent cx="5612130" cy="3395345"/>
@@ -2967,7 +3426,7 @@
                     <pic:cNvPicPr/>
                   </pic:nvPicPr>
                   <pic:blipFill>
-                    <a:blip r:embed="rId15"/>
+                    <a:blip r:embed="rId16"/>
                     <a:stretch>
                       <a:fillRect/>
                     </a:stretch>
@@ -3048,6 +3507,9 @@
     <w:p/>
     <w:p>
       <w:r>
+        <w:rPr>
+          <w:noProof/>
+        </w:rPr>
         <w:drawing>
           <wp:inline distT="0" distB="0" distL="0" distR="0" wp14:anchorId="5F222DBE" wp14:editId="3D41B9A6">
             <wp:extent cx="5612130" cy="3585845"/>
@@ -3064,7 +3526,7 @@
                     <pic:cNvPicPr/>
                   </pic:nvPicPr>
                   <pic:blipFill>
-                    <a:blip r:embed="rId16"/>
+                    <a:blip r:embed="rId17"/>
                     <a:stretch>
                       <a:fillRect/>
                     </a:stretch>
@@ -3137,6 +3599,9 @@
     <w:p/>
     <w:p>
       <w:r>
+        <w:rPr>
+          <w:noProof/>
+        </w:rPr>
         <w:drawing>
           <wp:inline distT="0" distB="0" distL="0" distR="0" wp14:anchorId="1D7BF72A" wp14:editId="37C5C247">
             <wp:extent cx="5612130" cy="2223770"/>
@@ -3153,7 +3618,7 @@
                     <pic:cNvPicPr/>
                   </pic:nvPicPr>
                   <pic:blipFill>
-                    <a:blip r:embed="rId17"/>
+                    <a:blip r:embed="rId18"/>
                     <a:stretch>
                       <a:fillRect/>
                     </a:stretch>
@@ -3421,6 +3886,232 @@
     </w:lvl>
   </w:abstractNum>
   <w:abstractNum w:abstractNumId="1" w15:restartNumberingAfterBreak="0">
+    <w:nsid w:val="0A1D3538"/>
+    <w:multiLevelType w:val="hybridMultilevel"/>
+    <w:tmpl w:val="D5327D22"/>
+    <w:lvl w:ilvl="0" w:tplc="100A0001">
+      <w:start w:val="1"/>
+      <w:numFmt w:val="bullet"/>
+      <w:lvlText w:val=""/>
+      <w:lvlJc w:val="left"/>
+      <w:pPr>
+        <w:ind w:left="720" w:hanging="360"/>
+      </w:pPr>
+      <w:rPr>
+        <w:rFonts w:ascii="Symbol" w:hAnsi="Symbol" w:hint="default"/>
+      </w:rPr>
+    </w:lvl>
+    <w:lvl w:ilvl="1" w:tplc="100A0003">
+      <w:start w:val="1"/>
+      <w:numFmt w:val="bullet"/>
+      <w:lvlText w:val="o"/>
+      <w:lvlJc w:val="left"/>
+      <w:pPr>
+        <w:ind w:left="1440" w:hanging="360"/>
+      </w:pPr>
+      <w:rPr>
+        <w:rFonts w:ascii="Courier New" w:hAnsi="Courier New" w:cs="Courier New" w:hint="default"/>
+      </w:rPr>
+    </w:lvl>
+    <w:lvl w:ilvl="2" w:tplc="100A0005">
+      <w:start w:val="1"/>
+      <w:numFmt w:val="bullet"/>
+      <w:lvlText w:val=""/>
+      <w:lvlJc w:val="left"/>
+      <w:pPr>
+        <w:ind w:left="2160" w:hanging="360"/>
+      </w:pPr>
+      <w:rPr>
+        <w:rFonts w:ascii="Wingdings" w:hAnsi="Wingdings" w:hint="default"/>
+      </w:rPr>
+    </w:lvl>
+    <w:lvl w:ilvl="3" w:tplc="100A0001">
+      <w:start w:val="1"/>
+      <w:numFmt w:val="bullet"/>
+      <w:lvlText w:val=""/>
+      <w:lvlJc w:val="left"/>
+      <w:pPr>
+        <w:ind w:left="2880" w:hanging="360"/>
+      </w:pPr>
+      <w:rPr>
+        <w:rFonts w:ascii="Symbol" w:hAnsi="Symbol" w:hint="default"/>
+      </w:rPr>
+    </w:lvl>
+    <w:lvl w:ilvl="4" w:tplc="100A0003">
+      <w:start w:val="1"/>
+      <w:numFmt w:val="bullet"/>
+      <w:lvlText w:val="o"/>
+      <w:lvlJc w:val="left"/>
+      <w:pPr>
+        <w:ind w:left="3600" w:hanging="360"/>
+      </w:pPr>
+      <w:rPr>
+        <w:rFonts w:ascii="Courier New" w:hAnsi="Courier New" w:cs="Courier New" w:hint="default"/>
+      </w:rPr>
+    </w:lvl>
+    <w:lvl w:ilvl="5" w:tplc="100A0005">
+      <w:start w:val="1"/>
+      <w:numFmt w:val="bullet"/>
+      <w:lvlText w:val=""/>
+      <w:lvlJc w:val="left"/>
+      <w:pPr>
+        <w:ind w:left="4320" w:hanging="360"/>
+      </w:pPr>
+      <w:rPr>
+        <w:rFonts w:ascii="Wingdings" w:hAnsi="Wingdings" w:hint="default"/>
+      </w:rPr>
+    </w:lvl>
+    <w:lvl w:ilvl="6" w:tplc="100A0001">
+      <w:start w:val="1"/>
+      <w:numFmt w:val="bullet"/>
+      <w:lvlText w:val=""/>
+      <w:lvlJc w:val="left"/>
+      <w:pPr>
+        <w:ind w:left="5040" w:hanging="360"/>
+      </w:pPr>
+      <w:rPr>
+        <w:rFonts w:ascii="Symbol" w:hAnsi="Symbol" w:hint="default"/>
+      </w:rPr>
+    </w:lvl>
+    <w:lvl w:ilvl="7" w:tplc="100A0003">
+      <w:start w:val="1"/>
+      <w:numFmt w:val="bullet"/>
+      <w:lvlText w:val="o"/>
+      <w:lvlJc w:val="left"/>
+      <w:pPr>
+        <w:ind w:left="5760" w:hanging="360"/>
+      </w:pPr>
+      <w:rPr>
+        <w:rFonts w:ascii="Courier New" w:hAnsi="Courier New" w:cs="Courier New" w:hint="default"/>
+      </w:rPr>
+    </w:lvl>
+    <w:lvl w:ilvl="8" w:tplc="100A0005">
+      <w:start w:val="1"/>
+      <w:numFmt w:val="bullet"/>
+      <w:lvlText w:val=""/>
+      <w:lvlJc w:val="left"/>
+      <w:pPr>
+        <w:ind w:left="6480" w:hanging="360"/>
+      </w:pPr>
+      <w:rPr>
+        <w:rFonts w:ascii="Wingdings" w:hAnsi="Wingdings" w:hint="default"/>
+      </w:rPr>
+    </w:lvl>
+  </w:abstractNum>
+  <w:abstractNum w:abstractNumId="2" w15:restartNumberingAfterBreak="0">
+    <w:nsid w:val="18151280"/>
+    <w:multiLevelType w:val="hybridMultilevel"/>
+    <w:tmpl w:val="BDACEAB4"/>
+    <w:lvl w:ilvl="0" w:tplc="100A0001">
+      <w:start w:val="1"/>
+      <w:numFmt w:val="bullet"/>
+      <w:lvlText w:val=""/>
+      <w:lvlJc w:val="left"/>
+      <w:pPr>
+        <w:ind w:left="720" w:hanging="360"/>
+      </w:pPr>
+      <w:rPr>
+        <w:rFonts w:ascii="Symbol" w:hAnsi="Symbol" w:hint="default"/>
+      </w:rPr>
+    </w:lvl>
+    <w:lvl w:ilvl="1" w:tplc="100A0003">
+      <w:start w:val="1"/>
+      <w:numFmt w:val="bullet"/>
+      <w:lvlText w:val="o"/>
+      <w:lvlJc w:val="left"/>
+      <w:pPr>
+        <w:ind w:left="1440" w:hanging="360"/>
+      </w:pPr>
+      <w:rPr>
+        <w:rFonts w:ascii="Courier New" w:hAnsi="Courier New" w:cs="Courier New" w:hint="default"/>
+      </w:rPr>
+    </w:lvl>
+    <w:lvl w:ilvl="2" w:tplc="100A0005">
+      <w:start w:val="1"/>
+      <w:numFmt w:val="bullet"/>
+      <w:lvlText w:val=""/>
+      <w:lvlJc w:val="left"/>
+      <w:pPr>
+        <w:ind w:left="2160" w:hanging="360"/>
+      </w:pPr>
+      <w:rPr>
+        <w:rFonts w:ascii="Wingdings" w:hAnsi="Wingdings" w:hint="default"/>
+      </w:rPr>
+    </w:lvl>
+    <w:lvl w:ilvl="3" w:tplc="100A0001">
+      <w:start w:val="1"/>
+      <w:numFmt w:val="bullet"/>
+      <w:lvlText w:val=""/>
+      <w:lvlJc w:val="left"/>
+      <w:pPr>
+        <w:ind w:left="2880" w:hanging="360"/>
+      </w:pPr>
+      <w:rPr>
+        <w:rFonts w:ascii="Symbol" w:hAnsi="Symbol" w:hint="default"/>
+      </w:rPr>
+    </w:lvl>
+    <w:lvl w:ilvl="4" w:tplc="100A0003">
+      <w:start w:val="1"/>
+      <w:numFmt w:val="bullet"/>
+      <w:lvlText w:val="o"/>
+      <w:lvlJc w:val="left"/>
+      <w:pPr>
+        <w:ind w:left="3600" w:hanging="360"/>
+      </w:pPr>
+      <w:rPr>
+        <w:rFonts w:ascii="Courier New" w:hAnsi="Courier New" w:cs="Courier New" w:hint="default"/>
+      </w:rPr>
+    </w:lvl>
+    <w:lvl w:ilvl="5" w:tplc="100A0005">
+      <w:start w:val="1"/>
+      <w:numFmt w:val="bullet"/>
+      <w:lvlText w:val=""/>
+      <w:lvlJc w:val="left"/>
+      <w:pPr>
+        <w:ind w:left="4320" w:hanging="360"/>
+      </w:pPr>
+      <w:rPr>
+        <w:rFonts w:ascii="Wingdings" w:hAnsi="Wingdings" w:hint="default"/>
+      </w:rPr>
+    </w:lvl>
+    <w:lvl w:ilvl="6" w:tplc="100A0001">
+      <w:start w:val="1"/>
+      <w:numFmt w:val="bullet"/>
+      <w:lvlText w:val=""/>
+      <w:lvlJc w:val="left"/>
+      <w:pPr>
+        <w:ind w:left="5040" w:hanging="360"/>
+      </w:pPr>
+      <w:rPr>
+        <w:rFonts w:ascii="Symbol" w:hAnsi="Symbol" w:hint="default"/>
+      </w:rPr>
+    </w:lvl>
+    <w:lvl w:ilvl="7" w:tplc="100A0003">
+      <w:start w:val="1"/>
+      <w:numFmt w:val="bullet"/>
+      <w:lvlText w:val="o"/>
+      <w:lvlJc w:val="left"/>
+      <w:pPr>
+        <w:ind w:left="5760" w:hanging="360"/>
+      </w:pPr>
+      <w:rPr>
+        <w:rFonts w:ascii="Courier New" w:hAnsi="Courier New" w:cs="Courier New" w:hint="default"/>
+      </w:rPr>
+    </w:lvl>
+    <w:lvl w:ilvl="8" w:tplc="100A0005">
+      <w:start w:val="1"/>
+      <w:numFmt w:val="bullet"/>
+      <w:lvlText w:val=""/>
+      <w:lvlJc w:val="left"/>
+      <w:pPr>
+        <w:ind w:left="6480" w:hanging="360"/>
+      </w:pPr>
+      <w:rPr>
+        <w:rFonts w:ascii="Wingdings" w:hAnsi="Wingdings" w:hint="default"/>
+      </w:rPr>
+    </w:lvl>
+  </w:abstractNum>
+  <w:abstractNum w:abstractNumId="3" w15:restartNumberingAfterBreak="0">
     <w:nsid w:val="26E72F43"/>
     <w:multiLevelType w:val="multilevel"/>
     <w:tmpl w:val="D8D0605E"/>
@@ -3533,7 +4224,7 @@
       </w:pPr>
     </w:lvl>
   </w:abstractNum>
-  <w:abstractNum w:abstractNumId="2" w15:restartNumberingAfterBreak="0">
+  <w:abstractNum w:abstractNumId="4" w15:restartNumberingAfterBreak="0">
     <w:nsid w:val="27633876"/>
     <w:multiLevelType w:val="multilevel"/>
     <w:tmpl w:val="A7EA5E8E"/>
@@ -3682,7 +4373,7 @@
       </w:rPr>
     </w:lvl>
   </w:abstractNum>
-  <w:abstractNum w:abstractNumId="3" w15:restartNumberingAfterBreak="0">
+  <w:abstractNum w:abstractNumId="5" w15:restartNumberingAfterBreak="0">
     <w:nsid w:val="285748C2"/>
     <w:multiLevelType w:val="multilevel"/>
     <w:tmpl w:val="DEFCED12"/>
@@ -3831,7 +4522,7 @@
       </w:rPr>
     </w:lvl>
   </w:abstractNum>
-  <w:abstractNum w:abstractNumId="4" w15:restartNumberingAfterBreak="0">
+  <w:abstractNum w:abstractNumId="6" w15:restartNumberingAfterBreak="0">
     <w:nsid w:val="2BEB0FF1"/>
     <w:multiLevelType w:val="multilevel"/>
     <w:tmpl w:val="6838C488"/>
@@ -3980,7 +4671,7 @@
       </w:rPr>
     </w:lvl>
   </w:abstractNum>
-  <w:abstractNum w:abstractNumId="5" w15:restartNumberingAfterBreak="0">
+  <w:abstractNum w:abstractNumId="7" w15:restartNumberingAfterBreak="0">
     <w:nsid w:val="330F0045"/>
     <w:multiLevelType w:val="multilevel"/>
     <w:tmpl w:val="EC42374A"/>
@@ -4129,7 +4820,7 @@
       </w:rPr>
     </w:lvl>
   </w:abstractNum>
-  <w:abstractNum w:abstractNumId="6" w15:restartNumberingAfterBreak="0">
+  <w:abstractNum w:abstractNumId="8" w15:restartNumberingAfterBreak="0">
     <w:nsid w:val="35623032"/>
     <w:multiLevelType w:val="multilevel"/>
     <w:tmpl w:val="4E92BF82"/>
@@ -4278,7 +4969,7 @@
       </w:rPr>
     </w:lvl>
   </w:abstractNum>
-  <w:abstractNum w:abstractNumId="7" w15:restartNumberingAfterBreak="0">
+  <w:abstractNum w:abstractNumId="9" w15:restartNumberingAfterBreak="0">
     <w:nsid w:val="3A1A3E76"/>
     <w:multiLevelType w:val="multilevel"/>
     <w:tmpl w:val="CF8A9102"/>
@@ -4427,7 +5118,120 @@
       </w:rPr>
     </w:lvl>
   </w:abstractNum>
-  <w:abstractNum w:abstractNumId="8" w15:restartNumberingAfterBreak="0">
+  <w:abstractNum w:abstractNumId="10" w15:restartNumberingAfterBreak="0">
+    <w:nsid w:val="55060E6F"/>
+    <w:multiLevelType w:val="hybridMultilevel"/>
+    <w:tmpl w:val="C8A270B6"/>
+    <w:lvl w:ilvl="0" w:tplc="100A0001">
+      <w:start w:val="1"/>
+      <w:numFmt w:val="bullet"/>
+      <w:lvlText w:val=""/>
+      <w:lvlJc w:val="left"/>
+      <w:pPr>
+        <w:ind w:left="1800" w:hanging="360"/>
+      </w:pPr>
+      <w:rPr>
+        <w:rFonts w:ascii="Symbol" w:hAnsi="Symbol" w:hint="default"/>
+      </w:rPr>
+    </w:lvl>
+    <w:lvl w:ilvl="1" w:tplc="100A0003">
+      <w:start w:val="1"/>
+      <w:numFmt w:val="bullet"/>
+      <w:lvlText w:val="o"/>
+      <w:lvlJc w:val="left"/>
+      <w:pPr>
+        <w:ind w:left="2520" w:hanging="360"/>
+      </w:pPr>
+      <w:rPr>
+        <w:rFonts w:ascii="Courier New" w:hAnsi="Courier New" w:cs="Courier New" w:hint="default"/>
+      </w:rPr>
+    </w:lvl>
+    <w:lvl w:ilvl="2" w:tplc="100A0005">
+      <w:start w:val="1"/>
+      <w:numFmt w:val="bullet"/>
+      <w:lvlText w:val=""/>
+      <w:lvlJc w:val="left"/>
+      <w:pPr>
+        <w:ind w:left="3240" w:hanging="360"/>
+      </w:pPr>
+      <w:rPr>
+        <w:rFonts w:ascii="Wingdings" w:hAnsi="Wingdings" w:hint="default"/>
+      </w:rPr>
+    </w:lvl>
+    <w:lvl w:ilvl="3" w:tplc="100A0001">
+      <w:start w:val="1"/>
+      <w:numFmt w:val="bullet"/>
+      <w:lvlText w:val=""/>
+      <w:lvlJc w:val="left"/>
+      <w:pPr>
+        <w:ind w:left="3960" w:hanging="360"/>
+      </w:pPr>
+      <w:rPr>
+        <w:rFonts w:ascii="Symbol" w:hAnsi="Symbol" w:hint="default"/>
+      </w:rPr>
+    </w:lvl>
+    <w:lvl w:ilvl="4" w:tplc="100A0003">
+      <w:start w:val="1"/>
+      <w:numFmt w:val="bullet"/>
+      <w:lvlText w:val="o"/>
+      <w:lvlJc w:val="left"/>
+      <w:pPr>
+        <w:ind w:left="4680" w:hanging="360"/>
+      </w:pPr>
+      <w:rPr>
+        <w:rFonts w:ascii="Courier New" w:hAnsi="Courier New" w:cs="Courier New" w:hint="default"/>
+      </w:rPr>
+    </w:lvl>
+    <w:lvl w:ilvl="5" w:tplc="100A0005">
+      <w:start w:val="1"/>
+      <w:numFmt w:val="bullet"/>
+      <w:lvlText w:val=""/>
+      <w:lvlJc w:val="left"/>
+      <w:pPr>
+        <w:ind w:left="5400" w:hanging="360"/>
+      </w:pPr>
+      <w:rPr>
+        <w:rFonts w:ascii="Wingdings" w:hAnsi="Wingdings" w:hint="default"/>
+      </w:rPr>
+    </w:lvl>
+    <w:lvl w:ilvl="6" w:tplc="100A0001">
+      <w:start w:val="1"/>
+      <w:numFmt w:val="bullet"/>
+      <w:lvlText w:val=""/>
+      <w:lvlJc w:val="left"/>
+      <w:pPr>
+        <w:ind w:left="6120" w:hanging="360"/>
+      </w:pPr>
+      <w:rPr>
+        <w:rFonts w:ascii="Symbol" w:hAnsi="Symbol" w:hint="default"/>
+      </w:rPr>
+    </w:lvl>
+    <w:lvl w:ilvl="7" w:tplc="100A0003">
+      <w:start w:val="1"/>
+      <w:numFmt w:val="bullet"/>
+      <w:lvlText w:val="o"/>
+      <w:lvlJc w:val="left"/>
+      <w:pPr>
+        <w:ind w:left="6840" w:hanging="360"/>
+      </w:pPr>
+      <w:rPr>
+        <w:rFonts w:ascii="Courier New" w:hAnsi="Courier New" w:cs="Courier New" w:hint="default"/>
+      </w:rPr>
+    </w:lvl>
+    <w:lvl w:ilvl="8" w:tplc="100A0005">
+      <w:start w:val="1"/>
+      <w:numFmt w:val="bullet"/>
+      <w:lvlText w:val=""/>
+      <w:lvlJc w:val="left"/>
+      <w:pPr>
+        <w:ind w:left="7560" w:hanging="360"/>
+      </w:pPr>
+      <w:rPr>
+        <w:rFonts w:ascii="Wingdings" w:hAnsi="Wingdings" w:hint="default"/>
+      </w:rPr>
+    </w:lvl>
+  </w:abstractNum>
+  <w:abstractNum w:abstractNumId="11" w15:restartNumberingAfterBreak="0">
     <w:nsid w:val="5C562262"/>
     <w:multiLevelType w:val="multilevel"/>
     <w:tmpl w:val="8A7EA976"/>
@@ -4540,7 +5344,7 @@
       </w:pPr>
     </w:lvl>
   </w:abstractNum>
-  <w:abstractNum w:abstractNumId="9" w15:restartNumberingAfterBreak="0">
+  <w:abstractNum w:abstractNumId="12" w15:restartNumberingAfterBreak="0">
     <w:nsid w:val="642B0CA3"/>
     <w:multiLevelType w:val="multilevel"/>
     <w:tmpl w:val="D8DE392E"/>
@@ -4689,7 +5493,120 @@
       </w:rPr>
     </w:lvl>
   </w:abstractNum>
-  <w:abstractNum w:abstractNumId="10" w15:restartNumberingAfterBreak="0">
+  <w:abstractNum w:abstractNumId="13" w15:restartNumberingAfterBreak="0">
+    <w:nsid w:val="6C170256"/>
+    <w:multiLevelType w:val="hybridMultilevel"/>
+    <w:tmpl w:val="A89254B0"/>
+    <w:lvl w:ilvl="0" w:tplc="100A0001">
+      <w:start w:val="1"/>
+      <w:numFmt w:val="bullet"/>
+      <w:lvlText w:val=""/>
+      <w:lvlJc w:val="left"/>
+      <w:pPr>
+        <w:ind w:left="720" w:hanging="360"/>
+      </w:pPr>
+      <w:rPr>
+        <w:rFonts w:ascii="Symbol" w:hAnsi="Symbol" w:hint="default"/>
+      </w:rPr>
+    </w:lvl>
+    <w:lvl w:ilvl="1" w:tplc="100A0003">
+      <w:start w:val="1"/>
+      <w:numFmt w:val="bullet"/>
+      <w:lvlText w:val="o"/>
+      <w:lvlJc w:val="left"/>
+      <w:pPr>
+        <w:ind w:left="1440" w:hanging="360"/>
+      </w:pPr>
+      <w:rPr>
+        <w:rFonts w:ascii="Courier New" w:hAnsi="Courier New" w:cs="Courier New" w:hint="default"/>
+      </w:rPr>
+    </w:lvl>
+    <w:lvl w:ilvl="2" w:tplc="100A0005">
+      <w:start w:val="1"/>
+      <w:numFmt w:val="bullet"/>
+      <w:lvlText w:val=""/>
+      <w:lvlJc w:val="left"/>
+      <w:pPr>
+        <w:ind w:left="2160" w:hanging="360"/>
+      </w:pPr>
+      <w:rPr>
+        <w:rFonts w:ascii="Wingdings" w:hAnsi="Wingdings" w:hint="default"/>
+      </w:rPr>
+    </w:lvl>
+    <w:lvl w:ilvl="3" w:tplc="100A0001">
+      <w:start w:val="1"/>
+      <w:numFmt w:val="bullet"/>
+      <w:lvlText w:val=""/>
+      <w:lvlJc w:val="left"/>
+      <w:pPr>
+        <w:ind w:left="2880" w:hanging="360"/>
+      </w:pPr>
+      <w:rPr>
+        <w:rFonts w:ascii="Symbol" w:hAnsi="Symbol" w:hint="default"/>
+      </w:rPr>
+    </w:lvl>
+    <w:lvl w:ilvl="4" w:tplc="100A0003">
+      <w:start w:val="1"/>
+      <w:numFmt w:val="bullet"/>
+      <w:lvlText w:val="o"/>
+      <w:lvlJc w:val="left"/>
+      <w:pPr>
+        <w:ind w:left="3600" w:hanging="360"/>
+      </w:pPr>
+      <w:rPr>
+        <w:rFonts w:ascii="Courier New" w:hAnsi="Courier New" w:cs="Courier New" w:hint="default"/>
+      </w:rPr>
+    </w:lvl>
+    <w:lvl w:ilvl="5" w:tplc="100A0005">
+      <w:start w:val="1"/>
+      <w:numFmt w:val="bullet"/>
+      <w:lvlText w:val=""/>
+      <w:lvlJc w:val="left"/>
+      <w:pPr>
+        <w:ind w:left="4320" w:hanging="360"/>
+      </w:pPr>
+      <w:rPr>
+        <w:rFonts w:ascii="Wingdings" w:hAnsi="Wingdings" w:hint="default"/>
+      </w:rPr>
+    </w:lvl>
+    <w:lvl w:ilvl="6" w:tplc="100A0001">
+      <w:start w:val="1"/>
+      <w:numFmt w:val="bullet"/>
+      <w:lvlText w:val=""/>
+      <w:lvlJc w:val="left"/>
+      <w:pPr>
+        <w:ind w:left="5040" w:hanging="360"/>
+      </w:pPr>
+      <w:rPr>
+        <w:rFonts w:ascii="Symbol" w:hAnsi="Symbol" w:hint="default"/>
+      </w:rPr>
+    </w:lvl>
+    <w:lvl w:ilvl="7" w:tplc="100A0003">
+      <w:start w:val="1"/>
+      <w:numFmt w:val="bullet"/>
+      <w:lvlText w:val="o"/>
+      <w:lvlJc w:val="left"/>
+      <w:pPr>
+        <w:ind w:left="5760" w:hanging="360"/>
+      </w:pPr>
+      <w:rPr>
+        <w:rFonts w:ascii="Courier New" w:hAnsi="Courier New" w:cs="Courier New" w:hint="default"/>
+      </w:rPr>
+    </w:lvl>
+    <w:lvl w:ilvl="8" w:tplc="100A0005">
+      <w:start w:val="1"/>
+      <w:numFmt w:val="bullet"/>
+      <w:lvlText w:val=""/>
+      <w:lvlJc w:val="left"/>
+      <w:pPr>
+        <w:ind w:left="6480" w:hanging="360"/>
+      </w:pPr>
+      <w:rPr>
+        <w:rFonts w:ascii="Wingdings" w:hAnsi="Wingdings" w:hint="default"/>
+      </w:rPr>
+    </w:lvl>
+  </w:abstractNum>
+  <w:abstractNum w:abstractNumId="14" w15:restartNumberingAfterBreak="0">
     <w:nsid w:val="6E2E1BAD"/>
     <w:multiLevelType w:val="hybridMultilevel"/>
     <w:tmpl w:val="E09AFD46"/>
@@ -4802,7 +5719,7 @@
       </w:rPr>
     </w:lvl>
   </w:abstractNum>
-  <w:abstractNum w:abstractNumId="11" w15:restartNumberingAfterBreak="0">
+  <w:abstractNum w:abstractNumId="15" w15:restartNumberingAfterBreak="0">
     <w:nsid w:val="792F5E9D"/>
     <w:multiLevelType w:val="multilevel"/>
     <w:tmpl w:val="E7F4376E"/>
@@ -4915,7 +5832,124 @@
       </w:pPr>
     </w:lvl>
   </w:abstractNum>
-  <w:abstractNum w:abstractNumId="12" w15:restartNumberingAfterBreak="0">
+  <w:abstractNum w:abstractNumId="16" w15:restartNumberingAfterBreak="0">
+    <w:nsid w:val="79D0722F"/>
+    <w:multiLevelType w:val="multilevel"/>
+    <w:tmpl w:val="75C2F29E"/>
+    <w:lvl w:ilvl="0">
+      <w:start w:val="1"/>
+      <w:numFmt w:val="decimal"/>
+      <w:lvlText w:val="%1."/>
+      <w:lvlJc w:val="left"/>
+      <w:pPr>
+        <w:tabs>
+          <w:tab w:val="num" w:pos="720"/>
+        </w:tabs>
+        <w:ind w:left="720" w:hanging="360"/>
+      </w:pPr>
+    </w:lvl>
+    <w:lvl w:ilvl="1">
+      <w:start w:val="1"/>
+      <w:numFmt w:val="bullet"/>
+      <w:lvlText w:val="o"/>
+      <w:lvlJc w:val="left"/>
+      <w:pPr>
+        <w:tabs>
+          <w:tab w:val="num" w:pos="1440"/>
+        </w:tabs>
+        <w:ind w:left="1440" w:hanging="360"/>
+      </w:pPr>
+      <w:rPr>
+        <w:rFonts w:ascii="Courier New" w:hAnsi="Courier New" w:cs="Times New Roman" w:hint="default"/>
+        <w:sz w:val="20"/>
+      </w:rPr>
+    </w:lvl>
+    <w:lvl w:ilvl="2">
+      <w:start w:val="1"/>
+      <w:numFmt w:val="decimal"/>
+      <w:lvlText w:val="%3."/>
+      <w:lvlJc w:val="left"/>
+      <w:pPr>
+        <w:tabs>
+          <w:tab w:val="num" w:pos="2160"/>
+        </w:tabs>
+        <w:ind w:left="2160" w:hanging="360"/>
+      </w:pPr>
+    </w:lvl>
+    <w:lvl w:ilvl="3">
+      <w:start w:val="1"/>
+      <w:numFmt w:val="decimal"/>
+      <w:lvlText w:val="%4."/>
+      <w:lvlJc w:val="left"/>
+      <w:pPr>
+        <w:tabs>
+          <w:tab w:val="num" w:pos="2880"/>
+        </w:tabs>
+        <w:ind w:left="2880" w:hanging="360"/>
+      </w:pPr>
+    </w:lvl>
+    <w:lvl w:ilvl="4">
+      <w:start w:val="1"/>
+      <w:numFmt w:val="decimal"/>
+      <w:lvlText w:val="%5."/>
+      <w:lvlJc w:val="left"/>
+      <w:pPr>
+        <w:tabs>
+          <w:tab w:val="num" w:pos="3600"/>
+        </w:tabs>
+        <w:ind w:left="3600" w:hanging="360"/>
+      </w:pPr>
+    </w:lvl>
+    <w:lvl w:ilvl="5">
+      <w:start w:val="1"/>
+      <w:numFmt w:val="decimal"/>
+      <w:lvlText w:val="%6."/>
+      <w:lvlJc w:val="left"/>
+      <w:pPr>
+        <w:tabs>
+          <w:tab w:val="num" w:pos="4320"/>
+        </w:tabs>
+        <w:ind w:left="4320" w:hanging="360"/>
+      </w:pPr>
+    </w:lvl>
+    <w:lvl w:ilvl="6">
+      <w:start w:val="1"/>
+      <w:numFmt w:val="decimal"/>
+      <w:lvlText w:val="%7."/>
+      <w:lvlJc w:val="left"/>
+      <w:pPr>
+        <w:tabs>
+          <w:tab w:val="num" w:pos="5040"/>
+        </w:tabs>
+        <w:ind w:left="5040" w:hanging="360"/>
+      </w:pPr>
+    </w:lvl>
+    <w:lvl w:ilvl="7">
+      <w:start w:val="1"/>
+      <w:numFmt w:val="decimal"/>
+      <w:lvlText w:val="%8."/>
+      <w:lvlJc w:val="left"/>
+      <w:pPr>
+        <w:tabs>
+          <w:tab w:val="num" w:pos="5760"/>
+        </w:tabs>
+        <w:ind w:left="5760" w:hanging="360"/>
+      </w:pPr>
+    </w:lvl>
+    <w:lvl w:ilvl="8">
+      <w:start w:val="1"/>
+      <w:numFmt w:val="decimal"/>
+      <w:lvlText w:val="%9."/>
+      <w:lvlJc w:val="left"/>
+      <w:pPr>
+        <w:tabs>
+          <w:tab w:val="num" w:pos="6480"/>
+        </w:tabs>
+        <w:ind w:left="6480" w:hanging="360"/>
+      </w:pPr>
+    </w:lvl>
+  </w:abstractNum>
+  <w:abstractNum w:abstractNumId="17" w15:restartNumberingAfterBreak="0">
     <w:nsid w:val="7B4716A6"/>
     <w:multiLevelType w:val="multilevel"/>
     <w:tmpl w:val="278EEFD2"/>
@@ -5028,44 +6062,245 @@
       </w:pPr>
     </w:lvl>
   </w:abstractNum>
+  <w:abstractNum w:abstractNumId="18" w15:restartNumberingAfterBreak="0">
+    <w:nsid w:val="7EF42DB7"/>
+    <w:multiLevelType w:val="hybridMultilevel"/>
+    <w:tmpl w:val="213C6518"/>
+    <w:lvl w:ilvl="0" w:tplc="100A0001">
+      <w:start w:val="1"/>
+      <w:numFmt w:val="bullet"/>
+      <w:lvlText w:val=""/>
+      <w:lvlJc w:val="left"/>
+      <w:pPr>
+        <w:ind w:left="720" w:hanging="360"/>
+      </w:pPr>
+      <w:rPr>
+        <w:rFonts w:ascii="Symbol" w:hAnsi="Symbol" w:hint="default"/>
+      </w:rPr>
+    </w:lvl>
+    <w:lvl w:ilvl="1" w:tplc="100A0003">
+      <w:start w:val="1"/>
+      <w:numFmt w:val="bullet"/>
+      <w:lvlText w:val="o"/>
+      <w:lvlJc w:val="left"/>
+      <w:pPr>
+        <w:ind w:left="1440" w:hanging="360"/>
+      </w:pPr>
+      <w:rPr>
+        <w:rFonts w:ascii="Courier New" w:hAnsi="Courier New" w:cs="Courier New" w:hint="default"/>
+      </w:rPr>
+    </w:lvl>
+    <w:lvl w:ilvl="2" w:tplc="100A0005">
+      <w:start w:val="1"/>
+      <w:numFmt w:val="bullet"/>
+      <w:lvlText w:val=""/>
+      <w:lvlJc w:val="left"/>
+      <w:pPr>
+        <w:ind w:left="2160" w:hanging="360"/>
+      </w:pPr>
+      <w:rPr>
+        <w:rFonts w:ascii="Wingdings" w:hAnsi="Wingdings" w:hint="default"/>
+      </w:rPr>
+    </w:lvl>
+    <w:lvl w:ilvl="3" w:tplc="100A0001">
+      <w:start w:val="1"/>
+      <w:numFmt w:val="bullet"/>
+      <w:lvlText w:val=""/>
+      <w:lvlJc w:val="left"/>
+      <w:pPr>
+        <w:ind w:left="2880" w:hanging="360"/>
+      </w:pPr>
+      <w:rPr>
+        <w:rFonts w:ascii="Symbol" w:hAnsi="Symbol" w:hint="default"/>
+      </w:rPr>
+    </w:lvl>
+    <w:lvl w:ilvl="4" w:tplc="100A0003">
+      <w:start w:val="1"/>
+      <w:numFmt w:val="bullet"/>
+      <w:lvlText w:val="o"/>
+      <w:lvlJc w:val="left"/>
+      <w:pPr>
+        <w:ind w:left="3600" w:hanging="360"/>
+      </w:pPr>
+      <w:rPr>
+        <w:rFonts w:ascii="Courier New" w:hAnsi="Courier New" w:cs="Courier New" w:hint="default"/>
+      </w:rPr>
+    </w:lvl>
+    <w:lvl w:ilvl="5" w:tplc="100A0005">
+      <w:start w:val="1"/>
+      <w:numFmt w:val="bullet"/>
+      <w:lvlText w:val=""/>
+      <w:lvlJc w:val="left"/>
+      <w:pPr>
+        <w:ind w:left="4320" w:hanging="360"/>
+      </w:pPr>
+      <w:rPr>
+        <w:rFonts w:ascii="Wingdings" w:hAnsi="Wingdings" w:hint="default"/>
+      </w:rPr>
+    </w:lvl>
+    <w:lvl w:ilvl="6" w:tplc="100A0001">
+      <w:start w:val="1"/>
+      <w:numFmt w:val="bullet"/>
+      <w:lvlText w:val=""/>
+      <w:lvlJc w:val="left"/>
+      <w:pPr>
+        <w:ind w:left="5040" w:hanging="360"/>
+      </w:pPr>
+      <w:rPr>
+        <w:rFonts w:ascii="Symbol" w:hAnsi="Symbol" w:hint="default"/>
+      </w:rPr>
+    </w:lvl>
+    <w:lvl w:ilvl="7" w:tplc="100A0003">
+      <w:start w:val="1"/>
+      <w:numFmt w:val="bullet"/>
+      <w:lvlText w:val="o"/>
+      <w:lvlJc w:val="left"/>
+      <w:pPr>
+        <w:ind w:left="5760" w:hanging="360"/>
+      </w:pPr>
+      <w:rPr>
+        <w:rFonts w:ascii="Courier New" w:hAnsi="Courier New" w:cs="Courier New" w:hint="default"/>
+      </w:rPr>
+    </w:lvl>
+    <w:lvl w:ilvl="8" w:tplc="100A0005">
+      <w:start w:val="1"/>
+      <w:numFmt w:val="bullet"/>
+      <w:lvlText w:val=""/>
+      <w:lvlJc w:val="left"/>
+      <w:pPr>
+        <w:ind w:left="6480" w:hanging="360"/>
+      </w:pPr>
+      <w:rPr>
+        <w:rFonts w:ascii="Wingdings" w:hAnsi="Wingdings" w:hint="default"/>
+      </w:rPr>
+    </w:lvl>
+  </w:abstractNum>
   <w:num w:numId="1" w16cid:durableId="2024284251">
-    <w:abstractNumId w:val="10"/>
+    <w:abstractNumId w:val="14"/>
   </w:num>
   <w:num w:numId="2" w16cid:durableId="1812818526">
-    <w:abstractNumId w:val="12"/>
+    <w:abstractNumId w:val="17"/>
   </w:num>
   <w:num w:numId="3" w16cid:durableId="1658997453">
+    <w:abstractNumId w:val="15"/>
+  </w:num>
+  <w:num w:numId="4" w16cid:durableId="1519930189">
     <w:abstractNumId w:val="11"/>
   </w:num>
-  <w:num w:numId="4" w16cid:durableId="1519930189">
-    <w:abstractNumId w:val="8"/>
-  </w:num>
   <w:num w:numId="5" w16cid:durableId="244076204">
-    <w:abstractNumId w:val="4"/>
+    <w:abstractNumId w:val="6"/>
   </w:num>
   <w:num w:numId="6" w16cid:durableId="679433078">
-    <w:abstractNumId w:val="1"/>
+    <w:abstractNumId w:val="3"/>
   </w:num>
   <w:num w:numId="7" w16cid:durableId="1095056924">
-    <w:abstractNumId w:val="3"/>
+    <w:abstractNumId w:val="5"/>
   </w:num>
   <w:num w:numId="8" w16cid:durableId="1077019595">
     <w:abstractNumId w:val="0"/>
   </w:num>
   <w:num w:numId="9" w16cid:durableId="925380167">
-    <w:abstractNumId w:val="6"/>
+    <w:abstractNumId w:val="8"/>
   </w:num>
   <w:num w:numId="10" w16cid:durableId="1725911660">
-    <w:abstractNumId w:val="2"/>
+    <w:abstractNumId w:val="4"/>
   </w:num>
   <w:num w:numId="11" w16cid:durableId="1966696107">
+    <w:abstractNumId w:val="12"/>
+  </w:num>
+  <w:num w:numId="12" w16cid:durableId="1217662000">
+    <w:abstractNumId w:val="7"/>
+  </w:num>
+  <w:num w:numId="13" w16cid:durableId="1170875554">
     <w:abstractNumId w:val="9"/>
   </w:num>
-  <w:num w:numId="12" w16cid:durableId="1217662000">
-    <w:abstractNumId w:val="5"/>
+  <w:num w:numId="14" w16cid:durableId="1953054744">
+    <w:abstractNumId w:val="1"/>
+    <w:lvlOverride w:ilvl="0"/>
+    <w:lvlOverride w:ilvl="1"/>
+    <w:lvlOverride w:ilvl="2"/>
+    <w:lvlOverride w:ilvl="3"/>
+    <w:lvlOverride w:ilvl="4"/>
+    <w:lvlOverride w:ilvl="5"/>
+    <w:lvlOverride w:ilvl="6"/>
+    <w:lvlOverride w:ilvl="7"/>
+    <w:lvlOverride w:ilvl="8"/>
   </w:num>
-  <w:num w:numId="13" w16cid:durableId="1170875554">
-    <w:abstractNumId w:val="7"/>
+  <w:num w:numId="15" w16cid:durableId="1634558345">
+    <w:abstractNumId w:val="18"/>
+    <w:lvlOverride w:ilvl="0"/>
+    <w:lvlOverride w:ilvl="1"/>
+    <w:lvlOverride w:ilvl="2"/>
+    <w:lvlOverride w:ilvl="3"/>
+    <w:lvlOverride w:ilvl="4"/>
+    <w:lvlOverride w:ilvl="5"/>
+    <w:lvlOverride w:ilvl="6"/>
+    <w:lvlOverride w:ilvl="7"/>
+    <w:lvlOverride w:ilvl="8"/>
+  </w:num>
+  <w:num w:numId="16" w16cid:durableId="1644501225">
+    <w:abstractNumId w:val="2"/>
+    <w:lvlOverride w:ilvl="0"/>
+    <w:lvlOverride w:ilvl="1"/>
+    <w:lvlOverride w:ilvl="2"/>
+    <w:lvlOverride w:ilvl="3"/>
+    <w:lvlOverride w:ilvl="4"/>
+    <w:lvlOverride w:ilvl="5"/>
+    <w:lvlOverride w:ilvl="6"/>
+    <w:lvlOverride w:ilvl="7"/>
+    <w:lvlOverride w:ilvl="8"/>
+  </w:num>
+  <w:num w:numId="17" w16cid:durableId="1847550853">
+    <w:abstractNumId w:val="13"/>
+    <w:lvlOverride w:ilvl="0"/>
+    <w:lvlOverride w:ilvl="1"/>
+    <w:lvlOverride w:ilvl="2"/>
+    <w:lvlOverride w:ilvl="3"/>
+    <w:lvlOverride w:ilvl="4"/>
+    <w:lvlOverride w:ilvl="5"/>
+    <w:lvlOverride w:ilvl="6"/>
+    <w:lvlOverride w:ilvl="7"/>
+    <w:lvlOverride w:ilvl="8"/>
+  </w:num>
+  <w:num w:numId="18" w16cid:durableId="43068684">
+    <w:abstractNumId w:val="16"/>
+    <w:lvlOverride w:ilvl="0">
+      <w:startOverride w:val="1"/>
+    </w:lvlOverride>
+    <w:lvlOverride w:ilvl="1"/>
+    <w:lvlOverride w:ilvl="2">
+      <w:startOverride w:val="1"/>
+    </w:lvlOverride>
+    <w:lvlOverride w:ilvl="3">
+      <w:startOverride w:val="1"/>
+    </w:lvlOverride>
+    <w:lvlOverride w:ilvl="4">
+      <w:startOverride w:val="1"/>
+    </w:lvlOverride>
+    <w:lvlOverride w:ilvl="5">
+      <w:startOverride w:val="1"/>
+    </w:lvlOverride>
+    <w:lvlOverride w:ilvl="6">
+      <w:startOverride w:val="1"/>
+    </w:lvlOverride>
+    <w:lvlOverride w:ilvl="7">
+      <w:startOverride w:val="1"/>
+    </w:lvlOverride>
+    <w:lvlOverride w:ilvl="8">
+      <w:startOverride w:val="1"/>
+    </w:lvlOverride>
+  </w:num>
+  <w:num w:numId="19" w16cid:durableId="1840193939">
+    <w:abstractNumId w:val="10"/>
+    <w:lvlOverride w:ilvl="0"/>
+    <w:lvlOverride w:ilvl="1"/>
+    <w:lvlOverride w:ilvl="2"/>
+    <w:lvlOverride w:ilvl="3"/>
+    <w:lvlOverride w:ilvl="4"/>
+    <w:lvlOverride w:ilvl="5"/>
+    <w:lvlOverride w:ilvl="6"/>
+    <w:lvlOverride w:ilvl="7"/>
+    <w:lvlOverride w:ilvl="8"/>
   </w:num>
 </w:numbering>
 </file>
@@ -5673,7 +6908,6 @@
   <w:style w:type="character" w:default="1" w:styleId="Fuentedeprrafopredeter">
     <w:name w:val="Default Paragraph Font"/>
     <w:uiPriority w:val="1"/>
-    <w:semiHidden/>
     <w:unhideWhenUsed/>
   </w:style>
   <w:style w:type="table" w:default="1" w:styleId="Tablanormal">

</xml_diff>